<commit_message>
docs(_example): add version history table
</commit_message>
<xml_diff>
--- a/outputs/_example/SRS.docx
+++ b/outputs/_example/SRS.docx
@@ -240,6 +240,181 @@
     </w:tbl>
     <w:p>
       <w:pPr>
+        <w:pStyle w:val="FirstParagraph"/>
+      </w:pPr>
+      <w:r>
+        <w:rPr>
+          <w:b/>
+          <w:bCs/>
+          <w:lang w:val="vi-VN"/>
+        </w:rPr>
+        <w:t xml:space="preserve">Lịch sử phiên bản</w:t>
+      </w:r>
+    </w:p>
+    <w:tbl>
+      <w:tblPr>
+        <w:tblStyle w:val="Table"/>
+        <w:tblW w:type="pct" w:w="5000"/>
+        <w:tblLayout w:type="fixed"/>
+        <w:tblLook w:firstRow="1" w:lastRow="0" w:firstColumn="0" w:lastColumn="0" w:noHBand="0" w:noVBand="0" w:val="0020"/>
+      </w:tblPr>
+      <w:tblGrid>
+        <w:gridCol w:w="1584"/>
+        <w:gridCol w:w="1584"/>
+        <w:gridCol w:w="1584"/>
+        <w:gridCol w:w="1584"/>
+        <w:gridCol w:w="1584"/>
+      </w:tblGrid>
+      <w:tr>
+        <w:trPr>
+          <w:tblHeader w:val="on"/>
+        </w:trPr>
+        <w:tc>
+          <w:tcPr/>
+          <w:p>
+            <w:pPr>
+              <w:pStyle w:val="Compact"/>
+            </w:pPr>
+            <w:r>
+              <w:rPr>
+                <w:lang w:val="vi-VN"/>
+              </w:rPr>
+              <w:t xml:space="preserve">Phiên bản</w:t>
+            </w:r>
+          </w:p>
+        </w:tc>
+        <w:tc>
+          <w:tcPr/>
+          <w:p>
+            <w:pPr>
+              <w:pStyle w:val="Compact"/>
+            </w:pPr>
+            <w:r>
+              <w:rPr>
+                <w:lang w:val="vi-VN"/>
+              </w:rPr>
+              <w:t xml:space="preserve">Ngày</w:t>
+            </w:r>
+          </w:p>
+        </w:tc>
+        <w:tc>
+          <w:tcPr/>
+          <w:p>
+            <w:pPr>
+              <w:pStyle w:val="Compact"/>
+            </w:pPr>
+            <w:r>
+              <w:rPr>
+                <w:lang w:val="vi-VN"/>
+              </w:rPr>
+              <w:t xml:space="preserve">Thay đổi</w:t>
+            </w:r>
+          </w:p>
+        </w:tc>
+        <w:tc>
+          <w:tcPr/>
+          <w:p>
+            <w:pPr>
+              <w:pStyle w:val="Compact"/>
+            </w:pPr>
+            <w:r>
+              <w:rPr>
+                <w:lang w:val="vi-VN"/>
+              </w:rPr>
+              <w:t xml:space="preserve">Nguồn</w:t>
+            </w:r>
+          </w:p>
+        </w:tc>
+        <w:tc>
+          <w:tcPr/>
+          <w:p>
+            <w:pPr>
+              <w:pStyle w:val="Compact"/>
+            </w:pPr>
+            <w:r>
+              <w:rPr>
+                <w:lang w:val="vi-VN"/>
+              </w:rPr>
+              <w:t xml:space="preserve">Ảnh hưởng</w:t>
+            </w:r>
+          </w:p>
+        </w:tc>
+      </w:tr>
+      <w:tr>
+        <w:tc>
+          <w:tcPr/>
+          <w:p>
+            <w:pPr>
+              <w:pStyle w:val="Compact"/>
+            </w:pPr>
+            <w:r>
+              <w:rPr>
+                <w:lang w:val="vi-VN"/>
+              </w:rPr>
+              <w:t xml:space="preserve">0.1</w:t>
+            </w:r>
+          </w:p>
+        </w:tc>
+        <w:tc>
+          <w:tcPr/>
+          <w:p>
+            <w:pPr>
+              <w:pStyle w:val="Compact"/>
+            </w:pPr>
+            <w:r>
+              <w:rPr>
+                <w:lang w:val="vi-VN"/>
+              </w:rPr>
+              <w:t xml:space="preserve">2026-10-20</w:t>
+            </w:r>
+          </w:p>
+        </w:tc>
+        <w:tc>
+          <w:tcPr/>
+          <w:p>
+            <w:pPr>
+              <w:pStyle w:val="Compact"/>
+            </w:pPr>
+            <w:r>
+              <w:rPr>
+                <w:lang w:val="vi-VN"/>
+              </w:rPr>
+              <w:t xml:space="preserve">Bản đầu tiên</w:t>
+            </w:r>
+          </w:p>
+        </w:tc>
+        <w:tc>
+          <w:tcPr/>
+          <w:p>
+            <w:pPr>
+              <w:pStyle w:val="Compact"/>
+            </w:pPr>
+            <w:r>
+              <w:rPr>
+                <w:lang w:val="vi-VN"/>
+              </w:rPr>
+              <w:t xml:space="preserve">bien-ban-hop-kickoff.md, email-bo-sung-cskh.md, ghi-chu-kho.txt</w:t>
+            </w:r>
+          </w:p>
+        </w:tc>
+        <w:tc>
+          <w:tcPr/>
+          <w:p>
+            <w:pPr>
+              <w:pStyle w:val="Compact"/>
+            </w:pPr>
+            <w:r>
+              <w:rPr>
+                <w:lang w:val="vi-VN"/>
+              </w:rPr>
+              <w:t xml:space="preserve">Toàn bộ</w:t>
+            </w:r>
+          </w:p>
+        </w:tc>
+      </w:tr>
+    </w:tbl>
+    <w:p>
+      <w:pPr>
         <w:pStyle w:val="Heading2"/>
       </w:pPr>
       <w:bookmarkStart w:id="10" w:name="_cd02fbcccf4d6b5d61836e7eba683a79101903c"/>
@@ -776,74 +951,408 @@
     </w:p>
     <w:p>
       <w:pPr>
-        <w:pStyle w:val="CaptionedFigure"/>
-      </w:pPr>
-      <w:r>
-        <w:drawing>
-          <wp:inline>
-            <wp:extent cx="5334000" cy="381000"/>
-            <wp:effectExtent b="0" l="0" r="0" t="0"/>
-            <wp:docPr descr="Sơ đồ 1 — 2.1 Bối cảnh hệ thống" title="" id="17" name="Picture"/>
-            <a:graphic>
-              <a:graphicData uri="http://schemas.openxmlformats.org/drawingml/2006/picture">
-                <pic:pic>
-                  <pic:nvPicPr>
-                    <pic:cNvPr descr="ui/diagrams/srs-01.png" id="18" name="Picture"/>
-                    <pic:cNvPicPr>
-                      <a:picLocks noChangeArrowheads="1" noChangeAspect="1"/>
-                    </pic:cNvPicPr>
-                  </pic:nvPicPr>
-                  <pic:blipFill>
-                    <a:blip r:embed="rId16"/>
-                    <a:stretch>
-                      <a:fillRect/>
-                    </a:stretch>
-                  </pic:blipFill>
-                  <pic:spPr bwMode="auto">
-                    <a:xfrm>
-                      <a:off x="0" y="0"/>
-                      <a:ext cx="5334000" cy="381000"/>
-                    </a:xfrm>
-                    <a:prstGeom prst="rect">
-                      <a:avLst/>
-                    </a:prstGeom>
-                    <a:noFill/>
-                    <a:ln w="9525">
-                      <a:noFill/>
-                      <a:headEnd/>
-                      <a:tailEnd/>
-                    </a:ln>
-                  </pic:spPr>
-                </pic:pic>
-              </a:graphicData>
-            </a:graphic>
-          </wp:inline>
-        </w:drawing>
-      </w:r>
-    </w:p>
-    <w:p>
-      <w:pPr>
-        <w:pStyle w:val="ImageCaption"/>
-      </w:pPr>
-      <w:r>
-        <w:rPr>
-          <w:lang w:val="vi-VN"/>
-        </w:rPr>
-        <w:t xml:space="preserve">Sơ đồ 1 — 2.1 Bối cảnh hệ thống</w:t>
+        <w:pStyle w:val="SourceCode"/>
+      </w:pPr>
+      <w:r>
+        <w:rPr>
+          <w:rStyle w:val="KeywordTok"/>
+        </w:rPr>
+        <w:t xml:space="preserve">flowchart</w:t>
+      </w:r>
+      <w:r>
+        <w:rPr>
+          <w:rStyle w:val="NormalTok"/>
+        </w:rPr>
+        <w:t xml:space="preserve"> </w:t>
+      </w:r>
+      <w:r>
+        <w:rPr>
+          <w:rStyle w:val="ConstantTok"/>
+        </w:rPr>
+        <w:t xml:space="preserve">LR</w:t>
+      </w:r>
+      <w:r>
+        <w:br/>
+      </w:r>
+      <w:r>
+        <w:rPr>
+          <w:rStyle w:val="NormalTok"/>
+        </w:rPr>
+        <w:t xml:space="preserve">  </w:t>
+      </w:r>
+      <w:r>
+        <w:rPr>
+          <w:rStyle w:val="DataTypeTok"/>
+        </w:rPr>
+        <w:t xml:space="preserve">KH</w:t>
+      </w:r>
+      <w:r>
+        <w:rPr>
+          <w:rStyle w:val="NormalTok"/>
+        </w:rPr>
+        <w:t xml:space="preserve">([</w:t>
+      </w:r>
+      <w:r>
+        <w:rPr>
+          <w:rStyle w:val="VerbatimStringTok"/>
+        </w:rPr>
+        <w:t xml:space="preserve">Khách hàng</w:t>
+      </w:r>
+      <w:r>
+        <w:rPr>
+          <w:rStyle w:val="NormalTok"/>
+        </w:rPr>
+        <w:t xml:space="preserve">]) </w:t>
+      </w:r>
+      <w:r>
+        <w:rPr>
+          <w:rStyle w:val="PreprocessorTok"/>
+        </w:rPr>
+        <w:t xml:space="preserve">--&gt;</w:t>
+      </w:r>
+      <w:r>
+        <w:rPr>
+          <w:rStyle w:val="NormalTok"/>
+        </w:rPr>
+        <w:t xml:space="preserve"> </w:t>
+      </w:r>
+      <w:r>
+        <w:rPr>
+          <w:rStyle w:val="DataTypeTok"/>
+        </w:rPr>
+        <w:t xml:space="preserve">M2</w:t>
+      </w:r>
+      <w:r>
+        <w:rPr>
+          <w:rStyle w:val="NormalTok"/>
+        </w:rPr>
+        <w:t xml:space="preserve">[</w:t>
+      </w:r>
+      <w:r>
+        <w:rPr>
+          <w:rStyle w:val="VerbatimStringTok"/>
+        </w:rPr>
+        <w:t xml:space="preserve">Magento 2 storefront</w:t>
+      </w:r>
+      <w:r>
+        <w:rPr>
+          <w:rStyle w:val="NormalTok"/>
+        </w:rPr>
+        <w:t xml:space="preserve">]</w:t>
+      </w:r>
+      <w:r>
+        <w:br/>
+      </w:r>
+      <w:r>
+        <w:rPr>
+          <w:rStyle w:val="NormalTok"/>
+        </w:rPr>
+        <w:t xml:space="preserve">  </w:t>
+      </w:r>
+      <w:r>
+        <w:rPr>
+          <w:rStyle w:val="DataTypeTok"/>
+        </w:rPr>
+        <w:t xml:space="preserve">M2</w:t>
+      </w:r>
+      <w:r>
+        <w:rPr>
+          <w:rStyle w:val="NormalTok"/>
+        </w:rPr>
+        <w:t xml:space="preserve"> </w:t>
+      </w:r>
+      <w:r>
+        <w:rPr>
+          <w:rStyle w:val="PreprocessorTok"/>
+        </w:rPr>
+        <w:t xml:space="preserve">--&gt;</w:t>
+      </w:r>
+      <w:r>
+        <w:rPr>
+          <w:rStyle w:val="VerbatimStringTok"/>
+        </w:rPr>
+        <w:t xml:space="preserve">|Yêu cầu, ảnh, STK|</w:t>
+      </w:r>
+      <w:r>
+        <w:rPr>
+          <w:rStyle w:val="NormalTok"/>
+        </w:rPr>
+        <w:t xml:space="preserve"> </w:t>
+      </w:r>
+      <w:r>
+        <w:rPr>
+          <w:rStyle w:val="DataTypeTok"/>
+        </w:rPr>
+        <w:t xml:space="preserve">Q</w:t>
+      </w:r>
+      <w:r>
+        <w:rPr>
+          <w:rStyle w:val="NormalTok"/>
+        </w:rPr>
+        <w:t xml:space="preserve">[(</w:t>
+      </w:r>
+      <w:r>
+        <w:rPr>
+          <w:rStyle w:val="VerbatimStringTok"/>
+        </w:rPr>
+        <w:t xml:space="preserve">Queue connector</w:t>
+      </w:r>
+      <w:r>
+        <w:rPr>
+          <w:rStyle w:val="NormalTok"/>
+        </w:rPr>
+        <w:t xml:space="preserve">)]</w:t>
+      </w:r>
+      <w:r>
+        <w:br/>
+      </w:r>
+      <w:r>
+        <w:rPr>
+          <w:rStyle w:val="NormalTok"/>
+        </w:rPr>
+        <w:t xml:space="preserve">  </w:t>
+      </w:r>
+      <w:r>
+        <w:rPr>
+          <w:rStyle w:val="DataTypeTok"/>
+        </w:rPr>
+        <w:t xml:space="preserve">Q</w:t>
+      </w:r>
+      <w:r>
+        <w:rPr>
+          <w:rStyle w:val="NormalTok"/>
+        </w:rPr>
+        <w:t xml:space="preserve"> </w:t>
+      </w:r>
+      <w:r>
+        <w:rPr>
+          <w:rStyle w:val="PreprocessorTok"/>
+        </w:rPr>
+        <w:t xml:space="preserve">--&gt;</w:t>
+      </w:r>
+      <w:r>
+        <w:rPr>
+          <w:rStyle w:val="NormalTok"/>
+        </w:rPr>
+        <w:t xml:space="preserve"> </w:t>
+      </w:r>
+      <w:r>
+        <w:rPr>
+          <w:rStyle w:val="DataTypeTok"/>
+        </w:rPr>
+        <w:t xml:space="preserve">OD</w:t>
+      </w:r>
+      <w:r>
+        <w:rPr>
+          <w:rStyle w:val="NormalTok"/>
+        </w:rPr>
+        <w:t xml:space="preserve">[</w:t>
+      </w:r>
+      <w:r>
+        <w:rPr>
+          <w:rStyle w:val="VerbatimStringTok"/>
+        </w:rPr>
+        <w:t xml:space="preserve">Odoo 17</w:t>
+      </w:r>
+      <w:r>
+        <w:rPr>
+          <w:rStyle w:val="NormalTok"/>
+        </w:rPr>
+        <w:t xml:space="preserve">]</w:t>
+      </w:r>
+      <w:r>
+        <w:br/>
+      </w:r>
+      <w:r>
+        <w:rPr>
+          <w:rStyle w:val="NormalTok"/>
+        </w:rPr>
+        <w:t xml:space="preserve">  </w:t>
+      </w:r>
+      <w:r>
+        <w:rPr>
+          <w:rStyle w:val="DataTypeTok"/>
+        </w:rPr>
+        <w:t xml:space="preserve">OD</w:t>
+      </w:r>
+      <w:r>
+        <w:rPr>
+          <w:rStyle w:val="NormalTok"/>
+        </w:rPr>
+        <w:t xml:space="preserve"> </w:t>
+      </w:r>
+      <w:r>
+        <w:rPr>
+          <w:rStyle w:val="PreprocessorTok"/>
+        </w:rPr>
+        <w:t xml:space="preserve">--&gt;</w:t>
+      </w:r>
+      <w:r>
+        <w:rPr>
+          <w:rStyle w:val="VerbatimStringTok"/>
+        </w:rPr>
+        <w:t xml:space="preserve">|Trạng thái, lý do từ chối|</w:t>
+      </w:r>
+      <w:r>
+        <w:rPr>
+          <w:rStyle w:val="NormalTok"/>
+        </w:rPr>
+        <w:t xml:space="preserve"> </w:t>
+      </w:r>
+      <w:r>
+        <w:rPr>
+          <w:rStyle w:val="DataTypeTok"/>
+        </w:rPr>
+        <w:t xml:space="preserve">Q</w:t>
+      </w:r>
+      <w:r>
+        <w:br/>
+      </w:r>
+      <w:r>
+        <w:rPr>
+          <w:rStyle w:val="NormalTok"/>
+        </w:rPr>
+        <w:t xml:space="preserve">  </w:t>
+      </w:r>
+      <w:r>
+        <w:rPr>
+          <w:rStyle w:val="DataTypeTok"/>
+        </w:rPr>
+        <w:t xml:space="preserve">Q</w:t>
+      </w:r>
+      <w:r>
+        <w:rPr>
+          <w:rStyle w:val="NormalTok"/>
+        </w:rPr>
+        <w:t xml:space="preserve"> </w:t>
+      </w:r>
+      <w:r>
+        <w:rPr>
+          <w:rStyle w:val="PreprocessorTok"/>
+        </w:rPr>
+        <w:t xml:space="preserve">--&gt;</w:t>
+      </w:r>
+      <w:r>
+        <w:rPr>
+          <w:rStyle w:val="NormalTok"/>
+        </w:rPr>
+        <w:t xml:space="preserve"> </w:t>
+      </w:r>
+      <w:r>
+        <w:rPr>
+          <w:rStyle w:val="DataTypeTok"/>
+        </w:rPr>
+        <w:t xml:space="preserve">M2</w:t>
+      </w:r>
+      <w:r>
+        <w:br/>
+      </w:r>
+      <w:r>
+        <w:rPr>
+          <w:rStyle w:val="NormalTok"/>
+        </w:rPr>
+        <w:t xml:space="preserve">  </w:t>
+      </w:r>
+      <w:r>
+        <w:rPr>
+          <w:rStyle w:val="DataTypeTok"/>
+        </w:rPr>
+        <w:t xml:space="preserve">M2</w:t>
+      </w:r>
+      <w:r>
+        <w:rPr>
+          <w:rStyle w:val="NormalTok"/>
+        </w:rPr>
+        <w:t xml:space="preserve"> </w:t>
+      </w:r>
+      <w:r>
+        <w:rPr>
+          <w:rStyle w:val="PreprocessorTok"/>
+        </w:rPr>
+        <w:t xml:space="preserve">--&gt;</w:t>
+      </w:r>
+      <w:r>
+        <w:rPr>
+          <w:rStyle w:val="VerbatimStringTok"/>
+        </w:rPr>
+        <w:t xml:space="preserve">|Email|</w:t>
+      </w:r>
+      <w:r>
+        <w:rPr>
+          <w:rStyle w:val="NormalTok"/>
+        </w:rPr>
+        <w:t xml:space="preserve"> </w:t>
+      </w:r>
+      <w:r>
+        <w:rPr>
+          <w:rStyle w:val="DataTypeTok"/>
+        </w:rPr>
+        <w:t xml:space="preserve">KH</w:t>
+      </w:r>
+      <w:r>
+        <w:br/>
+      </w:r>
+      <w:r>
+        <w:rPr>
+          <w:rStyle w:val="NormalTok"/>
+        </w:rPr>
+        <w:t xml:space="preserve">  </w:t>
+      </w:r>
+      <w:r>
+        <w:rPr>
+          <w:rStyle w:val="DataTypeTok"/>
+        </w:rPr>
+        <w:t xml:space="preserve">CS</w:t>
+      </w:r>
+      <w:r>
+        <w:rPr>
+          <w:rStyle w:val="NormalTok"/>
+        </w:rPr>
+        <w:t xml:space="preserve">([</w:t>
+      </w:r>
+      <w:r>
+        <w:rPr>
+          <w:rStyle w:val="VerbatimStringTok"/>
+        </w:rPr>
+        <w:t xml:space="preserve">CSKH, Kho, Kế toán</w:t>
+      </w:r>
+      <w:r>
+        <w:rPr>
+          <w:rStyle w:val="NormalTok"/>
+        </w:rPr>
+        <w:t xml:space="preserve">]) </w:t>
+      </w:r>
+      <w:r>
+        <w:rPr>
+          <w:rStyle w:val="PreprocessorTok"/>
+        </w:rPr>
+        <w:t xml:space="preserve">--&gt;</w:t>
+      </w:r>
+      <w:r>
+        <w:rPr>
+          <w:rStyle w:val="NormalTok"/>
+        </w:rPr>
+        <w:t xml:space="preserve"> </w:t>
+      </w:r>
+      <w:r>
+        <w:rPr>
+          <w:rStyle w:val="DataTypeTok"/>
+        </w:rPr>
+        <w:t xml:space="preserve">OD</w:t>
       </w:r>
     </w:p>
     <w:p>
       <w:pPr>
         <w:pStyle w:val="Heading3"/>
       </w:pPr>
-      <w:bookmarkStart w:id="19" w:name="_812427a432729173aefb7c2cafdb6f67496aebe"/>
+      <w:bookmarkStart w:id="16" w:name="_812427a432729173aefb7c2cafdb6f67496aebe"/>
       <w:r>
         <w:rPr>
           <w:lang w:val="vi-VN"/>
         </w:rPr>
         <w:t xml:space="preserve">2.2 Vai trò người dùng</w:t>
       </w:r>
-      <w:bookmarkEnd w:id="19"/>
+      <w:bookmarkEnd w:id="16"/>
     </w:p>
     <w:tbl>
       <w:tblPr>
@@ -1201,14 +1710,14 @@
       <w:pPr>
         <w:pStyle w:val="Heading3"/>
       </w:pPr>
-      <w:bookmarkStart w:id="20" w:name="_192d53e3dc686169719000df00d21c1492fefe4"/>
+      <w:bookmarkStart w:id="17" w:name="_192d53e3dc686169719000df00d21c1492fefe4"/>
       <w:r>
         <w:rPr>
           <w:lang w:val="vi-VN"/>
         </w:rPr>
         <w:t xml:space="preserve">2.3 Giả định &amp; phụ thuộc</w:t>
       </w:r>
-      <w:bookmarkEnd w:id="20"/>
+      <w:bookmarkEnd w:id="17"/>
     </w:p>
     <w:p>
       <w:pPr>
@@ -1296,14 +1805,14 @@
       <w:pPr>
         <w:pStyle w:val="Heading2"/>
       </w:pPr>
-      <w:bookmarkStart w:id="21" w:name="_7ea09d62be1a6fb59958309d2aa901d1cc48e74"/>
+      <w:bookmarkStart w:id="18" w:name="_7ea09d62be1a6fb59958309d2aa901d1cc48e74"/>
       <w:r>
         <w:rPr>
           <w:lang w:val="vi-VN"/>
         </w:rPr>
         <w:t xml:space="preserve">3. Yêu cầu chức năng</w:t>
       </w:r>
-      <w:bookmarkEnd w:id="21"/>
+      <w:bookmarkEnd w:id="18"/>
     </w:p>
     <w:p>
       <w:pPr>
@@ -1496,14 +2005,14 @@
       <w:pPr>
         <w:pStyle w:val="Heading3"/>
       </w:pPr>
-      <w:bookmarkStart w:id="22" w:name="_7386eb0f02ead4a2b1770aee6d6d192fa89c8c6"/>
+      <w:bookmarkStart w:id="19" w:name="_7386eb0f02ead4a2b1770aee6d6d192fa89c8c6"/>
       <w:r>
         <w:rPr>
           <w:lang w:val="vi-VN"/>
         </w:rPr>
         <w:t xml:space="preserve">FR-01 — Kiểm tra điều kiện đổi trả của đơn hàng</w:t>
       </w:r>
-      <w:bookmarkEnd w:id="22"/>
+      <w:bookmarkEnd w:id="19"/>
     </w:p>
     <w:p>
       <w:pPr>
@@ -2243,14 +2752,14 @@
       <w:pPr>
         <w:pStyle w:val="Heading3"/>
       </w:pPr>
-      <w:bookmarkStart w:id="23" w:name="_9f2e341d04bcf1086c202cfef495a6d903af0f2"/>
+      <w:bookmarkStart w:id="20" w:name="_9f2e341d04bcf1086c202cfef495a6d903af0f2"/>
       <w:r>
         <w:rPr>
           <w:lang w:val="vi-VN"/>
         </w:rPr>
         <w:t xml:space="preserve">FR-02 — Tạo yêu cầu đổi trả trên website</w:t>
       </w:r>
-      <w:bookmarkEnd w:id="23"/>
+      <w:bookmarkEnd w:id="20"/>
     </w:p>
     <w:p>
       <w:pPr>
@@ -3012,14 +3521,14 @@
       <w:pPr>
         <w:pStyle w:val="Heading3"/>
       </w:pPr>
-      <w:bookmarkStart w:id="24" w:name="_31993eddf1d587dc8356730c6b5284451fe1dc9"/>
+      <w:bookmarkStart w:id="21" w:name="_31993eddf1d587dc8356730c6b5284451fe1dc9"/>
       <w:r>
         <w:rPr>
           <w:lang w:val="vi-VN"/>
         </w:rPr>
         <w:t xml:space="preserve">FR-03 — Quy tắc lý do, ảnh đính kèm và phí vận chuyển</w:t>
       </w:r>
-      <w:bookmarkEnd w:id="24"/>
+      <w:bookmarkEnd w:id="21"/>
     </w:p>
     <w:p>
       <w:pPr>
@@ -3800,14 +4309,14 @@
       <w:pPr>
         <w:pStyle w:val="Heading3"/>
       </w:pPr>
-      <w:bookmarkStart w:id="25" w:name="_5039dce4ca62af35da946ce2b9c9642a8d673cb"/>
+      <w:bookmarkStart w:id="22" w:name="_5039dce4ca62af35da946ce2b9c9642a8d673cb"/>
       <w:r>
         <w:rPr>
           <w:lang w:val="vi-VN"/>
         </w:rPr>
         <w:t xml:space="preserve">FR-04 — Thông tin nhận hoàn tiền cho đơn COD</w:t>
       </w:r>
-      <w:bookmarkEnd w:id="25"/>
+      <w:bookmarkEnd w:id="22"/>
     </w:p>
     <w:p>
       <w:pPr>
@@ -4360,14 +4869,14 @@
       <w:pPr>
         <w:pStyle w:val="Heading3"/>
       </w:pPr>
-      <w:bookmarkStart w:id="26" w:name="_b74230d8ad62e34d2b751c18159a10a8ac89b55"/>
+      <w:bookmarkStart w:id="23" w:name="_b74230d8ad62e34d2b751c18159a10a8ac89b55"/>
       <w:r>
         <w:rPr>
           <w:lang w:val="vi-VN"/>
         </w:rPr>
         <w:t xml:space="preserve">FR-05 — Đồng bộ yêu cầu từ Magento sang Odoo</w:t>
       </w:r>
-      <w:bookmarkEnd w:id="26"/>
+      <w:bookmarkEnd w:id="23"/>
     </w:p>
     <w:p>
       <w:pPr>
@@ -4975,14 +5484,14 @@
       <w:pPr>
         <w:pStyle w:val="Heading3"/>
       </w:pPr>
-      <w:bookmarkStart w:id="27" w:name="_b84a92fae648e8633a7b38fa1a0a0700c582c24"/>
+      <w:bookmarkStart w:id="24" w:name="_b84a92fae648e8633a7b38fa1a0a0700c582c24"/>
       <w:r>
         <w:rPr>
           <w:lang w:val="vi-VN"/>
         </w:rPr>
         <w:t xml:space="preserve">FR-06 — Khách xem danh sách và chi tiết yêu cầu</w:t>
       </w:r>
-      <w:bookmarkEnd w:id="27"/>
+      <w:bookmarkEnd w:id="24"/>
     </w:p>
     <w:p>
       <w:pPr>
@@ -5670,14 +6179,14 @@
       <w:pPr>
         <w:pStyle w:val="Heading3"/>
       </w:pPr>
-      <w:bookmarkStart w:id="28" w:name="_3c8a86b49a9f1107c4ffc5aed39356cfdbe1ab6"/>
+      <w:bookmarkStart w:id="25" w:name="_3c8a86b49a9f1107c4ffc5aed39356cfdbe1ab6"/>
       <w:r>
         <w:rPr>
           <w:lang w:val="vi-VN"/>
         </w:rPr>
         <w:t xml:space="preserve">FR-07 — Khách huỷ yêu cầu</w:t>
       </w:r>
-      <w:bookmarkEnd w:id="28"/>
+      <w:bookmarkEnd w:id="25"/>
     </w:p>
     <w:p>
       <w:pPr>
@@ -6143,14 +6652,14 @@
       <w:pPr>
         <w:pStyle w:val="Heading3"/>
       </w:pPr>
-      <w:bookmarkStart w:id="29" w:name="_2c20002dcfcdd9eee8d340287cd6a3427292788"/>
+      <w:bookmarkStart w:id="26" w:name="_2c20002dcfcdd9eee8d340287cd6a3427292788"/>
       <w:r>
         <w:rPr>
           <w:lang w:val="vi-VN"/>
         </w:rPr>
         <w:t xml:space="preserve">FR-08 — Danh sách và lọc yêu cầu trên Odoo</w:t>
       </w:r>
-      <w:bookmarkEnd w:id="29"/>
+      <w:bookmarkEnd w:id="26"/>
     </w:p>
     <w:p>
       <w:pPr>
@@ -6739,14 +7248,14 @@
       <w:pPr>
         <w:pStyle w:val="Heading3"/>
       </w:pPr>
-      <w:bookmarkStart w:id="30" w:name="_6d99c2f45d446c18a8d080bbdc0976589f274bf"/>
+      <w:bookmarkStart w:id="27" w:name="_6d99c2f45d446c18a8d080bbdc0976589f274bf"/>
       <w:r>
         <w:rPr>
           <w:lang w:val="vi-VN"/>
         </w:rPr>
         <w:t xml:space="preserve">FR-09 — Duyệt yêu cầu</w:t>
       </w:r>
-      <w:bookmarkEnd w:id="30"/>
+      <w:bookmarkEnd w:id="27"/>
     </w:p>
     <w:p>
       <w:pPr>
@@ -7297,14 +7806,14 @@
       <w:pPr>
         <w:pStyle w:val="Heading3"/>
       </w:pPr>
-      <w:bookmarkStart w:id="31" w:name="_5805d9d42fb90fa7f080b264f3c0a2fc84ac123"/>
+      <w:bookmarkStart w:id="28" w:name="_5805d9d42fb90fa7f080b264f3c0a2fc84ac123"/>
       <w:r>
         <w:rPr>
           <w:lang w:val="vi-VN"/>
         </w:rPr>
         <w:t xml:space="preserve">FR-10 — Từ chối yêu cầu</w:t>
       </w:r>
-      <w:bookmarkEnd w:id="31"/>
+      <w:bookmarkEnd w:id="28"/>
     </w:p>
     <w:p>
       <w:pPr>
@@ -7941,14 +8450,14 @@
       <w:pPr>
         <w:pStyle w:val="Heading3"/>
       </w:pPr>
-      <w:bookmarkStart w:id="32" w:name="_9dafcd407f83091b3616cd20cab6edc069b1aee"/>
+      <w:bookmarkStart w:id="29" w:name="_9dafcd407f83091b3616cd20cab6edc069b1aee"/>
       <w:r>
         <w:rPr>
           <w:lang w:val="vi-VN"/>
         </w:rPr>
         <w:t xml:space="preserve">FR-11 — Đồng bộ trạng thái về Magento và email khách</w:t>
       </w:r>
-      <w:bookmarkEnd w:id="32"/>
+      <w:bookmarkEnd w:id="29"/>
     </w:p>
     <w:p>
       <w:pPr>
@@ -8394,14 +8903,14 @@
       <w:pPr>
         <w:pStyle w:val="Heading3"/>
       </w:pPr>
-      <w:bookmarkStart w:id="33" w:name="_4515cc17165fd8bb63ccfd70df7fd55d70e6eae"/>
+      <w:bookmarkStart w:id="30" w:name="_4515cc17165fd8bb63ccfd70df7fd55d70e6eae"/>
       <w:r>
         <w:rPr>
           <w:lang w:val="vi-VN"/>
         </w:rPr>
         <w:t xml:space="preserve">FR-12 — Cảnh báo yêu cầu quá 48 giờ</w:t>
       </w:r>
-      <w:bookmarkEnd w:id="33"/>
+      <w:bookmarkEnd w:id="30"/>
     </w:p>
     <w:p>
       <w:pPr>
@@ -8877,14 +9386,14 @@
       <w:pPr>
         <w:pStyle w:val="Heading3"/>
       </w:pPr>
-      <w:bookmarkStart w:id="34" w:name="_08213f3bc1c896195f20a5363ad83e60837d9c0"/>
+      <w:bookmarkStart w:id="31" w:name="_08213f3bc1c896195f20a5363ad83e60837d9c0"/>
       <w:r>
         <w:rPr>
           <w:lang w:val="vi-VN"/>
         </w:rPr>
         <w:t xml:space="preserve">FR-13 — Nhận hàng trả và kiểm tra tình trạng</w:t>
       </w:r>
-      <w:bookmarkEnd w:id="34"/>
+      <w:bookmarkEnd w:id="31"/>
     </w:p>
     <w:p>
       <w:pPr>
@@ -9539,14 +10048,14 @@
       <w:pPr>
         <w:pStyle w:val="Heading3"/>
       </w:pPr>
-      <w:bookmarkStart w:id="35" w:name="_4e01973c2e5f4ebcb7b497cb854df932578941b"/>
+      <w:bookmarkStart w:id="32" w:name="_4e01973c2e5f4ebcb7b497cb854df932578941b"/>
       <w:r>
         <w:rPr>
           <w:lang w:val="vi-VN"/>
         </w:rPr>
         <w:t xml:space="preserve">FR-14 — Credit note hoàn tiền cho yêu cầu trả hàng</w:t>
       </w:r>
-      <w:bookmarkEnd w:id="35"/>
+      <w:bookmarkEnd w:id="32"/>
     </w:p>
     <w:p>
       <w:pPr>
@@ -10108,14 +10617,14 @@
       <w:pPr>
         <w:pStyle w:val="Heading3"/>
       </w:pPr>
-      <w:bookmarkStart w:id="36" w:name="_3cd07e5951de65a587b394ca28e6f5ad346960f"/>
+      <w:bookmarkStart w:id="33" w:name="_3cd07e5951de65a587b394ca28e6f5ad346960f"/>
       <w:r>
         <w:rPr>
           <w:lang w:val="vi-VN"/>
         </w:rPr>
         <w:t xml:space="preserve">FR-15 — Đơn đổi size giá 0đ</w:t>
       </w:r>
-      <w:bookmarkEnd w:id="36"/>
+      <w:bookmarkEnd w:id="33"/>
     </w:p>
     <w:p>
       <w:pPr>
@@ -10563,14 +11072,14 @@
       <w:pPr>
         <w:pStyle w:val="Heading3"/>
       </w:pPr>
-      <w:bookmarkStart w:id="37" w:name="_ed780a1acee53300ce1f902e96efcd89316f6c0"/>
+      <w:bookmarkStart w:id="34" w:name="_ed780a1acee53300ce1f902e96efcd89316f6c0"/>
       <w:r>
         <w:rPr>
           <w:lang w:val="vi-VN"/>
         </w:rPr>
         <w:t xml:space="preserve">FR-16 — Báo cáo yêu cầu theo lý do</w:t>
       </w:r>
-      <w:bookmarkEnd w:id="37"/>
+      <w:bookmarkEnd w:id="34"/>
     </w:p>
     <w:p>
       <w:pPr>
@@ -10991,14 +11500,14 @@
       <w:pPr>
         <w:pStyle w:val="Heading3"/>
       </w:pPr>
-      <w:bookmarkStart w:id="38" w:name="_107f6c4597b9a8d7cba2af29250b40b9ff9b157"/>
+      <w:bookmarkStart w:id="35" w:name="_107f6c4597b9a8d7cba2af29250b40b9ff9b157"/>
       <w:r>
         <w:rPr>
           <w:lang w:val="vi-VN"/>
         </w:rPr>
         <w:t xml:space="preserve">FR-17 — Cấu hình chính sách đổi trả</w:t>
       </w:r>
-      <w:bookmarkEnd w:id="38"/>
+      <w:bookmarkEnd w:id="35"/>
     </w:p>
     <w:p>
       <w:pPr>
@@ -11332,27 +11841,27 @@
       <w:pPr>
         <w:pStyle w:val="Heading2"/>
       </w:pPr>
-      <w:bookmarkStart w:id="39" w:name="_85da0fc9d7f2b4423f253a8809dc46d21b9b5b2"/>
+      <w:bookmarkStart w:id="36" w:name="_85da0fc9d7f2b4423f253a8809dc46d21b9b5b2"/>
       <w:r>
         <w:rPr>
           <w:lang w:val="vi-VN"/>
         </w:rPr>
         <w:t xml:space="preserve">4. Yêu cầu phi chức năng</w:t>
       </w:r>
-      <w:bookmarkEnd w:id="39"/>
+      <w:bookmarkEnd w:id="36"/>
     </w:p>
     <w:p>
       <w:pPr>
         <w:pStyle w:val="Heading3"/>
       </w:pPr>
-      <w:bookmarkStart w:id="40" w:name="_935b419877e9e6fc606e6a0a8f6d2c220299cc9"/>
+      <w:bookmarkStart w:id="37" w:name="_935b419877e9e6fc606e6a0a8f6d2c220299cc9"/>
       <w:r>
         <w:rPr>
           <w:lang w:val="vi-VN"/>
         </w:rPr>
         <w:t xml:space="preserve">NFR-01 — Hiệu năng</w:t>
       </w:r>
-      <w:bookmarkEnd w:id="40"/>
+      <w:bookmarkEnd w:id="37"/>
     </w:p>
     <w:p>
       <w:pPr>
@@ -11416,14 +11925,14 @@
       <w:pPr>
         <w:pStyle w:val="Heading3"/>
       </w:pPr>
-      <w:bookmarkStart w:id="41" w:name="_dcc3b522a7159bb46edc266e9e9d5abd8aefd9d"/>
+      <w:bookmarkStart w:id="38" w:name="_dcc3b522a7159bb46edc266e9e9d5abd8aefd9d"/>
       <w:r>
         <w:rPr>
           <w:lang w:val="vi-VN"/>
         </w:rPr>
         <w:t xml:space="preserve">NFR-02 — Độ tin cậy đồng bộ</w:t>
       </w:r>
-      <w:bookmarkEnd w:id="41"/>
+      <w:bookmarkEnd w:id="38"/>
     </w:p>
     <w:p>
       <w:pPr>
@@ -11487,14 +11996,14 @@
       <w:pPr>
         <w:pStyle w:val="Heading3"/>
       </w:pPr>
-      <w:bookmarkStart w:id="42" w:name="_f5b7e50938eb1037d2850677716fb0afc1fb759"/>
+      <w:bookmarkStart w:id="39" w:name="_f5b7e50938eb1037d2850677716fb0afc1fb759"/>
       <w:r>
         <w:rPr>
           <w:lang w:val="vi-VN"/>
         </w:rPr>
         <w:t xml:space="preserve">NFR-03 — Bảo mật &amp; phân quyền</w:t>
       </w:r>
-      <w:bookmarkEnd w:id="42"/>
+      <w:bookmarkEnd w:id="39"/>
     </w:p>
     <w:p>
       <w:pPr>
@@ -11558,14 +12067,14 @@
       <w:pPr>
         <w:pStyle w:val="Heading3"/>
       </w:pPr>
-      <w:bookmarkStart w:id="43" w:name="_8f07bc4f65d71506cc4bbd56d9de2ce43f0ba50"/>
+      <w:bookmarkStart w:id="40" w:name="_8f07bc4f65d71506cc4bbd56d9de2ce43f0ba50"/>
       <w:r>
         <w:rPr>
           <w:lang w:val="vi-VN"/>
         </w:rPr>
         <w:t xml:space="preserve">NFR-04 — Audit log</w:t>
       </w:r>
-      <w:bookmarkEnd w:id="43"/>
+      <w:bookmarkEnd w:id="40"/>
     </w:p>
     <w:p>
       <w:pPr>
@@ -11629,14 +12138,14 @@
       <w:pPr>
         <w:pStyle w:val="Heading3"/>
       </w:pPr>
-      <w:bookmarkStart w:id="44" w:name="_29ad6d8c849ebb77f47273b0a2c97cba0c281be"/>
+      <w:bookmarkStart w:id="41" w:name="_29ad6d8c849ebb77f47273b0a2c97cba0c281be"/>
       <w:r>
         <w:rPr>
           <w:lang w:val="vi-VN"/>
         </w:rPr>
         <w:t xml:space="preserve">NFR-05 — Dữ liệu cá nhân</w:t>
       </w:r>
-      <w:bookmarkEnd w:id="44"/>
+      <w:bookmarkEnd w:id="41"/>
     </w:p>
     <w:p>
       <w:pPr>
@@ -11725,14 +12234,14 @@
       <w:pPr>
         <w:pStyle w:val="Heading3"/>
       </w:pPr>
-      <w:bookmarkStart w:id="45" w:name="_167bb8c0122dbe84cbebcc7d8bee62132ae6376"/>
+      <w:bookmarkStart w:id="42" w:name="_167bb8c0122dbe84cbebcc7d8bee62132ae6376"/>
       <w:r>
         <w:rPr>
           <w:lang w:val="vi-VN"/>
         </w:rPr>
         <w:t xml:space="preserve">NFR-06 — Tương thích &amp; responsive</w:t>
       </w:r>
-      <w:bookmarkEnd w:id="45"/>
+      <w:bookmarkEnd w:id="42"/>
     </w:p>
     <w:p>
       <w:pPr>
@@ -11796,14 +12305,14 @@
       <w:pPr>
         <w:pStyle w:val="Heading3"/>
       </w:pPr>
-      <w:bookmarkStart w:id="46" w:name="_76aa0c11c052d72f1a103b6b323a48dfb2f10f5"/>
+      <w:bookmarkStart w:id="43" w:name="_76aa0c11c052d72f1a103b6b323a48dfb2f10f5"/>
       <w:r>
         <w:rPr>
           <w:lang w:val="vi-VN"/>
         </w:rPr>
         <w:t xml:space="preserve">NFR-07 — Định dạng &amp; ngôn ngữ</w:t>
       </w:r>
-      <w:bookmarkEnd w:id="46"/>
+      <w:bookmarkEnd w:id="43"/>
     </w:p>
     <w:p>
       <w:pPr>
@@ -11930,14 +12439,14 @@
       <w:pPr>
         <w:pStyle w:val="Heading3"/>
       </w:pPr>
-      <w:bookmarkStart w:id="47" w:name="_9224edf8b3cabc39fded521a1d544e4a4115e06"/>
+      <w:bookmarkStart w:id="44" w:name="_9224edf8b3cabc39fded521a1d544e4a4115e06"/>
       <w:r>
         <w:rPr>
           <w:lang w:val="vi-VN"/>
         </w:rPr>
         <w:t xml:space="preserve">NFR-08 — Lưu trữ ảnh</w:t>
       </w:r>
-      <w:bookmarkEnd w:id="47"/>
+      <w:bookmarkEnd w:id="44"/>
     </w:p>
     <w:p>
       <w:pPr>
@@ -12001,27 +12510,27 @@
       <w:pPr>
         <w:pStyle w:val="Heading2"/>
       </w:pPr>
-      <w:bookmarkStart w:id="48" w:name="_e46a00b9d6a4520fa07e54378f2065f19cda772"/>
+      <w:bookmarkStart w:id="45" w:name="_e46a00b9d6a4520fa07e54378f2065f19cda772"/>
       <w:r>
         <w:rPr>
           <w:lang w:val="vi-VN"/>
         </w:rPr>
         <w:t xml:space="preserve">5. Tích hợp &amp; dữ liệu</w:t>
       </w:r>
-      <w:bookmarkEnd w:id="48"/>
+      <w:bookmarkEnd w:id="45"/>
     </w:p>
     <w:p>
       <w:pPr>
         <w:pStyle w:val="Heading3"/>
       </w:pPr>
-      <w:bookmarkStart w:id="49" w:name="_56b4754226bff1b4d85e3f11c477055a4dfb8c4"/>
+      <w:bookmarkStart w:id="46" w:name="_56b4754226bff1b4d85e3f11c477055a4dfb8c4"/>
       <w:r>
         <w:rPr>
           <w:lang w:val="vi-VN"/>
         </w:rPr>
         <w:t xml:space="preserve">5.1 Hệ thống ngoài</w:t>
       </w:r>
-      <w:bookmarkEnd w:id="49"/>
+      <w:bookmarkEnd w:id="46"/>
     </w:p>
     <w:tbl>
       <w:tblPr>
@@ -12476,14 +12985,14 @@
       <w:pPr>
         <w:pStyle w:val="Heading3"/>
       </w:pPr>
-      <w:bookmarkStart w:id="50" w:name="_api"/>
+      <w:bookmarkStart w:id="47" w:name="_api"/>
       <w:r>
         <w:rPr>
           <w:lang w:val="vi-VN"/>
         </w:rPr>
         <w:t xml:space="preserve">5.2 API</w:t>
       </w:r>
-      <w:bookmarkEnd w:id="50"/>
+      <w:bookmarkEnd w:id="47"/>
     </w:p>
     <w:tbl>
       <w:tblPr>
@@ -12867,14 +13376,14 @@
       <w:pPr>
         <w:pStyle w:val="Heading3"/>
       </w:pPr>
-      <w:bookmarkStart w:id="51" w:name="_bf87ca9ce394ab6b8982674458d2519ba4057dc"/>
+      <w:bookmarkStart w:id="48" w:name="_bf87ca9ce394ab6b8982674458d2519ba4057dc"/>
       <w:r>
         <w:rPr>
           <w:lang w:val="vi-VN"/>
         </w:rPr>
         <w:t xml:space="preserve">5.3 Mapping trường dữ liệu</w:t>
       </w:r>
-      <w:bookmarkEnd w:id="51"/>
+      <w:bookmarkEnd w:id="48"/>
     </w:p>
     <w:tbl>
       <w:tblPr>
@@ -13704,27 +14213,27 @@
       <w:pPr>
         <w:pStyle w:val="Heading2"/>
       </w:pPr>
-      <w:bookmarkStart w:id="52" w:name="_8df536b600d38404bda1aef8e8341995517e7bf"/>
+      <w:bookmarkStart w:id="49" w:name="_8df536b600d38404bda1aef8e8341995517e7bf"/>
       <w:r>
         <w:rPr>
           <w:lang w:val="vi-VN"/>
         </w:rPr>
         <w:t xml:space="preserve">6. Screen Inventory</w:t>
       </w:r>
-      <w:bookmarkEnd w:id="52"/>
+      <w:bookmarkEnd w:id="49"/>
     </w:p>
     <w:p>
       <w:pPr>
         <w:pStyle w:val="Heading3"/>
       </w:pPr>
-      <w:bookmarkStart w:id="53" w:name="_40131a2b303927d0764378fabb372bd0d2a436e"/>
+      <w:bookmarkStart w:id="50" w:name="_40131a2b303927d0764378fabb372bd0d2a436e"/>
       <w:r>
         <w:rPr>
           <w:lang w:val="vi-VN"/>
         </w:rPr>
         <w:t xml:space="preserve">6.1 Danh sách màn hình</w:t>
       </w:r>
-      <w:bookmarkEnd w:id="53"/>
+      <w:bookmarkEnd w:id="50"/>
     </w:p>
     <w:tbl>
       <w:tblPr>
@@ -14777,27 +15286,27 @@
       <w:pPr>
         <w:pStyle w:val="Heading3"/>
       </w:pPr>
-      <w:bookmarkStart w:id="54" w:name="_wireframe"/>
+      <w:bookmarkStart w:id="51" w:name="_wireframe"/>
       <w:r>
         <w:rPr>
           <w:lang w:val="vi-VN"/>
         </w:rPr>
         <w:t xml:space="preserve">6.2 Wireframe</w:t>
       </w:r>
-      <w:bookmarkEnd w:id="54"/>
+      <w:bookmarkEnd w:id="51"/>
     </w:p>
     <w:p>
       <w:pPr>
         <w:pStyle w:val="Heading4"/>
       </w:pPr>
-      <w:bookmarkStart w:id="55" w:name="_85c4fdabe5ef0370a145e48a50003cf42a61b90"/>
+      <w:bookmarkStart w:id="52" w:name="_85c4fdabe5ef0370a145e48a50003cf42a61b90"/>
       <w:r>
         <w:rPr>
           <w:lang w:val="vi-VN"/>
         </w:rPr>
         <w:t xml:space="preserve">SCR-01 — Đơn hàng của tôi</w:t>
       </w:r>
-      <w:bookmarkEnd w:id="55"/>
+      <w:bookmarkEnd w:id="52"/>
     </w:p>
     <w:p>
       <w:pPr>
@@ -14843,18 +15352,18 @@
           <wp:inline>
             <wp:extent cx="5334000" cy="3041120"/>
             <wp:effectExtent b="0" l="0" r="0" t="0"/>
-            <wp:docPr descr="SCR-01 — Đơn hàng của tôi" title="" id="57" name="Picture"/>
+            <wp:docPr descr="SCR-01 — Đơn hàng của tôi" title="" id="54" name="Picture"/>
             <a:graphic>
               <a:graphicData uri="http://schemas.openxmlformats.org/drawingml/2006/picture">
                 <pic:pic>
                   <pic:nvPicPr>
-                    <pic:cNvPr descr="ui/png/SCR-01-don-hang-cua-toi.png" id="58" name="Picture"/>
+                    <pic:cNvPr descr="ui/png/SCR-01-don-hang-cua-toi.png" id="55" name="Picture"/>
                     <pic:cNvPicPr>
                       <a:picLocks noChangeArrowheads="1" noChangeAspect="1"/>
                     </pic:cNvPicPr>
                   </pic:nvPicPr>
                   <pic:blipFill>
-                    <a:blip r:embed="rId56"/>
+                    <a:blip r:embed="rId53"/>
                     <a:stretch>
                       <a:fillRect/>
                     </a:stretch>
@@ -14901,18 +15410,18 @@
           <wp:inline>
             <wp:extent cx="5334000" cy="2907770"/>
             <wp:effectExtent b="0" l="0" r="0" t="0"/>
-            <wp:docPr descr="SCR-01 — Trạng thái: Rỗng" title="" id="60" name="Picture"/>
+            <wp:docPr descr="SCR-01 — Trạng thái: Rỗng" title="" id="57" name="Picture"/>
             <a:graphic>
               <a:graphicData uri="http://schemas.openxmlformats.org/drawingml/2006/picture">
                 <pic:pic>
                   <pic:nvPicPr>
-                    <pic:cNvPr descr="ui/png/SCR-01-don-hang-cua-toi--empty.png" id="61" name="Picture"/>
+                    <pic:cNvPr descr="ui/png/SCR-01-don-hang-cua-toi--empty.png" id="58" name="Picture"/>
                     <pic:cNvPicPr>
                       <a:picLocks noChangeArrowheads="1" noChangeAspect="1"/>
                     </pic:cNvPicPr>
                   </pic:nvPicPr>
                   <pic:blipFill>
-                    <a:blip r:embed="rId59"/>
+                    <a:blip r:embed="rId56"/>
                     <a:stretch>
                       <a:fillRect/>
                     </a:stretch>
@@ -14959,18 +15468,18 @@
           <wp:inline>
             <wp:extent cx="1681437" cy="7919999"/>
             <wp:effectExtent b="0" l="0" r="0" t="0"/>
-            <wp:docPr descr="SCR-01 — Mobile 390px" title="" id="63" name="Picture"/>
+            <wp:docPr descr="SCR-01 — Mobile 390px" title="" id="60" name="Picture"/>
             <a:graphic>
               <a:graphicData uri="http://schemas.openxmlformats.org/drawingml/2006/picture">
                 <pic:pic>
                   <pic:nvPicPr>
-                    <pic:cNvPr descr="ui/png/SCR-01-don-hang-cua-toi-mobile.png" id="64" name="Picture"/>
+                    <pic:cNvPr descr="ui/png/SCR-01-don-hang-cua-toi-mobile.png" id="61" name="Picture"/>
                     <pic:cNvPicPr>
                       <a:picLocks noChangeArrowheads="1" noChangeAspect="1"/>
                     </pic:cNvPicPr>
                   </pic:nvPicPr>
                   <pic:blipFill>
-                    <a:blip r:embed="rId62"/>
+                    <a:blip r:embed="rId59"/>
                     <a:stretch>
                       <a:fillRect/>
                     </a:stretch>
@@ -15017,18 +15526,18 @@
           <wp:inline>
             <wp:extent cx="2519999" cy="6784615"/>
             <wp:effectExtent b="0" l="0" r="0" t="0"/>
-            <wp:docPr descr="SCR-01 — Mobile 390px — Rỗng" title="" id="66" name="Picture"/>
+            <wp:docPr descr="SCR-01 — Mobile 390px — Rỗng" title="" id="63" name="Picture"/>
             <a:graphic>
               <a:graphicData uri="http://schemas.openxmlformats.org/drawingml/2006/picture">
                 <pic:pic>
                   <pic:nvPicPr>
-                    <pic:cNvPr descr="ui/png/SCR-01-don-hang-cua-toi--empty-mobile.png" id="67" name="Picture"/>
+                    <pic:cNvPr descr="ui/png/SCR-01-don-hang-cua-toi--empty-mobile.png" id="64" name="Picture"/>
                     <pic:cNvPicPr>
                       <a:picLocks noChangeArrowheads="1" noChangeAspect="1"/>
                     </pic:cNvPicPr>
                   </pic:nvPicPr>
                   <pic:blipFill>
-                    <a:blip r:embed="rId65"/>
+                    <a:blip r:embed="rId62"/>
                     <a:stretch>
                       <a:fillRect/>
                     </a:stretch>
@@ -15070,14 +15579,14 @@
       <w:pPr>
         <w:pStyle w:val="Heading4"/>
       </w:pPr>
-      <w:bookmarkStart w:id="68" w:name="_5f31e83088a8db71a6dfaee03ed6cb75b46adf2"/>
+      <w:bookmarkStart w:id="65" w:name="_5f31e83088a8db71a6dfaee03ed6cb75b46adf2"/>
       <w:r>
         <w:rPr>
           <w:lang w:val="vi-VN"/>
         </w:rPr>
         <w:t xml:space="preserve">SCR-02 — Tạo yêu cầu đổi trả</w:t>
       </w:r>
-      <w:bookmarkEnd w:id="68"/>
+      <w:bookmarkEnd w:id="65"/>
     </w:p>
     <w:p>
       <w:pPr>
@@ -15099,18 +15608,18 @@
           <wp:inline>
             <wp:extent cx="5334000" cy="6515629"/>
             <wp:effectExtent b="0" l="0" r="0" t="0"/>
-            <wp:docPr descr="SCR-02 — Tạo yêu cầu đổi trả" title="" id="70" name="Picture"/>
+            <wp:docPr descr="SCR-02 — Tạo yêu cầu đổi trả" title="" id="67" name="Picture"/>
             <a:graphic>
               <a:graphicData uri="http://schemas.openxmlformats.org/drawingml/2006/picture">
                 <pic:pic>
                   <pic:nvPicPr>
-                    <pic:cNvPr descr="ui/png/SCR-02-tao-yeu-cau-doi-tra.png" id="71" name="Picture"/>
+                    <pic:cNvPr descr="ui/png/SCR-02-tao-yeu-cau-doi-tra.png" id="68" name="Picture"/>
                     <pic:cNvPicPr>
                       <a:picLocks noChangeArrowheads="1" noChangeAspect="1"/>
                     </pic:cNvPicPr>
                   </pic:nvPicPr>
                   <pic:blipFill>
-                    <a:blip r:embed="rId69"/>
+                    <a:blip r:embed="rId66"/>
                     <a:stretch>
                       <a:fillRect/>
                     </a:stretch>
@@ -15157,18 +15666,18 @@
           <wp:inline>
             <wp:extent cx="5334000" cy="4678362"/>
             <wp:effectExtent b="0" l="0" r="0" t="0"/>
-            <wp:docPr descr="SCR-02 — Trạng thái: Lỗi validate" title="" id="73" name="Picture"/>
+            <wp:docPr descr="SCR-02 — Trạng thái: Lỗi validate" title="" id="70" name="Picture"/>
             <a:graphic>
               <a:graphicData uri="http://schemas.openxmlformats.org/drawingml/2006/picture">
                 <pic:pic>
                   <pic:nvPicPr>
-                    <pic:cNvPr descr="ui/png/SCR-02-tao-yeu-cau-doi-tra--error.png" id="74" name="Picture"/>
+                    <pic:cNvPr descr="ui/png/SCR-02-tao-yeu-cau-doi-tra--error.png" id="71" name="Picture"/>
                     <pic:cNvPicPr>
                       <a:picLocks noChangeArrowheads="1" noChangeAspect="1"/>
                     </pic:cNvPicPr>
                   </pic:nvPicPr>
                   <pic:blipFill>
-                    <a:blip r:embed="rId72"/>
+                    <a:blip r:embed="rId69"/>
                     <a:stretch>
                       <a:fillRect/>
                     </a:stretch>
@@ -15215,18 +15724,18 @@
           <wp:inline>
             <wp:extent cx="5334000" cy="2548466"/>
             <wp:effectExtent b="0" l="0" r="0" t="0"/>
-            <wp:docPr descr="SCR-02 — Trạng thái: Thành công" title="" id="76" name="Picture"/>
+            <wp:docPr descr="SCR-02 — Trạng thái: Thành công" title="" id="73" name="Picture"/>
             <a:graphic>
               <a:graphicData uri="http://schemas.openxmlformats.org/drawingml/2006/picture">
                 <pic:pic>
                   <pic:nvPicPr>
-                    <pic:cNvPr descr="ui/png/SCR-02-tao-yeu-cau-doi-tra--success.png" id="77" name="Picture"/>
+                    <pic:cNvPr descr="ui/png/SCR-02-tao-yeu-cau-doi-tra--success.png" id="74" name="Picture"/>
                     <pic:cNvPicPr>
                       <a:picLocks noChangeArrowheads="1" noChangeAspect="1"/>
                     </pic:cNvPicPr>
                   </pic:nvPicPr>
                   <pic:blipFill>
-                    <a:blip r:embed="rId75"/>
+                    <a:blip r:embed="rId72"/>
                     <a:stretch>
                       <a:fillRect/>
                     </a:stretch>
@@ -15273,18 +15782,18 @@
           <wp:inline>
             <wp:extent cx="1119536" cy="7919999"/>
             <wp:effectExtent b="0" l="0" r="0" t="0"/>
-            <wp:docPr descr="SCR-02 — Mobile 390px" title="" id="79" name="Picture"/>
+            <wp:docPr descr="SCR-02 — Mobile 390px" title="" id="76" name="Picture"/>
             <a:graphic>
               <a:graphicData uri="http://schemas.openxmlformats.org/drawingml/2006/picture">
                 <pic:pic>
                   <pic:nvPicPr>
-                    <pic:cNvPr descr="ui/png/SCR-02-tao-yeu-cau-doi-tra-mobile.png" id="80" name="Picture"/>
+                    <pic:cNvPr descr="ui/png/SCR-02-tao-yeu-cau-doi-tra-mobile.png" id="77" name="Picture"/>
                     <pic:cNvPicPr>
                       <a:picLocks noChangeArrowheads="1" noChangeAspect="1"/>
                     </pic:cNvPicPr>
                   </pic:nvPicPr>
                   <pic:blipFill>
-                    <a:blip r:embed="rId78"/>
+                    <a:blip r:embed="rId75"/>
                     <a:stretch>
                       <a:fillRect/>
                     </a:stretch>
@@ -15331,18 +15840,18 @@
           <wp:inline>
             <wp:extent cx="1833115" cy="7919999"/>
             <wp:effectExtent b="0" l="0" r="0" t="0"/>
-            <wp:docPr descr="SCR-02 — Mobile 390px — Lỗi validate" title="" id="82" name="Picture"/>
+            <wp:docPr descr="SCR-02 — Mobile 390px — Lỗi validate" title="" id="79" name="Picture"/>
             <a:graphic>
               <a:graphicData uri="http://schemas.openxmlformats.org/drawingml/2006/picture">
                 <pic:pic>
                   <pic:nvPicPr>
-                    <pic:cNvPr descr="ui/png/SCR-02-tao-yeu-cau-doi-tra--error-mobile.png" id="83" name="Picture"/>
+                    <pic:cNvPr descr="ui/png/SCR-02-tao-yeu-cau-doi-tra--error-mobile.png" id="80" name="Picture"/>
                     <pic:cNvPicPr>
                       <a:picLocks noChangeArrowheads="1" noChangeAspect="1"/>
                     </pic:cNvPicPr>
                   </pic:nvPicPr>
                   <pic:blipFill>
-                    <a:blip r:embed="rId81"/>
+                    <a:blip r:embed="rId78"/>
                     <a:stretch>
                       <a:fillRect/>
                     </a:stretch>
@@ -15389,18 +15898,18 @@
           <wp:inline>
             <wp:extent cx="2519999" cy="4419692"/>
             <wp:effectExtent b="0" l="0" r="0" t="0"/>
-            <wp:docPr descr="SCR-02 — Mobile 390px — Thành công" title="" id="85" name="Picture"/>
+            <wp:docPr descr="SCR-02 — Mobile 390px — Thành công" title="" id="82" name="Picture"/>
             <a:graphic>
               <a:graphicData uri="http://schemas.openxmlformats.org/drawingml/2006/picture">
                 <pic:pic>
                   <pic:nvPicPr>
-                    <pic:cNvPr descr="ui/png/SCR-02-tao-yeu-cau-doi-tra--success-mobile.png" id="86" name="Picture"/>
+                    <pic:cNvPr descr="ui/png/SCR-02-tao-yeu-cau-doi-tra--success-mobile.png" id="83" name="Picture"/>
                     <pic:cNvPicPr>
                       <a:picLocks noChangeArrowheads="1" noChangeAspect="1"/>
                     </pic:cNvPicPr>
                   </pic:nvPicPr>
                   <pic:blipFill>
-                    <a:blip r:embed="rId84"/>
+                    <a:blip r:embed="rId81"/>
                     <a:stretch>
                       <a:fillRect/>
                     </a:stretch>
@@ -15442,14 +15951,14 @@
       <w:pPr>
         <w:pStyle w:val="Heading4"/>
       </w:pPr>
-      <w:bookmarkStart w:id="87" w:name="_507fac87bacebc25408f3ede81ebb7135ae6fea"/>
+      <w:bookmarkStart w:id="84" w:name="_507fac87bacebc25408f3ede81ebb7135ae6fea"/>
       <w:r>
         <w:rPr>
           <w:lang w:val="vi-VN"/>
         </w:rPr>
         <w:t xml:space="preserve">SCR-03 — Yêu cầu đổi trả của tôi</w:t>
       </w:r>
-      <w:bookmarkEnd w:id="87"/>
+      <w:bookmarkEnd w:id="84"/>
     </w:p>
     <w:p>
       <w:pPr>
@@ -15471,18 +15980,18 @@
           <wp:inline>
             <wp:extent cx="5334000" cy="2941108"/>
             <wp:effectExtent b="0" l="0" r="0" t="0"/>
-            <wp:docPr descr="SCR-03 — Yêu cầu đổi trả của tôi" title="" id="89" name="Picture"/>
+            <wp:docPr descr="SCR-03 — Yêu cầu đổi trả của tôi" title="" id="86" name="Picture"/>
             <a:graphic>
               <a:graphicData uri="http://schemas.openxmlformats.org/drawingml/2006/picture">
                 <pic:pic>
                   <pic:nvPicPr>
-                    <pic:cNvPr descr="ui/png/SCR-03-yeu-cau-doi-tra-cua-toi.png" id="90" name="Picture"/>
+                    <pic:cNvPr descr="ui/png/SCR-03-yeu-cau-doi-tra-cua-toi.png" id="87" name="Picture"/>
                     <pic:cNvPicPr>
                       <a:picLocks noChangeArrowheads="1" noChangeAspect="1"/>
                     </pic:cNvPicPr>
                   </pic:nvPicPr>
                   <pic:blipFill>
-                    <a:blip r:embed="rId88"/>
+                    <a:blip r:embed="rId85"/>
                     <a:stretch>
                       <a:fillRect/>
                     </a:stretch>
@@ -15529,18 +16038,18 @@
           <wp:inline>
             <wp:extent cx="5334000" cy="2907770"/>
             <wp:effectExtent b="0" l="0" r="0" t="0"/>
-            <wp:docPr descr="SCR-03 — Trạng thái: Rỗng" title="" id="92" name="Picture"/>
+            <wp:docPr descr="SCR-03 — Trạng thái: Rỗng" title="" id="89" name="Picture"/>
             <a:graphic>
               <a:graphicData uri="http://schemas.openxmlformats.org/drawingml/2006/picture">
                 <pic:pic>
                   <pic:nvPicPr>
-                    <pic:cNvPr descr="ui/png/SCR-03-yeu-cau-doi-tra-cua-toi--empty.png" id="93" name="Picture"/>
+                    <pic:cNvPr descr="ui/png/SCR-03-yeu-cau-doi-tra-cua-toi--empty.png" id="90" name="Picture"/>
                     <pic:cNvPicPr>
                       <a:picLocks noChangeArrowheads="1" noChangeAspect="1"/>
                     </pic:cNvPicPr>
                   </pic:nvPicPr>
                   <pic:blipFill>
-                    <a:blip r:embed="rId91"/>
+                    <a:blip r:embed="rId88"/>
                     <a:stretch>
                       <a:fillRect/>
                     </a:stretch>
@@ -15587,18 +16096,18 @@
           <wp:inline>
             <wp:extent cx="1842959" cy="7919999"/>
             <wp:effectExtent b="0" l="0" r="0" t="0"/>
-            <wp:docPr descr="SCR-03 — Mobile 390px" title="" id="95" name="Picture"/>
+            <wp:docPr descr="SCR-03 — Mobile 390px" title="" id="92" name="Picture"/>
             <a:graphic>
               <a:graphicData uri="http://schemas.openxmlformats.org/drawingml/2006/picture">
                 <pic:pic>
                   <pic:nvPicPr>
-                    <pic:cNvPr descr="ui/png/SCR-03-yeu-cau-doi-tra-cua-toi-mobile.png" id="96" name="Picture"/>
+                    <pic:cNvPr descr="ui/png/SCR-03-yeu-cau-doi-tra-cua-toi-mobile.png" id="93" name="Picture"/>
                     <pic:cNvPicPr>
                       <a:picLocks noChangeArrowheads="1" noChangeAspect="1"/>
                     </pic:cNvPicPr>
                   </pic:nvPicPr>
                   <pic:blipFill>
-                    <a:blip r:embed="rId94"/>
+                    <a:blip r:embed="rId91"/>
                     <a:stretch>
                       <a:fillRect/>
                     </a:stretch>
@@ -15645,18 +16154,18 @@
           <wp:inline>
             <wp:extent cx="2519999" cy="6913846"/>
             <wp:effectExtent b="0" l="0" r="0" t="0"/>
-            <wp:docPr descr="SCR-03 — Mobile 390px — Rỗng" title="" id="98" name="Picture"/>
+            <wp:docPr descr="SCR-03 — Mobile 390px — Rỗng" title="" id="95" name="Picture"/>
             <a:graphic>
               <a:graphicData uri="http://schemas.openxmlformats.org/drawingml/2006/picture">
                 <pic:pic>
                   <pic:nvPicPr>
-                    <pic:cNvPr descr="ui/png/SCR-03-yeu-cau-doi-tra-cua-toi--empty-mobile.png" id="99" name="Picture"/>
+                    <pic:cNvPr descr="ui/png/SCR-03-yeu-cau-doi-tra-cua-toi--empty-mobile.png" id="96" name="Picture"/>
                     <pic:cNvPicPr>
                       <a:picLocks noChangeArrowheads="1" noChangeAspect="1"/>
                     </pic:cNvPicPr>
                   </pic:nvPicPr>
                   <pic:blipFill>
-                    <a:blip r:embed="rId97"/>
+                    <a:blip r:embed="rId94"/>
                     <a:stretch>
                       <a:fillRect/>
                     </a:stretch>
@@ -15698,14 +16207,14 @@
       <w:pPr>
         <w:pStyle w:val="Heading4"/>
       </w:pPr>
-      <w:bookmarkStart w:id="100" w:name="_39bab11df01cf8c550b5991c1f94967c602a123"/>
+      <w:bookmarkStart w:id="97" w:name="_39bab11df01cf8c550b5991c1f94967c602a123"/>
       <w:r>
         <w:rPr>
           <w:lang w:val="vi-VN"/>
         </w:rPr>
         <w:t xml:space="preserve">SCR-04 — Chi tiết yêu cầu đổi trả (khách)</w:t>
       </w:r>
-      <w:bookmarkEnd w:id="100"/>
+      <w:bookmarkEnd w:id="97"/>
     </w:p>
     <w:p>
       <w:pPr>
@@ -15727,18 +16236,18 @@
           <wp:inline>
             <wp:extent cx="5334000" cy="3411537"/>
             <wp:effectExtent b="0" l="0" r="0" t="0"/>
-            <wp:docPr descr="SCR-04 — Chi tiết yêu cầu đổi trả" title="" id="102" name="Picture"/>
+            <wp:docPr descr="SCR-04 — Chi tiết yêu cầu đổi trả" title="" id="99" name="Picture"/>
             <a:graphic>
               <a:graphicData uri="http://schemas.openxmlformats.org/drawingml/2006/picture">
                 <pic:pic>
                   <pic:nvPicPr>
-                    <pic:cNvPr descr="ui/png/SCR-04-chi-tiet-yeu-cau-doi-tra.png" id="103" name="Picture"/>
+                    <pic:cNvPr descr="ui/png/SCR-04-chi-tiet-yeu-cau-doi-tra.png" id="100" name="Picture"/>
                     <pic:cNvPicPr>
                       <a:picLocks noChangeArrowheads="1" noChangeAspect="1"/>
                     </pic:cNvPicPr>
                   </pic:nvPicPr>
                   <pic:blipFill>
-                    <a:blip r:embed="rId101"/>
+                    <a:blip r:embed="rId98"/>
                     <a:stretch>
                       <a:fillRect/>
                     </a:stretch>
@@ -15785,18 +16294,18 @@
           <wp:inline>
             <wp:extent cx="5334000" cy="2759604"/>
             <wp:effectExtent b="0" l="0" r="0" t="0"/>
-            <wp:docPr descr="SCR-04 — Trạng thái: Chờ duyệt – xác nhận huỷ" title="" id="105" name="Picture"/>
+            <wp:docPr descr="SCR-04 — Trạng thái: Chờ duyệt – xác nhận huỷ" title="" id="102" name="Picture"/>
             <a:graphic>
               <a:graphicData uri="http://schemas.openxmlformats.org/drawingml/2006/picture">
                 <pic:pic>
                   <pic:nvPicPr>
-                    <pic:cNvPr descr="ui/png/SCR-04-chi-tiet-yeu-cau-doi-tra--cancel.png" id="106" name="Picture"/>
+                    <pic:cNvPr descr="ui/png/SCR-04-chi-tiet-yeu-cau-doi-tra--cancel.png" id="103" name="Picture"/>
                     <pic:cNvPicPr>
                       <a:picLocks noChangeArrowheads="1" noChangeAspect="1"/>
                     </pic:cNvPicPr>
                   </pic:nvPicPr>
                   <pic:blipFill>
-                    <a:blip r:embed="rId104"/>
+                    <a:blip r:embed="rId101"/>
                     <a:stretch>
                       <a:fillRect/>
                     </a:stretch>
@@ -15843,18 +16352,18 @@
           <wp:inline>
             <wp:extent cx="5334000" cy="2548466"/>
             <wp:effectExtent b="0" l="0" r="0" t="0"/>
-            <wp:docPr descr="SCR-04 — Trạng thái: Từ chối" title="" id="108" name="Picture"/>
+            <wp:docPr descr="SCR-04 — Trạng thái: Từ chối" title="" id="105" name="Picture"/>
             <a:graphic>
               <a:graphicData uri="http://schemas.openxmlformats.org/drawingml/2006/picture">
                 <pic:pic>
                   <pic:nvPicPr>
-                    <pic:cNvPr descr="ui/png/SCR-04-chi-tiet-yeu-cau-doi-tra--rejected.png" id="109" name="Picture"/>
+                    <pic:cNvPr descr="ui/png/SCR-04-chi-tiet-yeu-cau-doi-tra--rejected.png" id="106" name="Picture"/>
                     <pic:cNvPicPr>
                       <a:picLocks noChangeArrowheads="1" noChangeAspect="1"/>
                     </pic:cNvPicPr>
                   </pic:nvPicPr>
                   <pic:blipFill>
-                    <a:blip r:embed="rId107"/>
+                    <a:blip r:embed="rId104"/>
                     <a:stretch>
                       <a:fillRect/>
                     </a:stretch>
@@ -15901,18 +16410,18 @@
           <wp:inline>
             <wp:extent cx="2387017" cy="7919999"/>
             <wp:effectExtent b="0" l="0" r="0" t="0"/>
-            <wp:docPr descr="SCR-04 — Mobile 390px" title="" id="111" name="Picture"/>
+            <wp:docPr descr="SCR-04 — Mobile 390px" title="" id="108" name="Picture"/>
             <a:graphic>
               <a:graphicData uri="http://schemas.openxmlformats.org/drawingml/2006/picture">
                 <pic:pic>
                   <pic:nvPicPr>
-                    <pic:cNvPr descr="ui/png/SCR-04-chi-tiet-yeu-cau-doi-tra-mobile.png" id="112" name="Picture"/>
+                    <pic:cNvPr descr="ui/png/SCR-04-chi-tiet-yeu-cau-doi-tra-mobile.png" id="109" name="Picture"/>
                     <pic:cNvPicPr>
                       <a:picLocks noChangeArrowheads="1" noChangeAspect="1"/>
                     </pic:cNvPicPr>
                   </pic:nvPicPr>
                   <pic:blipFill>
-                    <a:blip r:embed="rId110"/>
+                    <a:blip r:embed="rId107"/>
                     <a:stretch>
                       <a:fillRect/>
                     </a:stretch>
@@ -15959,18 +16468,18 @@
           <wp:inline>
             <wp:extent cx="2519999" cy="5214461"/>
             <wp:effectExtent b="0" l="0" r="0" t="0"/>
-            <wp:docPr descr="SCR-04 — Mobile 390px — Chờ duyệt – xác nhận huỷ" title="" id="114" name="Picture"/>
+            <wp:docPr descr="SCR-04 — Mobile 390px — Chờ duyệt – xác nhận huỷ" title="" id="111" name="Picture"/>
             <a:graphic>
               <a:graphicData uri="http://schemas.openxmlformats.org/drawingml/2006/picture">
                 <pic:pic>
                   <pic:nvPicPr>
-                    <pic:cNvPr descr="ui/png/SCR-04-chi-tiet-yeu-cau-doi-tra--cancel-mobile.png" id="115" name="Picture"/>
+                    <pic:cNvPr descr="ui/png/SCR-04-chi-tiet-yeu-cau-doi-tra--cancel-mobile.png" id="112" name="Picture"/>
                     <pic:cNvPicPr>
                       <a:picLocks noChangeArrowheads="1" noChangeAspect="1"/>
                     </pic:cNvPicPr>
                   </pic:nvPicPr>
                   <pic:blipFill>
-                    <a:blip r:embed="rId113"/>
+                    <a:blip r:embed="rId110"/>
                     <a:stretch>
                       <a:fillRect/>
                     </a:stretch>
@@ -16017,18 +16526,18 @@
           <wp:inline>
             <wp:extent cx="2519999" cy="4419692"/>
             <wp:effectExtent b="0" l="0" r="0" t="0"/>
-            <wp:docPr descr="SCR-04 — Mobile 390px — Từ chối" title="" id="117" name="Picture"/>
+            <wp:docPr descr="SCR-04 — Mobile 390px — Từ chối" title="" id="114" name="Picture"/>
             <a:graphic>
               <a:graphicData uri="http://schemas.openxmlformats.org/drawingml/2006/picture">
                 <pic:pic>
                   <pic:nvPicPr>
-                    <pic:cNvPr descr="ui/png/SCR-04-chi-tiet-yeu-cau-doi-tra--rejected-mobile.png" id="118" name="Picture"/>
+                    <pic:cNvPr descr="ui/png/SCR-04-chi-tiet-yeu-cau-doi-tra--rejected-mobile.png" id="115" name="Picture"/>
                     <pic:cNvPicPr>
                       <a:picLocks noChangeArrowheads="1" noChangeAspect="1"/>
                     </pic:cNvPicPr>
                   </pic:nvPicPr>
                   <pic:blipFill>
-                    <a:blip r:embed="rId116"/>
+                    <a:blip r:embed="rId113"/>
                     <a:stretch>
                       <a:fillRect/>
                     </a:stretch>
@@ -16070,14 +16579,14 @@
       <w:pPr>
         <w:pStyle w:val="Heading4"/>
       </w:pPr>
-      <w:bookmarkStart w:id="119" w:name="_5fb77d7d28878a570b8f15c79adbcdbae7038b7"/>
+      <w:bookmarkStart w:id="116" w:name="_5fb77d7d28878a570b8f15c79adbcdbae7038b7"/>
       <w:r>
         <w:rPr>
           <w:lang w:val="vi-VN"/>
         </w:rPr>
         <w:t xml:space="preserve">SCR-05 — Danh sách yêu cầu đổi trả (Odoo)</w:t>
       </w:r>
-      <w:bookmarkEnd w:id="119"/>
+      <w:bookmarkEnd w:id="116"/>
     </w:p>
     <w:p>
       <w:pPr>
@@ -16141,18 +16650,18 @@
           <wp:inline>
             <wp:extent cx="5334000" cy="3355975"/>
             <wp:effectExtent b="0" l="0" r="0" t="0"/>
-            <wp:docPr descr="SCR-05 — Danh sách yêu cầu đổi trả" title="" id="121" name="Picture"/>
+            <wp:docPr descr="SCR-05 — Danh sách yêu cầu đổi trả" title="" id="118" name="Picture"/>
             <a:graphic>
               <a:graphicData uri="http://schemas.openxmlformats.org/drawingml/2006/picture">
                 <pic:pic>
                   <pic:nvPicPr>
-                    <pic:cNvPr descr="ui/png/SCR-05-danh-sach-yeu-cau-odoo.png" id="122" name="Picture"/>
+                    <pic:cNvPr descr="ui/png/SCR-05-danh-sach-yeu-cau-odoo.png" id="119" name="Picture"/>
                     <pic:cNvPicPr>
                       <a:picLocks noChangeArrowheads="1" noChangeAspect="1"/>
                     </pic:cNvPicPr>
                   </pic:nvPicPr>
                   <pic:blipFill>
-                    <a:blip r:embed="rId120"/>
+                    <a:blip r:embed="rId117"/>
                     <a:stretch>
                       <a:fillRect/>
                     </a:stretch>
@@ -16199,18 +16708,18 @@
           <wp:inline>
             <wp:extent cx="5334000" cy="3359679"/>
             <wp:effectExtent b="0" l="0" r="0" t="0"/>
-            <wp:docPr descr="SCR-05 — Trạng thái: Mở bộ lọc" title="" id="124" name="Picture"/>
+            <wp:docPr descr="SCR-05 — Trạng thái: Mở bộ lọc" title="" id="121" name="Picture"/>
             <a:graphic>
               <a:graphicData uri="http://schemas.openxmlformats.org/drawingml/2006/picture">
                 <pic:pic>
                   <pic:nvPicPr>
-                    <pic:cNvPr descr="ui/png/SCR-05-danh-sach-yeu-cau-odoo--filter.png" id="125" name="Picture"/>
+                    <pic:cNvPr descr="ui/png/SCR-05-danh-sach-yeu-cau-odoo--filter.png" id="122" name="Picture"/>
                     <pic:cNvPicPr>
                       <a:picLocks noChangeArrowheads="1" noChangeAspect="1"/>
                     </pic:cNvPicPr>
                   </pic:nvPicPr>
                   <pic:blipFill>
-                    <a:blip r:embed="rId123"/>
+                    <a:blip r:embed="rId120"/>
                     <a:stretch>
                       <a:fillRect/>
                     </a:stretch>
@@ -16257,18 +16766,18 @@
           <wp:inline>
             <wp:extent cx="5334000" cy="3148541"/>
             <wp:effectExtent b="0" l="0" r="0" t="0"/>
-            <wp:docPr descr="SCR-05 — Trạng thái: Rỗng" title="" id="127" name="Picture"/>
+            <wp:docPr descr="SCR-05 — Trạng thái: Rỗng" title="" id="124" name="Picture"/>
             <a:graphic>
               <a:graphicData uri="http://schemas.openxmlformats.org/drawingml/2006/picture">
                 <pic:pic>
                   <pic:nvPicPr>
-                    <pic:cNvPr descr="ui/png/SCR-05-danh-sach-yeu-cau-odoo--empty.png" id="128" name="Picture"/>
+                    <pic:cNvPr descr="ui/png/SCR-05-danh-sach-yeu-cau-odoo--empty.png" id="125" name="Picture"/>
                     <pic:cNvPicPr>
                       <a:picLocks noChangeArrowheads="1" noChangeAspect="1"/>
                     </pic:cNvPicPr>
                   </pic:nvPicPr>
                   <pic:blipFill>
-                    <a:blip r:embed="rId126"/>
+                    <a:blip r:embed="rId123"/>
                     <a:stretch>
                       <a:fillRect/>
                     </a:stretch>
@@ -16310,14 +16819,14 @@
       <w:pPr>
         <w:pStyle w:val="Heading4"/>
       </w:pPr>
-      <w:bookmarkStart w:id="129" w:name="_ca7c672b66226b75a20214cd308a45e49e41667"/>
+      <w:bookmarkStart w:id="126" w:name="_ca7c672b66226b75a20214cd308a45e49e41667"/>
       <w:r>
         <w:rPr>
           <w:lang w:val="vi-VN"/>
         </w:rPr>
         <w:t xml:space="preserve">SCR-06 — Form yêu cầu đổi trả (Odoo)</w:t>
       </w:r>
-      <w:bookmarkEnd w:id="129"/>
+      <w:bookmarkEnd w:id="126"/>
     </w:p>
     <w:p>
       <w:pPr>
@@ -16339,18 +16848,18 @@
           <wp:inline>
             <wp:extent cx="5334000" cy="3355975"/>
             <wp:effectExtent b="0" l="0" r="0" t="0"/>
-            <wp:docPr descr="SCR-06 — Form yêu cầu đổi trả" title="" id="131" name="Picture"/>
+            <wp:docPr descr="SCR-06 — Form yêu cầu đổi trả" title="" id="128" name="Picture"/>
             <a:graphic>
               <a:graphicData uri="http://schemas.openxmlformats.org/drawingml/2006/picture">
                 <pic:pic>
                   <pic:nvPicPr>
-                    <pic:cNvPr descr="ui/png/SCR-06-form-yeu-cau-odoo.png" id="132" name="Picture"/>
+                    <pic:cNvPr descr="ui/png/SCR-06-form-yeu-cau-odoo.png" id="129" name="Picture"/>
                     <pic:cNvPicPr>
                       <a:picLocks noChangeArrowheads="1" noChangeAspect="1"/>
                     </pic:cNvPicPr>
                   </pic:nvPicPr>
                   <pic:blipFill>
-                    <a:blip r:embed="rId130"/>
+                    <a:blip r:embed="rId127"/>
                     <a:stretch>
                       <a:fillRect/>
                     </a:stretch>
@@ -16397,18 +16906,18 @@
           <wp:inline>
             <wp:extent cx="5334000" cy="3359679"/>
             <wp:effectExtent b="0" l="0" r="0" t="0"/>
-            <wp:docPr descr="SCR-06 — Trạng thái: Từ chối – lỗi thiếu lý do" title="" id="134" name="Picture"/>
+            <wp:docPr descr="SCR-06 — Trạng thái: Từ chối – lỗi thiếu lý do" title="" id="131" name="Picture"/>
             <a:graphic>
               <a:graphicData uri="http://schemas.openxmlformats.org/drawingml/2006/picture">
                 <pic:pic>
                   <pic:nvPicPr>
-                    <pic:cNvPr descr="ui/png/SCR-06-form-yeu-cau-odoo--reject-error.png" id="135" name="Picture"/>
+                    <pic:cNvPr descr="ui/png/SCR-06-form-yeu-cau-odoo--reject-error.png" id="132" name="Picture"/>
                     <pic:cNvPicPr>
                       <a:picLocks noChangeArrowheads="1" noChangeAspect="1"/>
                     </pic:cNvPicPr>
                   </pic:nvPicPr>
                   <pic:blipFill>
-                    <a:blip r:embed="rId133"/>
+                    <a:blip r:embed="rId130"/>
                     <a:stretch>
                       <a:fillRect/>
                     </a:stretch>
@@ -16455,18 +16964,18 @@
           <wp:inline>
             <wp:extent cx="5334000" cy="3430058"/>
             <wp:effectExtent b="0" l="0" r="0" t="0"/>
-            <wp:docPr descr="SCR-06 — Trạng thái: Đã duyệt" title="" id="137" name="Picture"/>
+            <wp:docPr descr="SCR-06 — Trạng thái: Đã duyệt" title="" id="134" name="Picture"/>
             <a:graphic>
               <a:graphicData uri="http://schemas.openxmlformats.org/drawingml/2006/picture">
                 <pic:pic>
                   <pic:nvPicPr>
-                    <pic:cNvPr descr="ui/png/SCR-06-form-yeu-cau-odoo--approved.png" id="138" name="Picture"/>
+                    <pic:cNvPr descr="ui/png/SCR-06-form-yeu-cau-odoo--approved.png" id="135" name="Picture"/>
                     <pic:cNvPicPr>
                       <a:picLocks noChangeArrowheads="1" noChangeAspect="1"/>
                     </pic:cNvPicPr>
                   </pic:nvPicPr>
                   <pic:blipFill>
-                    <a:blip r:embed="rId136"/>
+                    <a:blip r:embed="rId133"/>
                     <a:stretch>
                       <a:fillRect/>
                     </a:stretch>
@@ -16508,14 +17017,14 @@
       <w:pPr>
         <w:pStyle w:val="Heading4"/>
       </w:pPr>
-      <w:bookmarkStart w:id="139" w:name="_89a4381ea50249810ac71bb105c7dd217a412e7"/>
+      <w:bookmarkStart w:id="136" w:name="_89a4381ea50249810ac71bb105c7dd217a412e7"/>
       <w:r>
         <w:rPr>
           <w:lang w:val="vi-VN"/>
         </w:rPr>
         <w:t xml:space="preserve">SCR-07 — Nhận hàng &amp; kiểm tra (Odoo)</w:t>
       </w:r>
-      <w:bookmarkEnd w:id="139"/>
+      <w:bookmarkEnd w:id="136"/>
     </w:p>
     <w:p>
       <w:pPr>
@@ -16537,18 +17046,18 @@
           <wp:inline>
             <wp:extent cx="5334000" cy="3496733"/>
             <wp:effectExtent b="0" l="0" r="0" t="0"/>
-            <wp:docPr descr="SCR-07 — Nhận hàng &amp; kiểm tra" title="" id="141" name="Picture"/>
+            <wp:docPr descr="SCR-07 — Nhận hàng &amp; kiểm tra" title="" id="138" name="Picture"/>
             <a:graphic>
               <a:graphicData uri="http://schemas.openxmlformats.org/drawingml/2006/picture">
                 <pic:pic>
                   <pic:nvPicPr>
-                    <pic:cNvPr descr="ui/png/SCR-07-nhan-hang-kiem-tra.png" id="142" name="Picture"/>
+                    <pic:cNvPr descr="ui/png/SCR-07-nhan-hang-kiem-tra.png" id="139" name="Picture"/>
                     <pic:cNvPicPr>
                       <a:picLocks noChangeArrowheads="1" noChangeAspect="1"/>
                     </pic:cNvPicPr>
                   </pic:nvPicPr>
                   <pic:blipFill>
-                    <a:blip r:embed="rId140"/>
+                    <a:blip r:embed="rId137"/>
                     <a:stretch>
                       <a:fillRect/>
                     </a:stretch>
@@ -16595,18 +17104,18 @@
           <wp:inline>
             <wp:extent cx="5334000" cy="3148541"/>
             <wp:effectExtent b="0" l="0" r="0" t="0"/>
-            <wp:docPr descr="SCR-07 — Trạng thái: Lỗi (mã không hợp lệ / thiếu tình trạng)" title="" id="144" name="Picture"/>
+            <wp:docPr descr="SCR-07 — Trạng thái: Lỗi (mã không hợp lệ / thiếu tình trạng)" title="" id="141" name="Picture"/>
             <a:graphic>
               <a:graphicData uri="http://schemas.openxmlformats.org/drawingml/2006/picture">
                 <pic:pic>
                   <pic:nvPicPr>
-                    <pic:cNvPr descr="ui/png/SCR-07-nhan-hang-kiem-tra--error.png" id="145" name="Picture"/>
+                    <pic:cNvPr descr="ui/png/SCR-07-nhan-hang-kiem-tra--error.png" id="142" name="Picture"/>
                     <pic:cNvPicPr>
                       <a:picLocks noChangeArrowheads="1" noChangeAspect="1"/>
                     </pic:cNvPicPr>
                   </pic:nvPicPr>
                   <pic:blipFill>
-                    <a:blip r:embed="rId143"/>
+                    <a:blip r:embed="rId140"/>
                     <a:stretch>
                       <a:fillRect/>
                     </a:stretch>
@@ -16648,14 +17157,14 @@
       <w:pPr>
         <w:pStyle w:val="Heading4"/>
       </w:pPr>
-      <w:bookmarkStart w:id="146" w:name="_faf1187956de3db4a680bc95acccc38ec48babe"/>
+      <w:bookmarkStart w:id="143" w:name="_faf1187956de3db4a680bc95acccc38ec48babe"/>
       <w:r>
         <w:rPr>
           <w:lang w:val="vi-VN"/>
         </w:rPr>
         <w:t xml:space="preserve">SCR-08 — Báo cáo đổi trả theo lý do (Odoo)</w:t>
       </w:r>
-      <w:bookmarkEnd w:id="146"/>
+      <w:bookmarkEnd w:id="143"/>
     </w:p>
     <w:p>
       <w:pPr>
@@ -16677,18 +17186,18 @@
           <wp:inline>
             <wp:extent cx="5334000" cy="3415241"/>
             <wp:effectExtent b="0" l="0" r="0" t="0"/>
-            <wp:docPr descr="SCR-08 — Báo cáo đổi trả theo lý do" title="" id="148" name="Picture"/>
+            <wp:docPr descr="SCR-08 — Báo cáo đổi trả theo lý do" title="" id="145" name="Picture"/>
             <a:graphic>
               <a:graphicData uri="http://schemas.openxmlformats.org/drawingml/2006/picture">
                 <pic:pic>
                   <pic:nvPicPr>
-                    <pic:cNvPr descr="ui/png/SCR-08-bao-cao-doi-tra.png" id="149" name="Picture"/>
+                    <pic:cNvPr descr="ui/png/SCR-08-bao-cao-doi-tra.png" id="146" name="Picture"/>
                     <pic:cNvPicPr>
                       <a:picLocks noChangeArrowheads="1" noChangeAspect="1"/>
                     </pic:cNvPicPr>
                   </pic:nvPicPr>
                   <pic:blipFill>
-                    <a:blip r:embed="rId147"/>
+                    <a:blip r:embed="rId144"/>
                     <a:stretch>
                       <a:fillRect/>
                     </a:stretch>
@@ -16730,14 +17239,14 @@
       <w:pPr>
         <w:pStyle w:val="Heading2"/>
       </w:pPr>
-      <w:bookmarkStart w:id="150" w:name="_0d0f0250303c791bed9833b1f82066d3a36bff0"/>
+      <w:bookmarkStart w:id="147" w:name="_0d0f0250303c791bed9833b1f82066d3a36bff0"/>
       <w:r>
         <w:rPr>
           <w:lang w:val="vi-VN"/>
         </w:rPr>
         <w:t xml:space="preserve">7. User flow</w:t>
       </w:r>
-      <w:bookmarkEnd w:id="150"/>
+      <w:bookmarkEnd w:id="147"/>
     </w:p>
     <w:p>
       <w:pPr>
@@ -16752,60 +17261,1171 @@
     </w:p>
     <w:p>
       <w:pPr>
-        <w:pStyle w:val="CaptionedFigure"/>
-      </w:pPr>
-      <w:r>
-        <w:drawing>
-          <wp:inline>
-            <wp:extent cx="1668909" cy="7919999"/>
-            <wp:effectExtent b="0" l="0" r="0" t="0"/>
-            <wp:docPr descr="Sơ đồ 2 — 7. User flow" title="" id="152" name="Picture"/>
-            <a:graphic>
-              <a:graphicData uri="http://schemas.openxmlformats.org/drawingml/2006/picture">
-                <pic:pic>
-                  <pic:nvPicPr>
-                    <pic:cNvPr descr="ui/diagrams/srs-02.png" id="153" name="Picture"/>
-                    <pic:cNvPicPr>
-                      <a:picLocks noChangeArrowheads="1" noChangeAspect="1"/>
-                    </pic:cNvPicPr>
-                  </pic:nvPicPr>
-                  <pic:blipFill>
-                    <a:blip r:embed="rId151"/>
-                    <a:stretch>
-                      <a:fillRect/>
-                    </a:stretch>
-                  </pic:blipFill>
-                  <pic:spPr bwMode="auto">
-                    <a:xfrm>
-                      <a:off x="0" y="0"/>
-                      <a:ext cx="1668909" cy="7919999"/>
-                    </a:xfrm>
-                    <a:prstGeom prst="rect">
-                      <a:avLst/>
-                    </a:prstGeom>
-                    <a:noFill/>
-                    <a:ln w="9525">
-                      <a:noFill/>
-                      <a:headEnd/>
-                      <a:tailEnd/>
-                    </a:ln>
-                  </pic:spPr>
-                </pic:pic>
-              </a:graphicData>
-            </a:graphic>
-          </wp:inline>
-        </w:drawing>
-      </w:r>
-    </w:p>
-    <w:p>
-      <w:pPr>
-        <w:pStyle w:val="ImageCaption"/>
-      </w:pPr>
-      <w:r>
-        <w:rPr>
-          <w:lang w:val="vi-VN"/>
-        </w:rPr>
-        <w:t xml:space="preserve">Sơ đồ 2 — 7. User flow</w:t>
+        <w:pStyle w:val="SourceCode"/>
+      </w:pPr>
+      <w:r>
+        <w:rPr>
+          <w:rStyle w:val="KeywordTok"/>
+        </w:rPr>
+        <w:t xml:space="preserve">flowchart</w:t>
+      </w:r>
+      <w:r>
+        <w:rPr>
+          <w:rStyle w:val="NormalTok"/>
+        </w:rPr>
+        <w:t xml:space="preserve"> </w:t>
+      </w:r>
+      <w:r>
+        <w:rPr>
+          <w:rStyle w:val="ConstantTok"/>
+        </w:rPr>
+        <w:t xml:space="preserve">TD</w:t>
+      </w:r>
+      <w:r>
+        <w:br/>
+      </w:r>
+      <w:r>
+        <w:rPr>
+          <w:rStyle w:val="NormalTok"/>
+        </w:rPr>
+        <w:t xml:space="preserve">  </w:t>
+      </w:r>
+      <w:r>
+        <w:rPr>
+          <w:rStyle w:val="DataTypeTok"/>
+        </w:rPr>
+        <w:t xml:space="preserve">A</w:t>
+      </w:r>
+      <w:r>
+        <w:rPr>
+          <w:rStyle w:val="NormalTok"/>
+        </w:rPr>
+        <w:t xml:space="preserve">[</w:t>
+      </w:r>
+      <w:r>
+        <w:rPr>
+          <w:rStyle w:val="VerbatimStringTok"/>
+        </w:rPr>
+        <w:t xml:space="preserve">SCR-01 Đơn hàng của tôi</w:t>
+      </w:r>
+      <w:r>
+        <w:rPr>
+          <w:rStyle w:val="NormalTok"/>
+        </w:rPr>
+        <w:t xml:space="preserve">] </w:t>
+      </w:r>
+      <w:r>
+        <w:rPr>
+          <w:rStyle w:val="PreprocessorTok"/>
+        </w:rPr>
+        <w:t xml:space="preserve">--&gt;</w:t>
+      </w:r>
+      <w:r>
+        <w:rPr>
+          <w:rStyle w:val="NormalTok"/>
+        </w:rPr>
+        <w:t xml:space="preserve"> </w:t>
+      </w:r>
+      <w:r>
+        <w:rPr>
+          <w:rStyle w:val="DataTypeTok"/>
+        </w:rPr>
+        <w:t xml:space="preserve">B</w:t>
+      </w:r>
+      <w:r>
+        <w:rPr>
+          <w:rStyle w:val="NormalTok"/>
+        </w:rPr>
+        <w:t xml:space="preserve">{</w:t>
+      </w:r>
+      <w:r>
+        <w:rPr>
+          <w:rStyle w:val="VerbatimStringTok"/>
+        </w:rPr>
+        <w:t xml:space="preserve">Đơn đủ điều kiện?</w:t>
+      </w:r>
+      <w:r>
+        <w:rPr>
+          <w:rStyle w:val="NormalTok"/>
+        </w:rPr>
+        <w:t xml:space="preserve">}</w:t>
+      </w:r>
+      <w:r>
+        <w:br/>
+      </w:r>
+      <w:r>
+        <w:rPr>
+          <w:rStyle w:val="NormalTok"/>
+        </w:rPr>
+        <w:t xml:space="preserve">  </w:t>
+      </w:r>
+      <w:r>
+        <w:rPr>
+          <w:rStyle w:val="DataTypeTok"/>
+        </w:rPr>
+        <w:t xml:space="preserve">B</w:t>
+      </w:r>
+      <w:r>
+        <w:rPr>
+          <w:rStyle w:val="NormalTok"/>
+        </w:rPr>
+        <w:t xml:space="preserve"> </w:t>
+      </w:r>
+      <w:r>
+        <w:rPr>
+          <w:rStyle w:val="PreprocessorTok"/>
+        </w:rPr>
+        <w:t xml:space="preserve">--</w:t>
+      </w:r>
+      <w:r>
+        <w:rPr>
+          <w:rStyle w:val="NormalTok"/>
+        </w:rPr>
+        <w:t xml:space="preserve"> </w:t>
+      </w:r>
+      <w:r>
+        <w:rPr>
+          <w:rStyle w:val="VerbatimStringTok"/>
+        </w:rPr>
+        <w:t xml:space="preserve">Không </w:t>
+      </w:r>
+      <w:r>
+        <w:rPr>
+          <w:rStyle w:val="PreprocessorTok"/>
+        </w:rPr>
+        <w:t xml:space="preserve">--&gt;</w:t>
+      </w:r>
+      <w:r>
+        <w:rPr>
+          <w:rStyle w:val="NormalTok"/>
+        </w:rPr>
+        <w:t xml:space="preserve"> </w:t>
+      </w:r>
+      <w:r>
+        <w:rPr>
+          <w:rStyle w:val="DataTypeTok"/>
+        </w:rPr>
+        <w:t xml:space="preserve">B1</w:t>
+      </w:r>
+      <w:r>
+        <w:rPr>
+          <w:rStyle w:val="NormalTok"/>
+        </w:rPr>
+        <w:t xml:space="preserve">[</w:t>
+      </w:r>
+      <w:r>
+        <w:rPr>
+          <w:rStyle w:val="VerbatimStringTok"/>
+        </w:rPr>
+        <w:t xml:space="preserve">Ẩn nút, hiện lý do</w:t>
+      </w:r>
+      <w:r>
+        <w:rPr>
+          <w:rStyle w:val="NormalTok"/>
+        </w:rPr>
+        <w:t xml:space="preserve">]</w:t>
+      </w:r>
+      <w:r>
+        <w:br/>
+      </w:r>
+      <w:r>
+        <w:rPr>
+          <w:rStyle w:val="NormalTok"/>
+        </w:rPr>
+        <w:t xml:space="preserve">  </w:t>
+      </w:r>
+      <w:r>
+        <w:rPr>
+          <w:rStyle w:val="DataTypeTok"/>
+        </w:rPr>
+        <w:t xml:space="preserve">B</w:t>
+      </w:r>
+      <w:r>
+        <w:rPr>
+          <w:rStyle w:val="NormalTok"/>
+        </w:rPr>
+        <w:t xml:space="preserve"> </w:t>
+      </w:r>
+      <w:r>
+        <w:rPr>
+          <w:rStyle w:val="PreprocessorTok"/>
+        </w:rPr>
+        <w:t xml:space="preserve">--</w:t>
+      </w:r>
+      <w:r>
+        <w:rPr>
+          <w:rStyle w:val="NormalTok"/>
+        </w:rPr>
+        <w:t xml:space="preserve"> </w:t>
+      </w:r>
+      <w:r>
+        <w:rPr>
+          <w:rStyle w:val="VerbatimStringTok"/>
+        </w:rPr>
+        <w:t xml:space="preserve">Có </w:t>
+      </w:r>
+      <w:r>
+        <w:rPr>
+          <w:rStyle w:val="PreprocessorTok"/>
+        </w:rPr>
+        <w:t xml:space="preserve">--&gt;</w:t>
+      </w:r>
+      <w:r>
+        <w:rPr>
+          <w:rStyle w:val="NormalTok"/>
+        </w:rPr>
+        <w:t xml:space="preserve"> </w:t>
+      </w:r>
+      <w:r>
+        <w:rPr>
+          <w:rStyle w:val="DataTypeTok"/>
+        </w:rPr>
+        <w:t xml:space="preserve">C</w:t>
+      </w:r>
+      <w:r>
+        <w:rPr>
+          <w:rStyle w:val="NormalTok"/>
+        </w:rPr>
+        <w:t xml:space="preserve">[</w:t>
+      </w:r>
+      <w:r>
+        <w:rPr>
+          <w:rStyle w:val="VerbatimStringTok"/>
+        </w:rPr>
+        <w:t xml:space="preserve">SCR-02 Tạo yêu cầu</w:t>
+      </w:r>
+      <w:r>
+        <w:rPr>
+          <w:rStyle w:val="NormalTok"/>
+        </w:rPr>
+        <w:t xml:space="preserve">]</w:t>
+      </w:r>
+      <w:r>
+        <w:br/>
+      </w:r>
+      <w:r>
+        <w:rPr>
+          <w:rStyle w:val="NormalTok"/>
+        </w:rPr>
+        <w:t xml:space="preserve">  </w:t>
+      </w:r>
+      <w:r>
+        <w:rPr>
+          <w:rStyle w:val="DataTypeTok"/>
+        </w:rPr>
+        <w:t xml:space="preserve">C</w:t>
+      </w:r>
+      <w:r>
+        <w:rPr>
+          <w:rStyle w:val="NormalTok"/>
+        </w:rPr>
+        <w:t xml:space="preserve"> </w:t>
+      </w:r>
+      <w:r>
+        <w:rPr>
+          <w:rStyle w:val="PreprocessorTok"/>
+        </w:rPr>
+        <w:t xml:space="preserve">--&gt;</w:t>
+      </w:r>
+      <w:r>
+        <w:rPr>
+          <w:rStyle w:val="NormalTok"/>
+        </w:rPr>
+        <w:t xml:space="preserve"> </w:t>
+      </w:r>
+      <w:r>
+        <w:rPr>
+          <w:rStyle w:val="DataTypeTok"/>
+        </w:rPr>
+        <w:t xml:space="preserve">D</w:t>
+      </w:r>
+      <w:r>
+        <w:rPr>
+          <w:rStyle w:val="NormalTok"/>
+        </w:rPr>
+        <w:t xml:space="preserve">{</w:t>
+      </w:r>
+      <w:r>
+        <w:rPr>
+          <w:rStyle w:val="VerbatimStringTok"/>
+        </w:rPr>
+        <w:t xml:space="preserve">Hợp lệ?</w:t>
+      </w:r>
+      <w:r>
+        <w:rPr>
+          <w:rStyle w:val="NormalTok"/>
+        </w:rPr>
+        <w:t xml:space="preserve">}</w:t>
+      </w:r>
+      <w:r>
+        <w:br/>
+      </w:r>
+      <w:r>
+        <w:rPr>
+          <w:rStyle w:val="NormalTok"/>
+        </w:rPr>
+        <w:t xml:space="preserve">  </w:t>
+      </w:r>
+      <w:r>
+        <w:rPr>
+          <w:rStyle w:val="DataTypeTok"/>
+        </w:rPr>
+        <w:t xml:space="preserve">D</w:t>
+      </w:r>
+      <w:r>
+        <w:rPr>
+          <w:rStyle w:val="NormalTok"/>
+        </w:rPr>
+        <w:t xml:space="preserve"> </w:t>
+      </w:r>
+      <w:r>
+        <w:rPr>
+          <w:rStyle w:val="PreprocessorTok"/>
+        </w:rPr>
+        <w:t xml:space="preserve">--</w:t>
+      </w:r>
+      <w:r>
+        <w:rPr>
+          <w:rStyle w:val="NormalTok"/>
+        </w:rPr>
+        <w:t xml:space="preserve"> </w:t>
+      </w:r>
+      <w:r>
+        <w:rPr>
+          <w:rStyle w:val="VerbatimStringTok"/>
+        </w:rPr>
+        <w:t xml:space="preserve">Không </w:t>
+      </w:r>
+      <w:r>
+        <w:rPr>
+          <w:rStyle w:val="PreprocessorTok"/>
+        </w:rPr>
+        <w:t xml:space="preserve">--&gt;</w:t>
+      </w:r>
+      <w:r>
+        <w:rPr>
+          <w:rStyle w:val="NormalTok"/>
+        </w:rPr>
+        <w:t xml:space="preserve"> </w:t>
+      </w:r>
+      <w:r>
+        <w:rPr>
+          <w:rStyle w:val="DataTypeTok"/>
+        </w:rPr>
+        <w:t xml:space="preserve">C</w:t>
+      </w:r>
+      <w:r>
+        <w:br/>
+      </w:r>
+      <w:r>
+        <w:rPr>
+          <w:rStyle w:val="NormalTok"/>
+        </w:rPr>
+        <w:t xml:space="preserve">  </w:t>
+      </w:r>
+      <w:r>
+        <w:rPr>
+          <w:rStyle w:val="DataTypeTok"/>
+        </w:rPr>
+        <w:t xml:space="preserve">D</w:t>
+      </w:r>
+      <w:r>
+        <w:rPr>
+          <w:rStyle w:val="NormalTok"/>
+        </w:rPr>
+        <w:t xml:space="preserve"> </w:t>
+      </w:r>
+      <w:r>
+        <w:rPr>
+          <w:rStyle w:val="PreprocessorTok"/>
+        </w:rPr>
+        <w:t xml:space="preserve">--</w:t>
+      </w:r>
+      <w:r>
+        <w:rPr>
+          <w:rStyle w:val="NormalTok"/>
+        </w:rPr>
+        <w:t xml:space="preserve"> </w:t>
+      </w:r>
+      <w:r>
+        <w:rPr>
+          <w:rStyle w:val="VerbatimStringTok"/>
+        </w:rPr>
+        <w:t xml:space="preserve">Có </w:t>
+      </w:r>
+      <w:r>
+        <w:rPr>
+          <w:rStyle w:val="PreprocessorTok"/>
+        </w:rPr>
+        <w:t xml:space="preserve">--&gt;</w:t>
+      </w:r>
+      <w:r>
+        <w:rPr>
+          <w:rStyle w:val="NormalTok"/>
+        </w:rPr>
+        <w:t xml:space="preserve"> </w:t>
+      </w:r>
+      <w:r>
+        <w:rPr>
+          <w:rStyle w:val="DataTypeTok"/>
+        </w:rPr>
+        <w:t xml:space="preserve">E</w:t>
+      </w:r>
+      <w:r>
+        <w:rPr>
+          <w:rStyle w:val="NormalTok"/>
+        </w:rPr>
+        <w:t xml:space="preserve">[</w:t>
+      </w:r>
+      <w:r>
+        <w:rPr>
+          <w:rStyle w:val="VerbatimStringTok"/>
+        </w:rPr>
+        <w:t xml:space="preserve">Yêu cầu Mới, đồng bộ Odoo</w:t>
+      </w:r>
+      <w:r>
+        <w:rPr>
+          <w:rStyle w:val="NormalTok"/>
+        </w:rPr>
+        <w:t xml:space="preserve">]</w:t>
+      </w:r>
+      <w:r>
+        <w:br/>
+      </w:r>
+      <w:r>
+        <w:rPr>
+          <w:rStyle w:val="NormalTok"/>
+        </w:rPr>
+        <w:t xml:space="preserve">  </w:t>
+      </w:r>
+      <w:r>
+        <w:rPr>
+          <w:rStyle w:val="DataTypeTok"/>
+        </w:rPr>
+        <w:t xml:space="preserve">E</w:t>
+      </w:r>
+      <w:r>
+        <w:rPr>
+          <w:rStyle w:val="NormalTok"/>
+        </w:rPr>
+        <w:t xml:space="preserve"> </w:t>
+      </w:r>
+      <w:r>
+        <w:rPr>
+          <w:rStyle w:val="PreprocessorTok"/>
+        </w:rPr>
+        <w:t xml:space="preserve">--&gt;</w:t>
+      </w:r>
+      <w:r>
+        <w:rPr>
+          <w:rStyle w:val="NormalTok"/>
+        </w:rPr>
+        <w:t xml:space="preserve"> </w:t>
+      </w:r>
+      <w:r>
+        <w:rPr>
+          <w:rStyle w:val="DataTypeTok"/>
+        </w:rPr>
+        <w:t xml:space="preserve">F</w:t>
+      </w:r>
+      <w:r>
+        <w:rPr>
+          <w:rStyle w:val="NormalTok"/>
+        </w:rPr>
+        <w:t xml:space="preserve">[</w:t>
+      </w:r>
+      <w:r>
+        <w:rPr>
+          <w:rStyle w:val="VerbatimStringTok"/>
+        </w:rPr>
+        <w:t xml:space="preserve">SCR-05 CSKH thấy Chờ duyệt</w:t>
+      </w:r>
+      <w:r>
+        <w:rPr>
+          <w:rStyle w:val="NormalTok"/>
+        </w:rPr>
+        <w:t xml:space="preserve">]</w:t>
+      </w:r>
+      <w:r>
+        <w:br/>
+      </w:r>
+      <w:r>
+        <w:rPr>
+          <w:rStyle w:val="NormalTok"/>
+        </w:rPr>
+        <w:t xml:space="preserve">  </w:t>
+      </w:r>
+      <w:r>
+        <w:rPr>
+          <w:rStyle w:val="DataTypeTok"/>
+        </w:rPr>
+        <w:t xml:space="preserve">F</w:t>
+      </w:r>
+      <w:r>
+        <w:rPr>
+          <w:rStyle w:val="NormalTok"/>
+        </w:rPr>
+        <w:t xml:space="preserve"> </w:t>
+      </w:r>
+      <w:r>
+        <w:rPr>
+          <w:rStyle w:val="PreprocessorTok"/>
+        </w:rPr>
+        <w:t xml:space="preserve">--&gt;</w:t>
+      </w:r>
+      <w:r>
+        <w:rPr>
+          <w:rStyle w:val="NormalTok"/>
+        </w:rPr>
+        <w:t xml:space="preserve"> </w:t>
+      </w:r>
+      <w:r>
+        <w:rPr>
+          <w:rStyle w:val="DataTypeTok"/>
+        </w:rPr>
+        <w:t xml:space="preserve">G</w:t>
+      </w:r>
+      <w:r>
+        <w:rPr>
+          <w:rStyle w:val="NormalTok"/>
+        </w:rPr>
+        <w:t xml:space="preserve">[</w:t>
+      </w:r>
+      <w:r>
+        <w:rPr>
+          <w:rStyle w:val="VerbatimStringTok"/>
+        </w:rPr>
+        <w:t xml:space="preserve">SCR-06 Form yêu cầu</w:t>
+      </w:r>
+      <w:r>
+        <w:rPr>
+          <w:rStyle w:val="NormalTok"/>
+        </w:rPr>
+        <w:t xml:space="preserve">]</w:t>
+      </w:r>
+      <w:r>
+        <w:br/>
+      </w:r>
+      <w:r>
+        <w:rPr>
+          <w:rStyle w:val="NormalTok"/>
+        </w:rPr>
+        <w:t xml:space="preserve">  </w:t>
+      </w:r>
+      <w:r>
+        <w:rPr>
+          <w:rStyle w:val="DataTypeTok"/>
+        </w:rPr>
+        <w:t xml:space="preserve">G</w:t>
+      </w:r>
+      <w:r>
+        <w:rPr>
+          <w:rStyle w:val="NormalTok"/>
+        </w:rPr>
+        <w:t xml:space="preserve"> </w:t>
+      </w:r>
+      <w:r>
+        <w:rPr>
+          <w:rStyle w:val="PreprocessorTok"/>
+        </w:rPr>
+        <w:t xml:space="preserve">--&gt;</w:t>
+      </w:r>
+      <w:r>
+        <w:rPr>
+          <w:rStyle w:val="NormalTok"/>
+        </w:rPr>
+        <w:t xml:space="preserve"> </w:t>
+      </w:r>
+      <w:r>
+        <w:rPr>
+          <w:rStyle w:val="DataTypeTok"/>
+        </w:rPr>
+        <w:t xml:space="preserve">H</w:t>
+      </w:r>
+      <w:r>
+        <w:rPr>
+          <w:rStyle w:val="NormalTok"/>
+        </w:rPr>
+        <w:t xml:space="preserve">{</w:t>
+      </w:r>
+      <w:r>
+        <w:rPr>
+          <w:rStyle w:val="VerbatimStringTok"/>
+        </w:rPr>
+        <w:t xml:space="preserve">CSKH quyết định</w:t>
+      </w:r>
+      <w:r>
+        <w:rPr>
+          <w:rStyle w:val="NormalTok"/>
+        </w:rPr>
+        <w:t xml:space="preserve">}</w:t>
+      </w:r>
+      <w:r>
+        <w:br/>
+      </w:r>
+      <w:r>
+        <w:rPr>
+          <w:rStyle w:val="NormalTok"/>
+        </w:rPr>
+        <w:t xml:space="preserve">  </w:t>
+      </w:r>
+      <w:r>
+        <w:rPr>
+          <w:rStyle w:val="DataTypeTok"/>
+        </w:rPr>
+        <w:t xml:space="preserve">H</w:t>
+      </w:r>
+      <w:r>
+        <w:rPr>
+          <w:rStyle w:val="NormalTok"/>
+        </w:rPr>
+        <w:t xml:space="preserve"> </w:t>
+      </w:r>
+      <w:r>
+        <w:rPr>
+          <w:rStyle w:val="PreprocessorTok"/>
+        </w:rPr>
+        <w:t xml:space="preserve">--</w:t>
+      </w:r>
+      <w:r>
+        <w:rPr>
+          <w:rStyle w:val="NormalTok"/>
+        </w:rPr>
+        <w:t xml:space="preserve"> </w:t>
+      </w:r>
+      <w:r>
+        <w:rPr>
+          <w:rStyle w:val="VerbatimStringTok"/>
+        </w:rPr>
+        <w:t xml:space="preserve">Duyệt </w:t>
+      </w:r>
+      <w:r>
+        <w:rPr>
+          <w:rStyle w:val="PreprocessorTok"/>
+        </w:rPr>
+        <w:t xml:space="preserve">--&gt;</w:t>
+      </w:r>
+      <w:r>
+        <w:rPr>
+          <w:rStyle w:val="NormalTok"/>
+        </w:rPr>
+        <w:t xml:space="preserve"> </w:t>
+      </w:r>
+      <w:r>
+        <w:rPr>
+          <w:rStyle w:val="DataTypeTok"/>
+        </w:rPr>
+        <w:t xml:space="preserve">I</w:t>
+      </w:r>
+      <w:r>
+        <w:rPr>
+          <w:rStyle w:val="NormalTok"/>
+        </w:rPr>
+        <w:t xml:space="preserve">[</w:t>
+      </w:r>
+      <w:r>
+        <w:rPr>
+          <w:rStyle w:val="VerbatimStringTok"/>
+        </w:rPr>
+        <w:t xml:space="preserve">Đã duyệt, email hướng dẫn</w:t>
+      </w:r>
+      <w:r>
+        <w:rPr>
+          <w:rStyle w:val="NormalTok"/>
+        </w:rPr>
+        <w:t xml:space="preserve">]</w:t>
+      </w:r>
+      <w:r>
+        <w:br/>
+      </w:r>
+      <w:r>
+        <w:rPr>
+          <w:rStyle w:val="NormalTok"/>
+        </w:rPr>
+        <w:t xml:space="preserve">  </w:t>
+      </w:r>
+      <w:r>
+        <w:rPr>
+          <w:rStyle w:val="DataTypeTok"/>
+        </w:rPr>
+        <w:t xml:space="preserve">H</w:t>
+      </w:r>
+      <w:r>
+        <w:rPr>
+          <w:rStyle w:val="NormalTok"/>
+        </w:rPr>
+        <w:t xml:space="preserve"> </w:t>
+      </w:r>
+      <w:r>
+        <w:rPr>
+          <w:rStyle w:val="PreprocessorTok"/>
+        </w:rPr>
+        <w:t xml:space="preserve">--</w:t>
+      </w:r>
+      <w:r>
+        <w:rPr>
+          <w:rStyle w:val="NormalTok"/>
+        </w:rPr>
+        <w:t xml:space="preserve"> </w:t>
+      </w:r>
+      <w:r>
+        <w:rPr>
+          <w:rStyle w:val="VerbatimStringTok"/>
+        </w:rPr>
+        <w:t xml:space="preserve">Từ chối </w:t>
+      </w:r>
+      <w:r>
+        <w:rPr>
+          <w:rStyle w:val="PreprocessorTok"/>
+        </w:rPr>
+        <w:t xml:space="preserve">--&gt;</w:t>
+      </w:r>
+      <w:r>
+        <w:rPr>
+          <w:rStyle w:val="NormalTok"/>
+        </w:rPr>
+        <w:t xml:space="preserve"> </w:t>
+      </w:r>
+      <w:r>
+        <w:rPr>
+          <w:rStyle w:val="DataTypeTok"/>
+        </w:rPr>
+        <w:t xml:space="preserve">R</w:t>
+      </w:r>
+      <w:r>
+        <w:rPr>
+          <w:rStyle w:val="NormalTok"/>
+        </w:rPr>
+        <w:t xml:space="preserve">[</w:t>
+      </w:r>
+      <w:r>
+        <w:rPr>
+          <w:rStyle w:val="VerbatimStringTok"/>
+        </w:rPr>
+        <w:t xml:space="preserve">Từ chối, email lý do</w:t>
+      </w:r>
+      <w:r>
+        <w:rPr>
+          <w:rStyle w:val="NormalTok"/>
+        </w:rPr>
+        <w:t xml:space="preserve">]</w:t>
+      </w:r>
+      <w:r>
+        <w:br/>
+      </w:r>
+      <w:r>
+        <w:rPr>
+          <w:rStyle w:val="NormalTok"/>
+        </w:rPr>
+        <w:t xml:space="preserve">  </w:t>
+      </w:r>
+      <w:r>
+        <w:rPr>
+          <w:rStyle w:val="DataTypeTok"/>
+        </w:rPr>
+        <w:t xml:space="preserve">I</w:t>
+      </w:r>
+      <w:r>
+        <w:rPr>
+          <w:rStyle w:val="NormalTok"/>
+        </w:rPr>
+        <w:t xml:space="preserve"> </w:t>
+      </w:r>
+      <w:r>
+        <w:rPr>
+          <w:rStyle w:val="PreprocessorTok"/>
+        </w:rPr>
+        <w:t xml:space="preserve">--&gt;</w:t>
+      </w:r>
+      <w:r>
+        <w:rPr>
+          <w:rStyle w:val="NormalTok"/>
+        </w:rPr>
+        <w:t xml:space="preserve"> </w:t>
+      </w:r>
+      <w:r>
+        <w:rPr>
+          <w:rStyle w:val="DataTypeTok"/>
+        </w:rPr>
+        <w:t xml:space="preserve">J</w:t>
+      </w:r>
+      <w:r>
+        <w:rPr>
+          <w:rStyle w:val="NormalTok"/>
+        </w:rPr>
+        <w:t xml:space="preserve">[</w:t>
+      </w:r>
+      <w:r>
+        <w:rPr>
+          <w:rStyle w:val="VerbatimStringTok"/>
+        </w:rPr>
+        <w:t xml:space="preserve">Khách gửi hàng</w:t>
+      </w:r>
+      <w:r>
+        <w:rPr>
+          <w:rStyle w:val="NormalTok"/>
+        </w:rPr>
+        <w:t xml:space="preserve">]</w:t>
+      </w:r>
+      <w:r>
+        <w:br/>
+      </w:r>
+      <w:r>
+        <w:rPr>
+          <w:rStyle w:val="NormalTok"/>
+        </w:rPr>
+        <w:t xml:space="preserve">  </w:t>
+      </w:r>
+      <w:r>
+        <w:rPr>
+          <w:rStyle w:val="DataTypeTok"/>
+        </w:rPr>
+        <w:t xml:space="preserve">J</w:t>
+      </w:r>
+      <w:r>
+        <w:rPr>
+          <w:rStyle w:val="NormalTok"/>
+        </w:rPr>
+        <w:t xml:space="preserve"> </w:t>
+      </w:r>
+      <w:r>
+        <w:rPr>
+          <w:rStyle w:val="PreprocessorTok"/>
+        </w:rPr>
+        <w:t xml:space="preserve">--&gt;</w:t>
+      </w:r>
+      <w:r>
+        <w:rPr>
+          <w:rStyle w:val="NormalTok"/>
+        </w:rPr>
+        <w:t xml:space="preserve"> </w:t>
+      </w:r>
+      <w:r>
+        <w:rPr>
+          <w:rStyle w:val="DataTypeTok"/>
+        </w:rPr>
+        <w:t xml:space="preserve">K</w:t>
+      </w:r>
+      <w:r>
+        <w:rPr>
+          <w:rStyle w:val="NormalTok"/>
+        </w:rPr>
+        <w:t xml:space="preserve">[</w:t>
+      </w:r>
+      <w:r>
+        <w:rPr>
+          <w:rStyle w:val="VerbatimStringTok"/>
+        </w:rPr>
+        <w:t xml:space="preserve">SCR-07 Kho quét mã, kiểm tra</w:t>
+      </w:r>
+      <w:r>
+        <w:rPr>
+          <w:rStyle w:val="NormalTok"/>
+        </w:rPr>
+        <w:t xml:space="preserve">]</w:t>
+      </w:r>
+      <w:r>
+        <w:br/>
+      </w:r>
+      <w:r>
+        <w:rPr>
+          <w:rStyle w:val="NormalTok"/>
+        </w:rPr>
+        <w:t xml:space="preserve">  </w:t>
+      </w:r>
+      <w:r>
+        <w:rPr>
+          <w:rStyle w:val="DataTypeTok"/>
+        </w:rPr>
+        <w:t xml:space="preserve">K</w:t>
+      </w:r>
+      <w:r>
+        <w:rPr>
+          <w:rStyle w:val="NormalTok"/>
+        </w:rPr>
+        <w:t xml:space="preserve"> </w:t>
+      </w:r>
+      <w:r>
+        <w:rPr>
+          <w:rStyle w:val="PreprocessorTok"/>
+        </w:rPr>
+        <w:t xml:space="preserve">--&gt;</w:t>
+      </w:r>
+      <w:r>
+        <w:rPr>
+          <w:rStyle w:val="NormalTok"/>
+        </w:rPr>
+        <w:t xml:space="preserve"> </w:t>
+      </w:r>
+      <w:r>
+        <w:rPr>
+          <w:rStyle w:val="DataTypeTok"/>
+        </w:rPr>
+        <w:t xml:space="preserve">L</w:t>
+      </w:r>
+      <w:r>
+        <w:rPr>
+          <w:rStyle w:val="NormalTok"/>
+        </w:rPr>
+        <w:t xml:space="preserve">{</w:t>
+      </w:r>
+      <w:r>
+        <w:rPr>
+          <w:rStyle w:val="VerbatimStringTok"/>
+        </w:rPr>
+        <w:t xml:space="preserve">Loại yêu cầu</w:t>
+      </w:r>
+      <w:r>
+        <w:rPr>
+          <w:rStyle w:val="NormalTok"/>
+        </w:rPr>
+        <w:t xml:space="preserve">}</w:t>
+      </w:r>
+      <w:r>
+        <w:br/>
+      </w:r>
+      <w:r>
+        <w:rPr>
+          <w:rStyle w:val="NormalTok"/>
+        </w:rPr>
+        <w:t xml:space="preserve">  </w:t>
+      </w:r>
+      <w:r>
+        <w:rPr>
+          <w:rStyle w:val="DataTypeTok"/>
+        </w:rPr>
+        <w:t xml:space="preserve">L</w:t>
+      </w:r>
+      <w:r>
+        <w:rPr>
+          <w:rStyle w:val="NormalTok"/>
+        </w:rPr>
+        <w:t xml:space="preserve"> </w:t>
+      </w:r>
+      <w:r>
+        <w:rPr>
+          <w:rStyle w:val="PreprocessorTok"/>
+        </w:rPr>
+        <w:t xml:space="preserve">--</w:t>
+      </w:r>
+      <w:r>
+        <w:rPr>
+          <w:rStyle w:val="NormalTok"/>
+        </w:rPr>
+        <w:t xml:space="preserve"> </w:t>
+      </w:r>
+      <w:r>
+        <w:rPr>
+          <w:rStyle w:val="VerbatimStringTok"/>
+        </w:rPr>
+        <w:t xml:space="preserve">Trả hàng </w:t>
+      </w:r>
+      <w:r>
+        <w:rPr>
+          <w:rStyle w:val="PreprocessorTok"/>
+        </w:rPr>
+        <w:t xml:space="preserve">--&gt;</w:t>
+      </w:r>
+      <w:r>
+        <w:rPr>
+          <w:rStyle w:val="NormalTok"/>
+        </w:rPr>
+        <w:t xml:space="preserve"> </w:t>
+      </w:r>
+      <w:r>
+        <w:rPr>
+          <w:rStyle w:val="DataTypeTok"/>
+        </w:rPr>
+        <w:t xml:space="preserve">M</w:t>
+      </w:r>
+      <w:r>
+        <w:rPr>
+          <w:rStyle w:val="NormalTok"/>
+        </w:rPr>
+        <w:t xml:space="preserve">[</w:t>
+      </w:r>
+      <w:r>
+        <w:rPr>
+          <w:rStyle w:val="VerbatimStringTok"/>
+        </w:rPr>
+        <w:t xml:space="preserve">Credit note, kế toán hoàn tiền</w:t>
+      </w:r>
+      <w:r>
+        <w:rPr>
+          <w:rStyle w:val="NormalTok"/>
+        </w:rPr>
+        <w:t xml:space="preserve">]</w:t>
+      </w:r>
+      <w:r>
+        <w:br/>
+      </w:r>
+      <w:r>
+        <w:rPr>
+          <w:rStyle w:val="NormalTok"/>
+        </w:rPr>
+        <w:t xml:space="preserve">  </w:t>
+      </w:r>
+      <w:r>
+        <w:rPr>
+          <w:rStyle w:val="DataTypeTok"/>
+        </w:rPr>
+        <w:t xml:space="preserve">L</w:t>
+      </w:r>
+      <w:r>
+        <w:rPr>
+          <w:rStyle w:val="NormalTok"/>
+        </w:rPr>
+        <w:t xml:space="preserve"> </w:t>
+      </w:r>
+      <w:r>
+        <w:rPr>
+          <w:rStyle w:val="PreprocessorTok"/>
+        </w:rPr>
+        <w:t xml:space="preserve">--</w:t>
+      </w:r>
+      <w:r>
+        <w:rPr>
+          <w:rStyle w:val="NormalTok"/>
+        </w:rPr>
+        <w:t xml:space="preserve"> </w:t>
+      </w:r>
+      <w:r>
+        <w:rPr>
+          <w:rStyle w:val="VerbatimStringTok"/>
+        </w:rPr>
+        <w:t xml:space="preserve">Đổi size </w:t>
+      </w:r>
+      <w:r>
+        <w:rPr>
+          <w:rStyle w:val="PreprocessorTok"/>
+        </w:rPr>
+        <w:t xml:space="preserve">--&gt;</w:t>
+      </w:r>
+      <w:r>
+        <w:rPr>
+          <w:rStyle w:val="NormalTok"/>
+        </w:rPr>
+        <w:t xml:space="preserve"> </w:t>
+      </w:r>
+      <w:r>
+        <w:rPr>
+          <w:rStyle w:val="DataTypeTok"/>
+        </w:rPr>
+        <w:t xml:space="preserve">N</w:t>
+      </w:r>
+      <w:r>
+        <w:rPr>
+          <w:rStyle w:val="NormalTok"/>
+        </w:rPr>
+        <w:t xml:space="preserve">[</w:t>
+      </w:r>
+      <w:r>
+        <w:rPr>
+          <w:rStyle w:val="VerbatimStringTok"/>
+        </w:rPr>
+        <w:t xml:space="preserve">Đơn đổi giá 0đ</w:t>
+      </w:r>
+      <w:r>
+        <w:rPr>
+          <w:rStyle w:val="NormalTok"/>
+        </w:rPr>
+        <w:t xml:space="preserve">]</w:t>
+      </w:r>
+      <w:r>
+        <w:br/>
+      </w:r>
+      <w:r>
+        <w:rPr>
+          <w:rStyle w:val="NormalTok"/>
+        </w:rPr>
+        <w:t xml:space="preserve">  </w:t>
+      </w:r>
+      <w:r>
+        <w:rPr>
+          <w:rStyle w:val="DataTypeTok"/>
+        </w:rPr>
+        <w:t xml:space="preserve">M</w:t>
+      </w:r>
+      <w:r>
+        <w:rPr>
+          <w:rStyle w:val="NormalTok"/>
+        </w:rPr>
+        <w:t xml:space="preserve"> </w:t>
+      </w:r>
+      <w:r>
+        <w:rPr>
+          <w:rStyle w:val="PreprocessorTok"/>
+        </w:rPr>
+        <w:t xml:space="preserve">--&gt;</w:t>
+      </w:r>
+      <w:r>
+        <w:rPr>
+          <w:rStyle w:val="NormalTok"/>
+        </w:rPr>
+        <w:t xml:space="preserve"> </w:t>
+      </w:r>
+      <w:r>
+        <w:rPr>
+          <w:rStyle w:val="DataTypeTok"/>
+        </w:rPr>
+        <w:t xml:space="preserve">O</w:t>
+      </w:r>
+      <w:r>
+        <w:rPr>
+          <w:rStyle w:val="NormalTok"/>
+        </w:rPr>
+        <w:t xml:space="preserve">[</w:t>
+      </w:r>
+      <w:r>
+        <w:rPr>
+          <w:rStyle w:val="VerbatimStringTok"/>
+        </w:rPr>
+        <w:t xml:space="preserve">Hoàn tất</w:t>
+      </w:r>
+      <w:r>
+        <w:rPr>
+          <w:rStyle w:val="NormalTok"/>
+        </w:rPr>
+        <w:t xml:space="preserve">]</w:t>
+      </w:r>
+      <w:r>
+        <w:br/>
+      </w:r>
+      <w:r>
+        <w:rPr>
+          <w:rStyle w:val="NormalTok"/>
+        </w:rPr>
+        <w:t xml:space="preserve">  </w:t>
+      </w:r>
+      <w:r>
+        <w:rPr>
+          <w:rStyle w:val="DataTypeTok"/>
+        </w:rPr>
+        <w:t xml:space="preserve">N</w:t>
+      </w:r>
+      <w:r>
+        <w:rPr>
+          <w:rStyle w:val="NormalTok"/>
+        </w:rPr>
+        <w:t xml:space="preserve"> </w:t>
+      </w:r>
+      <w:r>
+        <w:rPr>
+          <w:rStyle w:val="PreprocessorTok"/>
+        </w:rPr>
+        <w:t xml:space="preserve">--&gt;</w:t>
+      </w:r>
+      <w:r>
+        <w:rPr>
+          <w:rStyle w:val="NormalTok"/>
+        </w:rPr>
+        <w:t xml:space="preserve"> </w:t>
+      </w:r>
+      <w:r>
+        <w:rPr>
+          <w:rStyle w:val="DataTypeTok"/>
+        </w:rPr>
+        <w:t xml:space="preserve">O</w:t>
       </w:r>
     </w:p>
     <w:p>
@@ -16821,74 +18441,834 @@
     </w:p>
     <w:p>
       <w:pPr>
-        <w:pStyle w:val="CaptionedFigure"/>
-      </w:pPr>
-      <w:r>
-        <w:drawing>
-          <wp:inline>
-            <wp:extent cx="5334000" cy="6130017"/>
-            <wp:effectExtent b="0" l="0" r="0" t="0"/>
-            <wp:docPr descr="Sơ đồ 3 — 7. User flow" title="" id="155" name="Picture"/>
-            <a:graphic>
-              <a:graphicData uri="http://schemas.openxmlformats.org/drawingml/2006/picture">
-                <pic:pic>
-                  <pic:nvPicPr>
-                    <pic:cNvPr descr="ui/diagrams/srs-03.png" id="156" name="Picture"/>
-                    <pic:cNvPicPr>
-                      <a:picLocks noChangeArrowheads="1" noChangeAspect="1"/>
-                    </pic:cNvPicPr>
-                  </pic:nvPicPr>
-                  <pic:blipFill>
-                    <a:blip r:embed="rId154"/>
-                    <a:stretch>
-                      <a:fillRect/>
-                    </a:stretch>
-                  </pic:blipFill>
-                  <pic:spPr bwMode="auto">
-                    <a:xfrm>
-                      <a:off x="0" y="0"/>
-                      <a:ext cx="5334000" cy="6130017"/>
-                    </a:xfrm>
-                    <a:prstGeom prst="rect">
-                      <a:avLst/>
-                    </a:prstGeom>
-                    <a:noFill/>
-                    <a:ln w="9525">
-                      <a:noFill/>
-                      <a:headEnd/>
-                      <a:tailEnd/>
-                    </a:ln>
-                  </pic:spPr>
-                </pic:pic>
-              </a:graphicData>
-            </a:graphic>
-          </wp:inline>
-        </w:drawing>
-      </w:r>
-    </w:p>
-    <w:p>
-      <w:pPr>
-        <w:pStyle w:val="ImageCaption"/>
-      </w:pPr>
-      <w:r>
-        <w:rPr>
-          <w:lang w:val="vi-VN"/>
-        </w:rPr>
-        <w:t xml:space="preserve">Sơ đồ 3 — 7. User flow</w:t>
+        <w:pStyle w:val="SourceCode"/>
+      </w:pPr>
+      <w:r>
+        <w:rPr>
+          <w:rStyle w:val="KeywordTok"/>
+        </w:rPr>
+        <w:t xml:space="preserve">flowchart</w:t>
+      </w:r>
+      <w:r>
+        <w:rPr>
+          <w:rStyle w:val="NormalTok"/>
+        </w:rPr>
+        <w:t xml:space="preserve"> </w:t>
+      </w:r>
+      <w:r>
+        <w:rPr>
+          <w:rStyle w:val="ConstantTok"/>
+        </w:rPr>
+        <w:t xml:space="preserve">TD</w:t>
+      </w:r>
+      <w:r>
+        <w:br/>
+      </w:r>
+      <w:r>
+        <w:rPr>
+          <w:rStyle w:val="NormalTok"/>
+        </w:rPr>
+        <w:t xml:space="preserve">  </w:t>
+      </w:r>
+      <w:r>
+        <w:rPr>
+          <w:rStyle w:val="DataTypeTok"/>
+        </w:rPr>
+        <w:t xml:space="preserve">P</w:t>
+      </w:r>
+      <w:r>
+        <w:rPr>
+          <w:rStyle w:val="NormalTok"/>
+        </w:rPr>
+        <w:t xml:space="preserve">[</w:t>
+      </w:r>
+      <w:r>
+        <w:rPr>
+          <w:rStyle w:val="VerbatimStringTok"/>
+        </w:rPr>
+        <w:t xml:space="preserve">Yêu cầu Chờ duyệt</w:t>
+      </w:r>
+      <w:r>
+        <w:rPr>
+          <w:rStyle w:val="NormalTok"/>
+        </w:rPr>
+        <w:t xml:space="preserve">] </w:t>
+      </w:r>
+      <w:r>
+        <w:rPr>
+          <w:rStyle w:val="PreprocessorTok"/>
+        </w:rPr>
+        <w:t xml:space="preserve">--&gt;</w:t>
+      </w:r>
+      <w:r>
+        <w:rPr>
+          <w:rStyle w:val="NormalTok"/>
+        </w:rPr>
+        <w:t xml:space="preserve"> </w:t>
+      </w:r>
+      <w:r>
+        <w:rPr>
+          <w:rStyle w:val="DataTypeTok"/>
+        </w:rPr>
+        <w:t xml:space="preserve">Q</w:t>
+      </w:r>
+      <w:r>
+        <w:rPr>
+          <w:rStyle w:val="NormalTok"/>
+        </w:rPr>
+        <w:t xml:space="preserve">{</w:t>
+      </w:r>
+      <w:r>
+        <w:rPr>
+          <w:rStyle w:val="VerbatimStringTok"/>
+        </w:rPr>
+        <w:t xml:space="preserve">Khách huỷ ở SCR-04?</w:t>
+      </w:r>
+      <w:r>
+        <w:rPr>
+          <w:rStyle w:val="NormalTok"/>
+        </w:rPr>
+        <w:t xml:space="preserve">}</w:t>
+      </w:r>
+      <w:r>
+        <w:br/>
+      </w:r>
+      <w:r>
+        <w:rPr>
+          <w:rStyle w:val="NormalTok"/>
+        </w:rPr>
+        <w:t xml:space="preserve">  </w:t>
+      </w:r>
+      <w:r>
+        <w:rPr>
+          <w:rStyle w:val="DataTypeTok"/>
+        </w:rPr>
+        <w:t xml:space="preserve">Q</w:t>
+      </w:r>
+      <w:r>
+        <w:rPr>
+          <w:rStyle w:val="NormalTok"/>
+        </w:rPr>
+        <w:t xml:space="preserve"> </w:t>
+      </w:r>
+      <w:r>
+        <w:rPr>
+          <w:rStyle w:val="PreprocessorTok"/>
+        </w:rPr>
+        <w:t xml:space="preserve">--</w:t>
+      </w:r>
+      <w:r>
+        <w:rPr>
+          <w:rStyle w:val="NormalTok"/>
+        </w:rPr>
+        <w:t xml:space="preserve"> </w:t>
+      </w:r>
+      <w:r>
+        <w:rPr>
+          <w:rStyle w:val="VerbatimStringTok"/>
+        </w:rPr>
+        <w:t xml:space="preserve">Có </w:t>
+      </w:r>
+      <w:r>
+        <w:rPr>
+          <w:rStyle w:val="PreprocessorTok"/>
+        </w:rPr>
+        <w:t xml:space="preserve">--&gt;</w:t>
+      </w:r>
+      <w:r>
+        <w:rPr>
+          <w:rStyle w:val="NormalTok"/>
+        </w:rPr>
+        <w:t xml:space="preserve"> </w:t>
+      </w:r>
+      <w:r>
+        <w:rPr>
+          <w:rStyle w:val="DataTypeTok"/>
+        </w:rPr>
+        <w:t xml:space="preserve">Q1</w:t>
+      </w:r>
+      <w:r>
+        <w:rPr>
+          <w:rStyle w:val="NormalTok"/>
+        </w:rPr>
+        <w:t xml:space="preserve">{</w:t>
+      </w:r>
+      <w:r>
+        <w:rPr>
+          <w:rStyle w:val="VerbatimStringTok"/>
+        </w:rPr>
+        <w:t xml:space="preserve">Odoo đã duyệt chưa?</w:t>
+      </w:r>
+      <w:r>
+        <w:rPr>
+          <w:rStyle w:val="NormalTok"/>
+        </w:rPr>
+        <w:t xml:space="preserve">}</w:t>
+      </w:r>
+      <w:r>
+        <w:br/>
+      </w:r>
+      <w:r>
+        <w:rPr>
+          <w:rStyle w:val="NormalTok"/>
+        </w:rPr>
+        <w:t xml:space="preserve">  </w:t>
+      </w:r>
+      <w:r>
+        <w:rPr>
+          <w:rStyle w:val="DataTypeTok"/>
+        </w:rPr>
+        <w:t xml:space="preserve">Q1</w:t>
+      </w:r>
+      <w:r>
+        <w:rPr>
+          <w:rStyle w:val="NormalTok"/>
+        </w:rPr>
+        <w:t xml:space="preserve"> </w:t>
+      </w:r>
+      <w:r>
+        <w:rPr>
+          <w:rStyle w:val="PreprocessorTok"/>
+        </w:rPr>
+        <w:t xml:space="preserve">--</w:t>
+      </w:r>
+      <w:r>
+        <w:rPr>
+          <w:rStyle w:val="NormalTok"/>
+        </w:rPr>
+        <w:t xml:space="preserve"> </w:t>
+      </w:r>
+      <w:r>
+        <w:rPr>
+          <w:rStyle w:val="VerbatimStringTok"/>
+        </w:rPr>
+        <w:t xml:space="preserve">Chưa </w:t>
+      </w:r>
+      <w:r>
+        <w:rPr>
+          <w:rStyle w:val="PreprocessorTok"/>
+        </w:rPr>
+        <w:t xml:space="preserve">--&gt;</w:t>
+      </w:r>
+      <w:r>
+        <w:rPr>
+          <w:rStyle w:val="NormalTok"/>
+        </w:rPr>
+        <w:t xml:space="preserve"> </w:t>
+      </w:r>
+      <w:r>
+        <w:rPr>
+          <w:rStyle w:val="DataTypeTok"/>
+        </w:rPr>
+        <w:t xml:space="preserve">Q2</w:t>
+      </w:r>
+      <w:r>
+        <w:rPr>
+          <w:rStyle w:val="NormalTok"/>
+        </w:rPr>
+        <w:t xml:space="preserve">[</w:t>
+      </w:r>
+      <w:r>
+        <w:rPr>
+          <w:rStyle w:val="VerbatimStringTok"/>
+        </w:rPr>
+        <w:t xml:space="preserve">Đã huỷ, giải phóng số lượng</w:t>
+      </w:r>
+      <w:r>
+        <w:rPr>
+          <w:rStyle w:val="NormalTok"/>
+        </w:rPr>
+        <w:t xml:space="preserve">]</w:t>
+      </w:r>
+      <w:r>
+        <w:br/>
+      </w:r>
+      <w:r>
+        <w:rPr>
+          <w:rStyle w:val="NormalTok"/>
+        </w:rPr>
+        <w:t xml:space="preserve">  </w:t>
+      </w:r>
+      <w:r>
+        <w:rPr>
+          <w:rStyle w:val="DataTypeTok"/>
+        </w:rPr>
+        <w:t xml:space="preserve">Q1</w:t>
+      </w:r>
+      <w:r>
+        <w:rPr>
+          <w:rStyle w:val="NormalTok"/>
+        </w:rPr>
+        <w:t xml:space="preserve"> </w:t>
+      </w:r>
+      <w:r>
+        <w:rPr>
+          <w:rStyle w:val="PreprocessorTok"/>
+        </w:rPr>
+        <w:t xml:space="preserve">--</w:t>
+      </w:r>
+      <w:r>
+        <w:rPr>
+          <w:rStyle w:val="NormalTok"/>
+        </w:rPr>
+        <w:t xml:space="preserve"> </w:t>
+      </w:r>
+      <w:r>
+        <w:rPr>
+          <w:rStyle w:val="VerbatimStringTok"/>
+        </w:rPr>
+        <w:t xml:space="preserve">Rồi </w:t>
+      </w:r>
+      <w:r>
+        <w:rPr>
+          <w:rStyle w:val="PreprocessorTok"/>
+        </w:rPr>
+        <w:t xml:space="preserve">--&gt;</w:t>
+      </w:r>
+      <w:r>
+        <w:rPr>
+          <w:rStyle w:val="NormalTok"/>
+        </w:rPr>
+        <w:t xml:space="preserve"> </w:t>
+      </w:r>
+      <w:r>
+        <w:rPr>
+          <w:rStyle w:val="DataTypeTok"/>
+        </w:rPr>
+        <w:t xml:space="preserve">Q3</w:t>
+      </w:r>
+      <w:r>
+        <w:rPr>
+          <w:rStyle w:val="NormalTok"/>
+        </w:rPr>
+        <w:t xml:space="preserve">[</w:t>
+      </w:r>
+      <w:r>
+        <w:rPr>
+          <w:rStyle w:val="VerbatimStringTok"/>
+        </w:rPr>
+        <w:t xml:space="preserve">Báo không thể huỷ</w:t>
+      </w:r>
+      <w:r>
+        <w:rPr>
+          <w:rStyle w:val="NormalTok"/>
+        </w:rPr>
+        <w:t xml:space="preserve">]</w:t>
+      </w:r>
+      <w:r>
+        <w:br/>
+      </w:r>
+      <w:r>
+        <w:rPr>
+          <w:rStyle w:val="NormalTok"/>
+        </w:rPr>
+        <w:t xml:space="preserve">  </w:t>
+      </w:r>
+      <w:r>
+        <w:rPr>
+          <w:rStyle w:val="DataTypeTok"/>
+        </w:rPr>
+        <w:t xml:space="preserve">Q</w:t>
+      </w:r>
+      <w:r>
+        <w:rPr>
+          <w:rStyle w:val="NormalTok"/>
+        </w:rPr>
+        <w:t xml:space="preserve"> </w:t>
+      </w:r>
+      <w:r>
+        <w:rPr>
+          <w:rStyle w:val="PreprocessorTok"/>
+        </w:rPr>
+        <w:t xml:space="preserve">--</w:t>
+      </w:r>
+      <w:r>
+        <w:rPr>
+          <w:rStyle w:val="NormalTok"/>
+        </w:rPr>
+        <w:t xml:space="preserve"> </w:t>
+      </w:r>
+      <w:r>
+        <w:rPr>
+          <w:rStyle w:val="VerbatimStringTok"/>
+        </w:rPr>
+        <w:t xml:space="preserve">Không </w:t>
+      </w:r>
+      <w:r>
+        <w:rPr>
+          <w:rStyle w:val="PreprocessorTok"/>
+        </w:rPr>
+        <w:t xml:space="preserve">--&gt;</w:t>
+      </w:r>
+      <w:r>
+        <w:rPr>
+          <w:rStyle w:val="NormalTok"/>
+        </w:rPr>
+        <w:t xml:space="preserve"> </w:t>
+      </w:r>
+      <w:r>
+        <w:rPr>
+          <w:rStyle w:val="DataTypeTok"/>
+        </w:rPr>
+        <w:t xml:space="preserve">S</w:t>
+      </w:r>
+      <w:r>
+        <w:rPr>
+          <w:rStyle w:val="NormalTok"/>
+        </w:rPr>
+        <w:t xml:space="preserve">{</w:t>
+      </w:r>
+      <w:r>
+        <w:rPr>
+          <w:rStyle w:val="VerbatimStringTok"/>
+        </w:rPr>
+        <w:t xml:space="preserve">Quá 48 giờ?</w:t>
+      </w:r>
+      <w:r>
+        <w:rPr>
+          <w:rStyle w:val="NormalTok"/>
+        </w:rPr>
+        <w:t xml:space="preserve">}</w:t>
+      </w:r>
+      <w:r>
+        <w:br/>
+      </w:r>
+      <w:r>
+        <w:rPr>
+          <w:rStyle w:val="NormalTok"/>
+        </w:rPr>
+        <w:t xml:space="preserve">  </w:t>
+      </w:r>
+      <w:r>
+        <w:rPr>
+          <w:rStyle w:val="DataTypeTok"/>
+        </w:rPr>
+        <w:t xml:space="preserve">S</w:t>
+      </w:r>
+      <w:r>
+        <w:rPr>
+          <w:rStyle w:val="NormalTok"/>
+        </w:rPr>
+        <w:t xml:space="preserve"> </w:t>
+      </w:r>
+      <w:r>
+        <w:rPr>
+          <w:rStyle w:val="PreprocessorTok"/>
+        </w:rPr>
+        <w:t xml:space="preserve">--</w:t>
+      </w:r>
+      <w:r>
+        <w:rPr>
+          <w:rStyle w:val="NormalTok"/>
+        </w:rPr>
+        <w:t xml:space="preserve"> </w:t>
+      </w:r>
+      <w:r>
+        <w:rPr>
+          <w:rStyle w:val="VerbatimStringTok"/>
+        </w:rPr>
+        <w:t xml:space="preserve">Có </w:t>
+      </w:r>
+      <w:r>
+        <w:rPr>
+          <w:rStyle w:val="PreprocessorTok"/>
+        </w:rPr>
+        <w:t xml:space="preserve">--&gt;</w:t>
+      </w:r>
+      <w:r>
+        <w:rPr>
+          <w:rStyle w:val="NormalTok"/>
+        </w:rPr>
+        <w:t xml:space="preserve"> </w:t>
+      </w:r>
+      <w:r>
+        <w:rPr>
+          <w:rStyle w:val="DataTypeTok"/>
+        </w:rPr>
+        <w:t xml:space="preserve">S1</w:t>
+      </w:r>
+      <w:r>
+        <w:rPr>
+          <w:rStyle w:val="NormalTok"/>
+        </w:rPr>
+        <w:t xml:space="preserve">[</w:t>
+      </w:r>
+      <w:r>
+        <w:rPr>
+          <w:rStyle w:val="VerbatimStringTok"/>
+        </w:rPr>
+        <w:t xml:space="preserve">Activity và email Trưởng CSKH</w:t>
+      </w:r>
+      <w:r>
+        <w:rPr>
+          <w:rStyle w:val="NormalTok"/>
+        </w:rPr>
+        <w:t xml:space="preserve">]</w:t>
+      </w:r>
+      <w:r>
+        <w:br/>
+      </w:r>
+      <w:r>
+        <w:rPr>
+          <w:rStyle w:val="NormalTok"/>
+        </w:rPr>
+        <w:t xml:space="preserve">  </w:t>
+      </w:r>
+      <w:r>
+        <w:rPr>
+          <w:rStyle w:val="DataTypeTok"/>
+        </w:rPr>
+        <w:t xml:space="preserve">S</w:t>
+      </w:r>
+      <w:r>
+        <w:rPr>
+          <w:rStyle w:val="NormalTok"/>
+        </w:rPr>
+        <w:t xml:space="preserve"> </w:t>
+      </w:r>
+      <w:r>
+        <w:rPr>
+          <w:rStyle w:val="PreprocessorTok"/>
+        </w:rPr>
+        <w:t xml:space="preserve">--</w:t>
+      </w:r>
+      <w:r>
+        <w:rPr>
+          <w:rStyle w:val="NormalTok"/>
+        </w:rPr>
+        <w:t xml:space="preserve"> </w:t>
+      </w:r>
+      <w:r>
+        <w:rPr>
+          <w:rStyle w:val="VerbatimStringTok"/>
+        </w:rPr>
+        <w:t xml:space="preserve">Không </w:t>
+      </w:r>
+      <w:r>
+        <w:rPr>
+          <w:rStyle w:val="PreprocessorTok"/>
+        </w:rPr>
+        <w:t xml:space="preserve">--&gt;</w:t>
+      </w:r>
+      <w:r>
+        <w:rPr>
+          <w:rStyle w:val="NormalTok"/>
+        </w:rPr>
+        <w:t xml:space="preserve"> </w:t>
+      </w:r>
+      <w:r>
+        <w:rPr>
+          <w:rStyle w:val="DataTypeTok"/>
+        </w:rPr>
+        <w:t xml:space="preserve">S2</w:t>
+      </w:r>
+      <w:r>
+        <w:rPr>
+          <w:rStyle w:val="NormalTok"/>
+        </w:rPr>
+        <w:t xml:space="preserve">[</w:t>
+      </w:r>
+      <w:r>
+        <w:rPr>
+          <w:rStyle w:val="VerbatimStringTok"/>
+        </w:rPr>
+        <w:t xml:space="preserve">Chờ CSKH xử lý</w:t>
+      </w:r>
+      <w:r>
+        <w:rPr>
+          <w:rStyle w:val="NormalTok"/>
+        </w:rPr>
+        <w:t xml:space="preserve">]</w:t>
+      </w:r>
+      <w:r>
+        <w:br/>
+      </w:r>
+      <w:r>
+        <w:rPr>
+          <w:rStyle w:val="NormalTok"/>
+        </w:rPr>
+        <w:t xml:space="preserve">  </w:t>
+      </w:r>
+      <w:r>
+        <w:rPr>
+          <w:rStyle w:val="DataTypeTok"/>
+        </w:rPr>
+        <w:t xml:space="preserve">T</w:t>
+      </w:r>
+      <w:r>
+        <w:rPr>
+          <w:rStyle w:val="NormalTok"/>
+        </w:rPr>
+        <w:t xml:space="preserve">[</w:t>
+      </w:r>
+      <w:r>
+        <w:rPr>
+          <w:rStyle w:val="VerbatimStringTok"/>
+        </w:rPr>
+        <w:t xml:space="preserve">Message đồng bộ</w:t>
+      </w:r>
+      <w:r>
+        <w:rPr>
+          <w:rStyle w:val="NormalTok"/>
+        </w:rPr>
+        <w:t xml:space="preserve">] </w:t>
+      </w:r>
+      <w:r>
+        <w:rPr>
+          <w:rStyle w:val="PreprocessorTok"/>
+        </w:rPr>
+        <w:t xml:space="preserve">--&gt;</w:t>
+      </w:r>
+      <w:r>
+        <w:rPr>
+          <w:rStyle w:val="NormalTok"/>
+        </w:rPr>
+        <w:t xml:space="preserve"> </w:t>
+      </w:r>
+      <w:r>
+        <w:rPr>
+          <w:rStyle w:val="DataTypeTok"/>
+        </w:rPr>
+        <w:t xml:space="preserve">U</w:t>
+      </w:r>
+      <w:r>
+        <w:rPr>
+          <w:rStyle w:val="NormalTok"/>
+        </w:rPr>
+        <w:t xml:space="preserve">{</w:t>
+      </w:r>
+      <w:r>
+        <w:rPr>
+          <w:rStyle w:val="VerbatimStringTok"/>
+        </w:rPr>
+        <w:t xml:space="preserve">Thành công?</w:t>
+      </w:r>
+      <w:r>
+        <w:rPr>
+          <w:rStyle w:val="NormalTok"/>
+        </w:rPr>
+        <w:t xml:space="preserve">}</w:t>
+      </w:r>
+      <w:r>
+        <w:br/>
+      </w:r>
+      <w:r>
+        <w:rPr>
+          <w:rStyle w:val="NormalTok"/>
+        </w:rPr>
+        <w:t xml:space="preserve">  </w:t>
+      </w:r>
+      <w:r>
+        <w:rPr>
+          <w:rStyle w:val="DataTypeTok"/>
+        </w:rPr>
+        <w:t xml:space="preserve">U</w:t>
+      </w:r>
+      <w:r>
+        <w:rPr>
+          <w:rStyle w:val="NormalTok"/>
+        </w:rPr>
+        <w:t xml:space="preserve"> </w:t>
+      </w:r>
+      <w:r>
+        <w:rPr>
+          <w:rStyle w:val="PreprocessorTok"/>
+        </w:rPr>
+        <w:t xml:space="preserve">--</w:t>
+      </w:r>
+      <w:r>
+        <w:rPr>
+          <w:rStyle w:val="NormalTok"/>
+        </w:rPr>
+        <w:t xml:space="preserve"> </w:t>
+      </w:r>
+      <w:r>
+        <w:rPr>
+          <w:rStyle w:val="VerbatimStringTok"/>
+        </w:rPr>
+        <w:t xml:space="preserve">Không </w:t>
+      </w:r>
+      <w:r>
+        <w:rPr>
+          <w:rStyle w:val="PreprocessorTok"/>
+        </w:rPr>
+        <w:t xml:space="preserve">--&gt;</w:t>
+      </w:r>
+      <w:r>
+        <w:rPr>
+          <w:rStyle w:val="NormalTok"/>
+        </w:rPr>
+        <w:t xml:space="preserve"> </w:t>
+      </w:r>
+      <w:r>
+        <w:rPr>
+          <w:rStyle w:val="DataTypeTok"/>
+        </w:rPr>
+        <w:t xml:space="preserve">U1</w:t>
+      </w:r>
+      <w:r>
+        <w:rPr>
+          <w:rStyle w:val="NormalTok"/>
+        </w:rPr>
+        <w:t xml:space="preserve">[</w:t>
+      </w:r>
+      <w:r>
+        <w:rPr>
+          <w:rStyle w:val="VerbatimStringTok"/>
+        </w:rPr>
+        <w:t xml:space="preserve">Retry 1, 5, 15 phút</w:t>
+      </w:r>
+      <w:r>
+        <w:rPr>
+          <w:rStyle w:val="NormalTok"/>
+        </w:rPr>
+        <w:t xml:space="preserve">]</w:t>
+      </w:r>
+      <w:r>
+        <w:br/>
+      </w:r>
+      <w:r>
+        <w:rPr>
+          <w:rStyle w:val="NormalTok"/>
+        </w:rPr>
+        <w:t xml:space="preserve">  </w:t>
+      </w:r>
+      <w:r>
+        <w:rPr>
+          <w:rStyle w:val="DataTypeTok"/>
+        </w:rPr>
+        <w:t xml:space="preserve">U1</w:t>
+      </w:r>
+      <w:r>
+        <w:rPr>
+          <w:rStyle w:val="NormalTok"/>
+        </w:rPr>
+        <w:t xml:space="preserve"> </w:t>
+      </w:r>
+      <w:r>
+        <w:rPr>
+          <w:rStyle w:val="PreprocessorTok"/>
+        </w:rPr>
+        <w:t xml:space="preserve">--&gt;</w:t>
+      </w:r>
+      <w:r>
+        <w:rPr>
+          <w:rStyle w:val="NormalTok"/>
+        </w:rPr>
+        <w:t xml:space="preserve"> </w:t>
+      </w:r>
+      <w:r>
+        <w:rPr>
+          <w:rStyle w:val="DataTypeTok"/>
+        </w:rPr>
+        <w:t xml:space="preserve">U2</w:t>
+      </w:r>
+      <w:r>
+        <w:rPr>
+          <w:rStyle w:val="NormalTok"/>
+        </w:rPr>
+        <w:t xml:space="preserve">{</w:t>
+      </w:r>
+      <w:r>
+        <w:rPr>
+          <w:rStyle w:val="VerbatimStringTok"/>
+        </w:rPr>
+        <w:t xml:space="preserve">Vẫn lỗi?</w:t>
+      </w:r>
+      <w:r>
+        <w:rPr>
+          <w:rStyle w:val="NormalTok"/>
+        </w:rPr>
+        <w:t xml:space="preserve">}</w:t>
+      </w:r>
+      <w:r>
+        <w:br/>
+      </w:r>
+      <w:r>
+        <w:rPr>
+          <w:rStyle w:val="NormalTok"/>
+        </w:rPr>
+        <w:t xml:space="preserve">  </w:t>
+      </w:r>
+      <w:r>
+        <w:rPr>
+          <w:rStyle w:val="DataTypeTok"/>
+        </w:rPr>
+        <w:t xml:space="preserve">U2</w:t>
+      </w:r>
+      <w:r>
+        <w:rPr>
+          <w:rStyle w:val="NormalTok"/>
+        </w:rPr>
+        <w:t xml:space="preserve"> </w:t>
+      </w:r>
+      <w:r>
+        <w:rPr>
+          <w:rStyle w:val="PreprocessorTok"/>
+        </w:rPr>
+        <w:t xml:space="preserve">--</w:t>
+      </w:r>
+      <w:r>
+        <w:rPr>
+          <w:rStyle w:val="NormalTok"/>
+        </w:rPr>
+        <w:t xml:space="preserve"> </w:t>
+      </w:r>
+      <w:r>
+        <w:rPr>
+          <w:rStyle w:val="VerbatimStringTok"/>
+        </w:rPr>
+        <w:t xml:space="preserve">Có </w:t>
+      </w:r>
+      <w:r>
+        <w:rPr>
+          <w:rStyle w:val="PreprocessorTok"/>
+        </w:rPr>
+        <w:t xml:space="preserve">--&gt;</w:t>
+      </w:r>
+      <w:r>
+        <w:rPr>
+          <w:rStyle w:val="NormalTok"/>
+        </w:rPr>
+        <w:t xml:space="preserve"> </w:t>
+      </w:r>
+      <w:r>
+        <w:rPr>
+          <w:rStyle w:val="DataTypeTok"/>
+        </w:rPr>
+        <w:t xml:space="preserve">U3</w:t>
+      </w:r>
+      <w:r>
+        <w:rPr>
+          <w:rStyle w:val="NormalTok"/>
+        </w:rPr>
+        <w:t xml:space="preserve">[</w:t>
+      </w:r>
+      <w:r>
+        <w:rPr>
+          <w:rStyle w:val="VerbatimStringTok"/>
+        </w:rPr>
+        <w:t xml:space="preserve">Activity Trưởng CSKH</w:t>
+      </w:r>
+      <w:r>
+        <w:rPr>
+          <w:rStyle w:val="NormalTok"/>
+        </w:rPr>
+        <w:t xml:space="preserve">]</w:t>
       </w:r>
     </w:p>
     <w:p>
       <w:pPr>
         <w:pStyle w:val="Heading2"/>
       </w:pPr>
-      <w:bookmarkStart w:id="157" w:name="_b6b8f0941d578ee32bac1772c0b8f30aeda5af8"/>
+      <w:bookmarkStart w:id="148" w:name="_b6b8f0941d578ee32bac1772c0b8f30aeda5af8"/>
       <w:r>
         <w:rPr>
           <w:lang w:val="vi-VN"/>
         </w:rPr>
         <w:t xml:space="preserve">8. Ma trận truy vết</w:t>
       </w:r>
-      <w:bookmarkEnd w:id="157"/>
+      <w:bookmarkEnd w:id="148"/>
     </w:p>
     <w:tbl>
       <w:tblPr>
@@ -17954,27 +20334,27 @@
       <w:pPr>
         <w:pStyle w:val="Heading2"/>
       </w:pPr>
-      <w:bookmarkStart w:id="158" w:name="_8b820d749dd5b5283f30562165d177bf7595cdf"/>
+      <w:bookmarkStart w:id="149" w:name="_8b820d749dd5b5283f30562165d177bf7595cdf"/>
       <w:r>
         <w:rPr>
           <w:lang w:val="vi-VN"/>
         </w:rPr>
         <w:t xml:space="preserve">9. Assumptions &amp; Open Questions</w:t>
       </w:r>
-      <w:bookmarkEnd w:id="158"/>
+      <w:bookmarkEnd w:id="149"/>
     </w:p>
     <w:p>
       <w:pPr>
         <w:pStyle w:val="Heading3"/>
       </w:pPr>
-      <w:bookmarkStart w:id="159" w:name="_28335573547226c51b092f1746270201c753504"/>
+      <w:bookmarkStart w:id="150" w:name="_28335573547226c51b092f1746270201c753504"/>
       <w:r>
         <w:rPr>
           <w:lang w:val="vi-VN"/>
         </w:rPr>
         <w:t xml:space="preserve">9.1 Giả định</w:t>
       </w:r>
-      <w:bookmarkEnd w:id="159"/>
+      <w:bookmarkEnd w:id="150"/>
     </w:p>
     <w:tbl>
       <w:tblPr>
@@ -18736,14 +21116,14 @@
       <w:pPr>
         <w:pStyle w:val="Heading3"/>
       </w:pPr>
-      <w:bookmarkStart w:id="160" w:name="_e46325fea40e777b29798bd031232fd5930c204"/>
+      <w:bookmarkStart w:id="151" w:name="_e46325fea40e777b29798bd031232fd5930c204"/>
       <w:r>
         <w:rPr>
           <w:lang w:val="vi-VN"/>
         </w:rPr>
         <w:t xml:space="preserve">9.2 Câu hỏi mở</w:t>
       </w:r>
-      <w:bookmarkEnd w:id="160"/>
+      <w:bookmarkEnd w:id="151"/>
     </w:p>
     <w:tbl>
       <w:tblPr>
@@ -19370,27 +21750,27 @@
       <w:pPr>
         <w:pStyle w:val="Heading2"/>
       </w:pPr>
-      <w:bookmarkStart w:id="161" w:name="_ecc6b064826413be31bd75a3ed5ff5f10e57e88"/>
+      <w:bookmarkStart w:id="152" w:name="_ecc6b064826413be31bd75a3ed5ff5f10e57e88"/>
       <w:r>
         <w:rPr>
           <w:lang w:val="vi-VN"/>
         </w:rPr>
         <w:t xml:space="preserve">Phụ lục A. UI flows</w:t>
       </w:r>
-      <w:bookmarkEnd w:id="161"/>
+      <w:bookmarkEnd w:id="152"/>
     </w:p>
     <w:p>
       <w:pPr>
         <w:pStyle w:val="Heading3"/>
       </w:pPr>
-      <w:bookmarkStart w:id="162" w:name="_storefront"/>
+      <w:bookmarkStart w:id="153" w:name="_storefront"/>
       <w:r>
         <w:rPr>
           <w:lang w:val="vi-VN"/>
         </w:rPr>
         <w:t xml:space="preserve">1.1 Storefront</w:t>
       </w:r>
-      <w:bookmarkEnd w:id="162"/>
+      <w:bookmarkEnd w:id="153"/>
     </w:p>
     <w:p>
       <w:pPr>
@@ -19401,18 +21781,18 @@
           <wp:inline>
             <wp:extent cx="5334000" cy="1299482"/>
             <wp:effectExtent b="0" l="0" r="0" t="0"/>
-            <wp:docPr descr="1.1 Storefront" title="" id="164" name="Picture"/>
+            <wp:docPr descr="1.1 Storefront" title="" id="155" name="Picture"/>
             <a:graphic>
               <a:graphicData uri="http://schemas.openxmlformats.org/drawingml/2006/picture">
                 <pic:pic>
                   <pic:nvPicPr>
-                    <pic:cNvPr descr="ui/diagrams/flows-01.png" id="165" name="Picture"/>
+                    <pic:cNvPr descr="ui/diagrams/flows-01.png" id="156" name="Picture"/>
                     <pic:cNvPicPr>
                       <a:picLocks noChangeArrowheads="1" noChangeAspect="1"/>
                     </pic:cNvPicPr>
                   </pic:nvPicPr>
                   <pic:blipFill>
-                    <a:blip r:embed="rId163"/>
+                    <a:blip r:embed="rId154"/>
                     <a:stretch>
                       <a:fillRect/>
                     </a:stretch>
@@ -19454,14 +21834,14 @@
       <w:pPr>
         <w:pStyle w:val="Heading3"/>
       </w:pPr>
-      <w:bookmarkStart w:id="166" w:name="_backend"/>
+      <w:bookmarkStart w:id="157" w:name="_backend"/>
       <w:r>
         <w:rPr>
           <w:lang w:val="vi-VN"/>
         </w:rPr>
         <w:t xml:space="preserve">1.2 Backend</w:t>
       </w:r>
-      <w:bookmarkEnd w:id="166"/>
+      <w:bookmarkEnd w:id="157"/>
     </w:p>
     <w:p>
       <w:pPr>
@@ -19472,18 +21852,18 @@
           <wp:inline>
             <wp:extent cx="5334000" cy="1823357"/>
             <wp:effectExtent b="0" l="0" r="0" t="0"/>
-            <wp:docPr descr="1.2 Backend" title="" id="168" name="Picture"/>
+            <wp:docPr descr="1.2 Backend" title="" id="159" name="Picture"/>
             <a:graphic>
               <a:graphicData uri="http://schemas.openxmlformats.org/drawingml/2006/picture">
                 <pic:pic>
                   <pic:nvPicPr>
-                    <pic:cNvPr descr="ui/diagrams/flows-02.png" id="169" name="Picture"/>
+                    <pic:cNvPr descr="ui/diagrams/flows-02.png" id="160" name="Picture"/>
                     <pic:cNvPicPr>
                       <a:picLocks noChangeArrowheads="1" noChangeAspect="1"/>
                     </pic:cNvPicPr>
                   </pic:nvPicPr>
                   <pic:blipFill>
-                    <a:blip r:embed="rId167"/>
+                    <a:blip r:embed="rId158"/>
                     <a:stretch>
                       <a:fillRect/>
                     </a:stretch>
@@ -19525,14 +21905,14 @@
       <w:pPr>
         <w:pStyle w:val="Heading3"/>
       </w:pPr>
-      <w:bookmarkStart w:id="170" w:name="_c216533680e07db0df7d9810ae423f737fc66e1"/>
+      <w:bookmarkStart w:id="161" w:name="_c216533680e07db0df7d9810ae423f737fc66e1"/>
       <w:r>
         <w:rPr>
           <w:lang w:val="vi-VN"/>
         </w:rPr>
         <w:t xml:space="preserve">2.1 Khách tạo yêu cầu (FR-01, FR-02, FR-03, FR-04)</w:t>
       </w:r>
-      <w:bookmarkEnd w:id="170"/>
+      <w:bookmarkEnd w:id="161"/>
     </w:p>
     <w:p>
       <w:pPr>
@@ -19543,18 +21923,18 @@
           <wp:inline>
             <wp:extent cx="1652869" cy="7919999"/>
             <wp:effectExtent b="0" l="0" r="0" t="0"/>
-            <wp:docPr descr="2.1 Khách tạo yêu cầu (FR-01, FR-02, FR-03, FR-04)" title="" id="172" name="Picture"/>
+            <wp:docPr descr="2.1 Khách tạo yêu cầu (FR-01, FR-02, FR-03, FR-04)" title="" id="163" name="Picture"/>
             <a:graphic>
               <a:graphicData uri="http://schemas.openxmlformats.org/drawingml/2006/picture">
                 <pic:pic>
                   <pic:nvPicPr>
-                    <pic:cNvPr descr="ui/diagrams/flows-03.png" id="173" name="Picture"/>
+                    <pic:cNvPr descr="ui/diagrams/flows-03.png" id="164" name="Picture"/>
                     <pic:cNvPicPr>
                       <a:picLocks noChangeArrowheads="1" noChangeAspect="1"/>
                     </pic:cNvPicPr>
                   </pic:nvPicPr>
                   <pic:blipFill>
-                    <a:blip r:embed="rId171"/>
+                    <a:blip r:embed="rId162"/>
                     <a:stretch>
                       <a:fillRect/>
                     </a:stretch>
@@ -19596,14 +21976,14 @@
       <w:pPr>
         <w:pStyle w:val="Heading3"/>
       </w:pPr>
-      <w:bookmarkStart w:id="174" w:name="_c218856f5745cf0ece2eaef07e266b0e8f4493b"/>
+      <w:bookmarkStart w:id="165" w:name="_c218856f5745cf0ece2eaef07e266b0e8f4493b"/>
       <w:r>
         <w:rPr>
           <w:lang w:val="vi-VN"/>
         </w:rPr>
         <w:t xml:space="preserve">2.2 CSKH xử lý (FR-08, FR-09, FR-10, FR-12)</w:t>
       </w:r>
-      <w:bookmarkEnd w:id="174"/>
+      <w:bookmarkEnd w:id="165"/>
     </w:p>
     <w:p>
       <w:pPr>
@@ -19614,18 +21994,18 @@
           <wp:inline>
             <wp:extent cx="3081185" cy="7919999"/>
             <wp:effectExtent b="0" l="0" r="0" t="0"/>
-            <wp:docPr descr="2.2 CSKH xử lý (FR-08, FR-09, FR-10, FR-12)" title="" id="176" name="Picture"/>
+            <wp:docPr descr="2.2 CSKH xử lý (FR-08, FR-09, FR-10, FR-12)" title="" id="167" name="Picture"/>
             <a:graphic>
               <a:graphicData uri="http://schemas.openxmlformats.org/drawingml/2006/picture">
                 <pic:pic>
                   <pic:nvPicPr>
-                    <pic:cNvPr descr="ui/diagrams/flows-04.png" id="177" name="Picture"/>
+                    <pic:cNvPr descr="ui/diagrams/flows-04.png" id="168" name="Picture"/>
                     <pic:cNvPicPr>
                       <a:picLocks noChangeArrowheads="1" noChangeAspect="1"/>
                     </pic:cNvPicPr>
                   </pic:nvPicPr>
                   <pic:blipFill>
-                    <a:blip r:embed="rId175"/>
+                    <a:blip r:embed="rId166"/>
                     <a:stretch>
                       <a:fillRect/>
                     </a:stretch>
@@ -19667,14 +22047,14 @@
       <w:pPr>
         <w:pStyle w:val="Heading3"/>
       </w:pPr>
-      <w:bookmarkStart w:id="178" w:name="_4d5f44c58ebe4400064e2e04e2ec502d4baf361"/>
+      <w:bookmarkStart w:id="169" w:name="_4d5f44c58ebe4400064e2e04e2ec502d4baf361"/>
       <w:r>
         <w:rPr>
           <w:lang w:val="vi-VN"/>
         </w:rPr>
         <w:t xml:space="preserve">2.3 Kho nhận hàng (FR-13, FR-14, FR-15)</w:t>
       </w:r>
-      <w:bookmarkEnd w:id="178"/>
+      <w:bookmarkEnd w:id="169"/>
     </w:p>
     <w:p>
       <w:pPr>
@@ -19685,18 +22065,18 @@
           <wp:inline>
             <wp:extent cx="3825762" cy="7919999"/>
             <wp:effectExtent b="0" l="0" r="0" t="0"/>
-            <wp:docPr descr="2.3 Kho nhận hàng (FR-13, FR-14, FR-15)" title="" id="180" name="Picture"/>
+            <wp:docPr descr="2.3 Kho nhận hàng (FR-13, FR-14, FR-15)" title="" id="171" name="Picture"/>
             <a:graphic>
               <a:graphicData uri="http://schemas.openxmlformats.org/drawingml/2006/picture">
                 <pic:pic>
                   <pic:nvPicPr>
-                    <pic:cNvPr descr="ui/diagrams/flows-05.png" id="181" name="Picture"/>
+                    <pic:cNvPr descr="ui/diagrams/flows-05.png" id="172" name="Picture"/>
                     <pic:cNvPicPr>
                       <a:picLocks noChangeArrowheads="1" noChangeAspect="1"/>
                     </pic:cNvPicPr>
                   </pic:nvPicPr>
                   <pic:blipFill>
-                    <a:blip r:embed="rId179"/>
+                    <a:blip r:embed="rId170"/>
                     <a:stretch>
                       <a:fillRect/>
                     </a:stretch>

</xml_diff>

<commit_message>
docs(_example): re-export SRS.docx with diagrams
</commit_message>
<xml_diff>
--- a/outputs/_example/SRS.docx
+++ b/outputs/_example/SRS.docx
@@ -951,408 +951,74 @@
     </w:p>
     <w:p>
       <w:pPr>
-        <w:pStyle w:val="SourceCode"/>
-      </w:pPr>
-      <w:r>
-        <w:rPr>
-          <w:rStyle w:val="KeywordTok"/>
-        </w:rPr>
-        <w:t xml:space="preserve">flowchart</w:t>
-      </w:r>
-      <w:r>
-        <w:rPr>
-          <w:rStyle w:val="NormalTok"/>
-        </w:rPr>
-        <w:t xml:space="preserve"> </w:t>
-      </w:r>
-      <w:r>
-        <w:rPr>
-          <w:rStyle w:val="ConstantTok"/>
-        </w:rPr>
-        <w:t xml:space="preserve">LR</w:t>
-      </w:r>
-      <w:r>
-        <w:br/>
-      </w:r>
-      <w:r>
-        <w:rPr>
-          <w:rStyle w:val="NormalTok"/>
-        </w:rPr>
-        <w:t xml:space="preserve">  </w:t>
-      </w:r>
-      <w:r>
-        <w:rPr>
-          <w:rStyle w:val="DataTypeTok"/>
-        </w:rPr>
-        <w:t xml:space="preserve">KH</w:t>
-      </w:r>
-      <w:r>
-        <w:rPr>
-          <w:rStyle w:val="NormalTok"/>
-        </w:rPr>
-        <w:t xml:space="preserve">([</w:t>
-      </w:r>
-      <w:r>
-        <w:rPr>
-          <w:rStyle w:val="VerbatimStringTok"/>
-        </w:rPr>
-        <w:t xml:space="preserve">Khách hàng</w:t>
-      </w:r>
-      <w:r>
-        <w:rPr>
-          <w:rStyle w:val="NormalTok"/>
-        </w:rPr>
-        <w:t xml:space="preserve">]) </w:t>
-      </w:r>
-      <w:r>
-        <w:rPr>
-          <w:rStyle w:val="PreprocessorTok"/>
-        </w:rPr>
-        <w:t xml:space="preserve">--&gt;</w:t>
-      </w:r>
-      <w:r>
-        <w:rPr>
-          <w:rStyle w:val="NormalTok"/>
-        </w:rPr>
-        <w:t xml:space="preserve"> </w:t>
-      </w:r>
-      <w:r>
-        <w:rPr>
-          <w:rStyle w:val="DataTypeTok"/>
-        </w:rPr>
-        <w:t xml:space="preserve">M2</w:t>
-      </w:r>
-      <w:r>
-        <w:rPr>
-          <w:rStyle w:val="NormalTok"/>
-        </w:rPr>
-        <w:t xml:space="preserve">[</w:t>
-      </w:r>
-      <w:r>
-        <w:rPr>
-          <w:rStyle w:val="VerbatimStringTok"/>
-        </w:rPr>
-        <w:t xml:space="preserve">Magento 2 storefront</w:t>
-      </w:r>
-      <w:r>
-        <w:rPr>
-          <w:rStyle w:val="NormalTok"/>
-        </w:rPr>
-        <w:t xml:space="preserve">]</w:t>
-      </w:r>
-      <w:r>
-        <w:br/>
-      </w:r>
-      <w:r>
-        <w:rPr>
-          <w:rStyle w:val="NormalTok"/>
-        </w:rPr>
-        <w:t xml:space="preserve">  </w:t>
-      </w:r>
-      <w:r>
-        <w:rPr>
-          <w:rStyle w:val="DataTypeTok"/>
-        </w:rPr>
-        <w:t xml:space="preserve">M2</w:t>
-      </w:r>
-      <w:r>
-        <w:rPr>
-          <w:rStyle w:val="NormalTok"/>
-        </w:rPr>
-        <w:t xml:space="preserve"> </w:t>
-      </w:r>
-      <w:r>
-        <w:rPr>
-          <w:rStyle w:val="PreprocessorTok"/>
-        </w:rPr>
-        <w:t xml:space="preserve">--&gt;</w:t>
-      </w:r>
-      <w:r>
-        <w:rPr>
-          <w:rStyle w:val="VerbatimStringTok"/>
-        </w:rPr>
-        <w:t xml:space="preserve">|Yêu cầu, ảnh, STK|</w:t>
-      </w:r>
-      <w:r>
-        <w:rPr>
-          <w:rStyle w:val="NormalTok"/>
-        </w:rPr>
-        <w:t xml:space="preserve"> </w:t>
-      </w:r>
-      <w:r>
-        <w:rPr>
-          <w:rStyle w:val="DataTypeTok"/>
-        </w:rPr>
-        <w:t xml:space="preserve">Q</w:t>
-      </w:r>
-      <w:r>
-        <w:rPr>
-          <w:rStyle w:val="NormalTok"/>
-        </w:rPr>
-        <w:t xml:space="preserve">[(</w:t>
-      </w:r>
-      <w:r>
-        <w:rPr>
-          <w:rStyle w:val="VerbatimStringTok"/>
-        </w:rPr>
-        <w:t xml:space="preserve">Queue connector</w:t>
-      </w:r>
-      <w:r>
-        <w:rPr>
-          <w:rStyle w:val="NormalTok"/>
-        </w:rPr>
-        <w:t xml:space="preserve">)]</w:t>
-      </w:r>
-      <w:r>
-        <w:br/>
-      </w:r>
-      <w:r>
-        <w:rPr>
-          <w:rStyle w:val="NormalTok"/>
-        </w:rPr>
-        <w:t xml:space="preserve">  </w:t>
-      </w:r>
-      <w:r>
-        <w:rPr>
-          <w:rStyle w:val="DataTypeTok"/>
-        </w:rPr>
-        <w:t xml:space="preserve">Q</w:t>
-      </w:r>
-      <w:r>
-        <w:rPr>
-          <w:rStyle w:val="NormalTok"/>
-        </w:rPr>
-        <w:t xml:space="preserve"> </w:t>
-      </w:r>
-      <w:r>
-        <w:rPr>
-          <w:rStyle w:val="PreprocessorTok"/>
-        </w:rPr>
-        <w:t xml:space="preserve">--&gt;</w:t>
-      </w:r>
-      <w:r>
-        <w:rPr>
-          <w:rStyle w:val="NormalTok"/>
-        </w:rPr>
-        <w:t xml:space="preserve"> </w:t>
-      </w:r>
-      <w:r>
-        <w:rPr>
-          <w:rStyle w:val="DataTypeTok"/>
-        </w:rPr>
-        <w:t xml:space="preserve">OD</w:t>
-      </w:r>
-      <w:r>
-        <w:rPr>
-          <w:rStyle w:val="NormalTok"/>
-        </w:rPr>
-        <w:t xml:space="preserve">[</w:t>
-      </w:r>
-      <w:r>
-        <w:rPr>
-          <w:rStyle w:val="VerbatimStringTok"/>
-        </w:rPr>
-        <w:t xml:space="preserve">Odoo 17</w:t>
-      </w:r>
-      <w:r>
-        <w:rPr>
-          <w:rStyle w:val="NormalTok"/>
-        </w:rPr>
-        <w:t xml:space="preserve">]</w:t>
-      </w:r>
-      <w:r>
-        <w:br/>
-      </w:r>
-      <w:r>
-        <w:rPr>
-          <w:rStyle w:val="NormalTok"/>
-        </w:rPr>
-        <w:t xml:space="preserve">  </w:t>
-      </w:r>
-      <w:r>
-        <w:rPr>
-          <w:rStyle w:val="DataTypeTok"/>
-        </w:rPr>
-        <w:t xml:space="preserve">OD</w:t>
-      </w:r>
-      <w:r>
-        <w:rPr>
-          <w:rStyle w:val="NormalTok"/>
-        </w:rPr>
-        <w:t xml:space="preserve"> </w:t>
-      </w:r>
-      <w:r>
-        <w:rPr>
-          <w:rStyle w:val="PreprocessorTok"/>
-        </w:rPr>
-        <w:t xml:space="preserve">--&gt;</w:t>
-      </w:r>
-      <w:r>
-        <w:rPr>
-          <w:rStyle w:val="VerbatimStringTok"/>
-        </w:rPr>
-        <w:t xml:space="preserve">|Trạng thái, lý do từ chối|</w:t>
-      </w:r>
-      <w:r>
-        <w:rPr>
-          <w:rStyle w:val="NormalTok"/>
-        </w:rPr>
-        <w:t xml:space="preserve"> </w:t>
-      </w:r>
-      <w:r>
-        <w:rPr>
-          <w:rStyle w:val="DataTypeTok"/>
-        </w:rPr>
-        <w:t xml:space="preserve">Q</w:t>
-      </w:r>
-      <w:r>
-        <w:br/>
-      </w:r>
-      <w:r>
-        <w:rPr>
-          <w:rStyle w:val="NormalTok"/>
-        </w:rPr>
-        <w:t xml:space="preserve">  </w:t>
-      </w:r>
-      <w:r>
-        <w:rPr>
-          <w:rStyle w:val="DataTypeTok"/>
-        </w:rPr>
-        <w:t xml:space="preserve">Q</w:t>
-      </w:r>
-      <w:r>
-        <w:rPr>
-          <w:rStyle w:val="NormalTok"/>
-        </w:rPr>
-        <w:t xml:space="preserve"> </w:t>
-      </w:r>
-      <w:r>
-        <w:rPr>
-          <w:rStyle w:val="PreprocessorTok"/>
-        </w:rPr>
-        <w:t xml:space="preserve">--&gt;</w:t>
-      </w:r>
-      <w:r>
-        <w:rPr>
-          <w:rStyle w:val="NormalTok"/>
-        </w:rPr>
-        <w:t xml:space="preserve"> </w:t>
-      </w:r>
-      <w:r>
-        <w:rPr>
-          <w:rStyle w:val="DataTypeTok"/>
-        </w:rPr>
-        <w:t xml:space="preserve">M2</w:t>
-      </w:r>
-      <w:r>
-        <w:br/>
-      </w:r>
-      <w:r>
-        <w:rPr>
-          <w:rStyle w:val="NormalTok"/>
-        </w:rPr>
-        <w:t xml:space="preserve">  </w:t>
-      </w:r>
-      <w:r>
-        <w:rPr>
-          <w:rStyle w:val="DataTypeTok"/>
-        </w:rPr>
-        <w:t xml:space="preserve">M2</w:t>
-      </w:r>
-      <w:r>
-        <w:rPr>
-          <w:rStyle w:val="NormalTok"/>
-        </w:rPr>
-        <w:t xml:space="preserve"> </w:t>
-      </w:r>
-      <w:r>
-        <w:rPr>
-          <w:rStyle w:val="PreprocessorTok"/>
-        </w:rPr>
-        <w:t xml:space="preserve">--&gt;</w:t>
-      </w:r>
-      <w:r>
-        <w:rPr>
-          <w:rStyle w:val="VerbatimStringTok"/>
-        </w:rPr>
-        <w:t xml:space="preserve">|Email|</w:t>
-      </w:r>
-      <w:r>
-        <w:rPr>
-          <w:rStyle w:val="NormalTok"/>
-        </w:rPr>
-        <w:t xml:space="preserve"> </w:t>
-      </w:r>
-      <w:r>
-        <w:rPr>
-          <w:rStyle w:val="DataTypeTok"/>
-        </w:rPr>
-        <w:t xml:space="preserve">KH</w:t>
-      </w:r>
-      <w:r>
-        <w:br/>
-      </w:r>
-      <w:r>
-        <w:rPr>
-          <w:rStyle w:val="NormalTok"/>
-        </w:rPr>
-        <w:t xml:space="preserve">  </w:t>
-      </w:r>
-      <w:r>
-        <w:rPr>
-          <w:rStyle w:val="DataTypeTok"/>
-        </w:rPr>
-        <w:t xml:space="preserve">CS</w:t>
-      </w:r>
-      <w:r>
-        <w:rPr>
-          <w:rStyle w:val="NormalTok"/>
-        </w:rPr>
-        <w:t xml:space="preserve">([</w:t>
-      </w:r>
-      <w:r>
-        <w:rPr>
-          <w:rStyle w:val="VerbatimStringTok"/>
-        </w:rPr>
-        <w:t xml:space="preserve">CSKH, Kho, Kế toán</w:t>
-      </w:r>
-      <w:r>
-        <w:rPr>
-          <w:rStyle w:val="NormalTok"/>
-        </w:rPr>
-        <w:t xml:space="preserve">]) </w:t>
-      </w:r>
-      <w:r>
-        <w:rPr>
-          <w:rStyle w:val="PreprocessorTok"/>
-        </w:rPr>
-        <w:t xml:space="preserve">--&gt;</w:t>
-      </w:r>
-      <w:r>
-        <w:rPr>
-          <w:rStyle w:val="NormalTok"/>
-        </w:rPr>
-        <w:t xml:space="preserve"> </w:t>
-      </w:r>
-      <w:r>
-        <w:rPr>
-          <w:rStyle w:val="DataTypeTok"/>
-        </w:rPr>
-        <w:t xml:space="preserve">OD</w:t>
+        <w:pStyle w:val="CaptionedFigure"/>
+      </w:pPr>
+      <w:r>
+        <w:drawing>
+          <wp:inline>
+            <wp:extent cx="5334000" cy="381000"/>
+            <wp:effectExtent b="0" l="0" r="0" t="0"/>
+            <wp:docPr descr="Sơ đồ 1 — 2.1 Bối cảnh hệ thống" title="" id="17" name="Picture"/>
+            <a:graphic>
+              <a:graphicData uri="http://schemas.openxmlformats.org/drawingml/2006/picture">
+                <pic:pic>
+                  <pic:nvPicPr>
+                    <pic:cNvPr descr="ui/diagrams/srs-01.png" id="18" name="Picture"/>
+                    <pic:cNvPicPr>
+                      <a:picLocks noChangeArrowheads="1" noChangeAspect="1"/>
+                    </pic:cNvPicPr>
+                  </pic:nvPicPr>
+                  <pic:blipFill>
+                    <a:blip r:embed="rId16"/>
+                    <a:stretch>
+                      <a:fillRect/>
+                    </a:stretch>
+                  </pic:blipFill>
+                  <pic:spPr bwMode="auto">
+                    <a:xfrm>
+                      <a:off x="0" y="0"/>
+                      <a:ext cx="5334000" cy="381000"/>
+                    </a:xfrm>
+                    <a:prstGeom prst="rect">
+                      <a:avLst/>
+                    </a:prstGeom>
+                    <a:noFill/>
+                    <a:ln w="9525">
+                      <a:noFill/>
+                      <a:headEnd/>
+                      <a:tailEnd/>
+                    </a:ln>
+                  </pic:spPr>
+                </pic:pic>
+              </a:graphicData>
+            </a:graphic>
+          </wp:inline>
+        </w:drawing>
+      </w:r>
+    </w:p>
+    <w:p>
+      <w:pPr>
+        <w:pStyle w:val="ImageCaption"/>
+      </w:pPr>
+      <w:r>
+        <w:rPr>
+          <w:lang w:val="vi-VN"/>
+        </w:rPr>
+        <w:t xml:space="preserve">Sơ đồ 1 — 2.1 Bối cảnh hệ thống</w:t>
       </w:r>
     </w:p>
     <w:p>
       <w:pPr>
         <w:pStyle w:val="Heading3"/>
       </w:pPr>
-      <w:bookmarkStart w:id="16" w:name="_812427a432729173aefb7c2cafdb6f67496aebe"/>
+      <w:bookmarkStart w:id="19" w:name="_812427a432729173aefb7c2cafdb6f67496aebe"/>
       <w:r>
         <w:rPr>
           <w:lang w:val="vi-VN"/>
         </w:rPr>
         <w:t xml:space="preserve">2.2 Vai trò người dùng</w:t>
       </w:r>
-      <w:bookmarkEnd w:id="16"/>
+      <w:bookmarkEnd w:id="19"/>
     </w:p>
     <w:tbl>
       <w:tblPr>
@@ -1710,14 +1376,14 @@
       <w:pPr>
         <w:pStyle w:val="Heading3"/>
       </w:pPr>
-      <w:bookmarkStart w:id="17" w:name="_192d53e3dc686169719000df00d21c1492fefe4"/>
+      <w:bookmarkStart w:id="20" w:name="_192d53e3dc686169719000df00d21c1492fefe4"/>
       <w:r>
         <w:rPr>
           <w:lang w:val="vi-VN"/>
         </w:rPr>
         <w:t xml:space="preserve">2.3 Giả định &amp; phụ thuộc</w:t>
       </w:r>
-      <w:bookmarkEnd w:id="17"/>
+      <w:bookmarkEnd w:id="20"/>
     </w:p>
     <w:p>
       <w:pPr>
@@ -1805,14 +1471,14 @@
       <w:pPr>
         <w:pStyle w:val="Heading2"/>
       </w:pPr>
-      <w:bookmarkStart w:id="18" w:name="_7ea09d62be1a6fb59958309d2aa901d1cc48e74"/>
+      <w:bookmarkStart w:id="21" w:name="_7ea09d62be1a6fb59958309d2aa901d1cc48e74"/>
       <w:r>
         <w:rPr>
           <w:lang w:val="vi-VN"/>
         </w:rPr>
         <w:t xml:space="preserve">3. Yêu cầu chức năng</w:t>
       </w:r>
-      <w:bookmarkEnd w:id="18"/>
+      <w:bookmarkEnd w:id="21"/>
     </w:p>
     <w:p>
       <w:pPr>
@@ -2005,14 +1671,14 @@
       <w:pPr>
         <w:pStyle w:val="Heading3"/>
       </w:pPr>
-      <w:bookmarkStart w:id="19" w:name="_7386eb0f02ead4a2b1770aee6d6d192fa89c8c6"/>
+      <w:bookmarkStart w:id="22" w:name="_7386eb0f02ead4a2b1770aee6d6d192fa89c8c6"/>
       <w:r>
         <w:rPr>
           <w:lang w:val="vi-VN"/>
         </w:rPr>
         <w:t xml:space="preserve">FR-01 — Kiểm tra điều kiện đổi trả của đơn hàng</w:t>
       </w:r>
-      <w:bookmarkEnd w:id="19"/>
+      <w:bookmarkEnd w:id="22"/>
     </w:p>
     <w:p>
       <w:pPr>
@@ -2752,14 +2418,14 @@
       <w:pPr>
         <w:pStyle w:val="Heading3"/>
       </w:pPr>
-      <w:bookmarkStart w:id="20" w:name="_9f2e341d04bcf1086c202cfef495a6d903af0f2"/>
+      <w:bookmarkStart w:id="23" w:name="_9f2e341d04bcf1086c202cfef495a6d903af0f2"/>
       <w:r>
         <w:rPr>
           <w:lang w:val="vi-VN"/>
         </w:rPr>
         <w:t xml:space="preserve">FR-02 — Tạo yêu cầu đổi trả trên website</w:t>
       </w:r>
-      <w:bookmarkEnd w:id="20"/>
+      <w:bookmarkEnd w:id="23"/>
     </w:p>
     <w:p>
       <w:pPr>
@@ -3521,14 +3187,14 @@
       <w:pPr>
         <w:pStyle w:val="Heading3"/>
       </w:pPr>
-      <w:bookmarkStart w:id="21" w:name="_31993eddf1d587dc8356730c6b5284451fe1dc9"/>
+      <w:bookmarkStart w:id="24" w:name="_31993eddf1d587dc8356730c6b5284451fe1dc9"/>
       <w:r>
         <w:rPr>
           <w:lang w:val="vi-VN"/>
         </w:rPr>
         <w:t xml:space="preserve">FR-03 — Quy tắc lý do, ảnh đính kèm và phí vận chuyển</w:t>
       </w:r>
-      <w:bookmarkEnd w:id="21"/>
+      <w:bookmarkEnd w:id="24"/>
     </w:p>
     <w:p>
       <w:pPr>
@@ -4309,14 +3975,14 @@
       <w:pPr>
         <w:pStyle w:val="Heading3"/>
       </w:pPr>
-      <w:bookmarkStart w:id="22" w:name="_5039dce4ca62af35da946ce2b9c9642a8d673cb"/>
+      <w:bookmarkStart w:id="25" w:name="_5039dce4ca62af35da946ce2b9c9642a8d673cb"/>
       <w:r>
         <w:rPr>
           <w:lang w:val="vi-VN"/>
         </w:rPr>
         <w:t xml:space="preserve">FR-04 — Thông tin nhận hoàn tiền cho đơn COD</w:t>
       </w:r>
-      <w:bookmarkEnd w:id="22"/>
+      <w:bookmarkEnd w:id="25"/>
     </w:p>
     <w:p>
       <w:pPr>
@@ -4869,14 +4535,14 @@
       <w:pPr>
         <w:pStyle w:val="Heading3"/>
       </w:pPr>
-      <w:bookmarkStart w:id="23" w:name="_b74230d8ad62e34d2b751c18159a10a8ac89b55"/>
+      <w:bookmarkStart w:id="26" w:name="_b74230d8ad62e34d2b751c18159a10a8ac89b55"/>
       <w:r>
         <w:rPr>
           <w:lang w:val="vi-VN"/>
         </w:rPr>
         <w:t xml:space="preserve">FR-05 — Đồng bộ yêu cầu từ Magento sang Odoo</w:t>
       </w:r>
-      <w:bookmarkEnd w:id="23"/>
+      <w:bookmarkEnd w:id="26"/>
     </w:p>
     <w:p>
       <w:pPr>
@@ -5484,14 +5150,14 @@
       <w:pPr>
         <w:pStyle w:val="Heading3"/>
       </w:pPr>
-      <w:bookmarkStart w:id="24" w:name="_b84a92fae648e8633a7b38fa1a0a0700c582c24"/>
+      <w:bookmarkStart w:id="27" w:name="_b84a92fae648e8633a7b38fa1a0a0700c582c24"/>
       <w:r>
         <w:rPr>
           <w:lang w:val="vi-VN"/>
         </w:rPr>
         <w:t xml:space="preserve">FR-06 — Khách xem danh sách và chi tiết yêu cầu</w:t>
       </w:r>
-      <w:bookmarkEnd w:id="24"/>
+      <w:bookmarkEnd w:id="27"/>
     </w:p>
     <w:p>
       <w:pPr>
@@ -6179,14 +5845,14 @@
       <w:pPr>
         <w:pStyle w:val="Heading3"/>
       </w:pPr>
-      <w:bookmarkStart w:id="25" w:name="_3c8a86b49a9f1107c4ffc5aed39356cfdbe1ab6"/>
+      <w:bookmarkStart w:id="28" w:name="_3c8a86b49a9f1107c4ffc5aed39356cfdbe1ab6"/>
       <w:r>
         <w:rPr>
           <w:lang w:val="vi-VN"/>
         </w:rPr>
         <w:t xml:space="preserve">FR-07 — Khách huỷ yêu cầu</w:t>
       </w:r>
-      <w:bookmarkEnd w:id="25"/>
+      <w:bookmarkEnd w:id="28"/>
     </w:p>
     <w:p>
       <w:pPr>
@@ -6652,14 +6318,14 @@
       <w:pPr>
         <w:pStyle w:val="Heading3"/>
       </w:pPr>
-      <w:bookmarkStart w:id="26" w:name="_2c20002dcfcdd9eee8d340287cd6a3427292788"/>
+      <w:bookmarkStart w:id="29" w:name="_2c20002dcfcdd9eee8d340287cd6a3427292788"/>
       <w:r>
         <w:rPr>
           <w:lang w:val="vi-VN"/>
         </w:rPr>
         <w:t xml:space="preserve">FR-08 — Danh sách và lọc yêu cầu trên Odoo</w:t>
       </w:r>
-      <w:bookmarkEnd w:id="26"/>
+      <w:bookmarkEnd w:id="29"/>
     </w:p>
     <w:p>
       <w:pPr>
@@ -7248,14 +6914,14 @@
       <w:pPr>
         <w:pStyle w:val="Heading3"/>
       </w:pPr>
-      <w:bookmarkStart w:id="27" w:name="_6d99c2f45d446c18a8d080bbdc0976589f274bf"/>
+      <w:bookmarkStart w:id="30" w:name="_6d99c2f45d446c18a8d080bbdc0976589f274bf"/>
       <w:r>
         <w:rPr>
           <w:lang w:val="vi-VN"/>
         </w:rPr>
         <w:t xml:space="preserve">FR-09 — Duyệt yêu cầu</w:t>
       </w:r>
-      <w:bookmarkEnd w:id="27"/>
+      <w:bookmarkEnd w:id="30"/>
     </w:p>
     <w:p>
       <w:pPr>
@@ -7806,14 +7472,14 @@
       <w:pPr>
         <w:pStyle w:val="Heading3"/>
       </w:pPr>
-      <w:bookmarkStart w:id="28" w:name="_5805d9d42fb90fa7f080b264f3c0a2fc84ac123"/>
+      <w:bookmarkStart w:id="31" w:name="_5805d9d42fb90fa7f080b264f3c0a2fc84ac123"/>
       <w:r>
         <w:rPr>
           <w:lang w:val="vi-VN"/>
         </w:rPr>
         <w:t xml:space="preserve">FR-10 — Từ chối yêu cầu</w:t>
       </w:r>
-      <w:bookmarkEnd w:id="28"/>
+      <w:bookmarkEnd w:id="31"/>
     </w:p>
     <w:p>
       <w:pPr>
@@ -8450,14 +8116,14 @@
       <w:pPr>
         <w:pStyle w:val="Heading3"/>
       </w:pPr>
-      <w:bookmarkStart w:id="29" w:name="_9dafcd407f83091b3616cd20cab6edc069b1aee"/>
+      <w:bookmarkStart w:id="32" w:name="_9dafcd407f83091b3616cd20cab6edc069b1aee"/>
       <w:r>
         <w:rPr>
           <w:lang w:val="vi-VN"/>
         </w:rPr>
         <w:t xml:space="preserve">FR-11 — Đồng bộ trạng thái về Magento và email khách</w:t>
       </w:r>
-      <w:bookmarkEnd w:id="29"/>
+      <w:bookmarkEnd w:id="32"/>
     </w:p>
     <w:p>
       <w:pPr>
@@ -8903,14 +8569,14 @@
       <w:pPr>
         <w:pStyle w:val="Heading3"/>
       </w:pPr>
-      <w:bookmarkStart w:id="30" w:name="_4515cc17165fd8bb63ccfd70df7fd55d70e6eae"/>
+      <w:bookmarkStart w:id="33" w:name="_4515cc17165fd8bb63ccfd70df7fd55d70e6eae"/>
       <w:r>
         <w:rPr>
           <w:lang w:val="vi-VN"/>
         </w:rPr>
         <w:t xml:space="preserve">FR-12 — Cảnh báo yêu cầu quá 48 giờ</w:t>
       </w:r>
-      <w:bookmarkEnd w:id="30"/>
+      <w:bookmarkEnd w:id="33"/>
     </w:p>
     <w:p>
       <w:pPr>
@@ -9386,14 +9052,14 @@
       <w:pPr>
         <w:pStyle w:val="Heading3"/>
       </w:pPr>
-      <w:bookmarkStart w:id="31" w:name="_08213f3bc1c896195f20a5363ad83e60837d9c0"/>
+      <w:bookmarkStart w:id="34" w:name="_08213f3bc1c896195f20a5363ad83e60837d9c0"/>
       <w:r>
         <w:rPr>
           <w:lang w:val="vi-VN"/>
         </w:rPr>
         <w:t xml:space="preserve">FR-13 — Nhận hàng trả và kiểm tra tình trạng</w:t>
       </w:r>
-      <w:bookmarkEnd w:id="31"/>
+      <w:bookmarkEnd w:id="34"/>
     </w:p>
     <w:p>
       <w:pPr>
@@ -10048,14 +9714,14 @@
       <w:pPr>
         <w:pStyle w:val="Heading3"/>
       </w:pPr>
-      <w:bookmarkStart w:id="32" w:name="_4e01973c2e5f4ebcb7b497cb854df932578941b"/>
+      <w:bookmarkStart w:id="35" w:name="_4e01973c2e5f4ebcb7b497cb854df932578941b"/>
       <w:r>
         <w:rPr>
           <w:lang w:val="vi-VN"/>
         </w:rPr>
         <w:t xml:space="preserve">FR-14 — Credit note hoàn tiền cho yêu cầu trả hàng</w:t>
       </w:r>
-      <w:bookmarkEnd w:id="32"/>
+      <w:bookmarkEnd w:id="35"/>
     </w:p>
     <w:p>
       <w:pPr>
@@ -10617,14 +10283,14 @@
       <w:pPr>
         <w:pStyle w:val="Heading3"/>
       </w:pPr>
-      <w:bookmarkStart w:id="33" w:name="_3cd07e5951de65a587b394ca28e6f5ad346960f"/>
+      <w:bookmarkStart w:id="36" w:name="_3cd07e5951de65a587b394ca28e6f5ad346960f"/>
       <w:r>
         <w:rPr>
           <w:lang w:val="vi-VN"/>
         </w:rPr>
         <w:t xml:space="preserve">FR-15 — Đơn đổi size giá 0đ</w:t>
       </w:r>
-      <w:bookmarkEnd w:id="33"/>
+      <w:bookmarkEnd w:id="36"/>
     </w:p>
     <w:p>
       <w:pPr>
@@ -11072,14 +10738,14 @@
       <w:pPr>
         <w:pStyle w:val="Heading3"/>
       </w:pPr>
-      <w:bookmarkStart w:id="34" w:name="_ed780a1acee53300ce1f902e96efcd89316f6c0"/>
+      <w:bookmarkStart w:id="37" w:name="_ed780a1acee53300ce1f902e96efcd89316f6c0"/>
       <w:r>
         <w:rPr>
           <w:lang w:val="vi-VN"/>
         </w:rPr>
         <w:t xml:space="preserve">FR-16 — Báo cáo yêu cầu theo lý do</w:t>
       </w:r>
-      <w:bookmarkEnd w:id="34"/>
+      <w:bookmarkEnd w:id="37"/>
     </w:p>
     <w:p>
       <w:pPr>
@@ -11500,14 +11166,14 @@
       <w:pPr>
         <w:pStyle w:val="Heading3"/>
       </w:pPr>
-      <w:bookmarkStart w:id="35" w:name="_107f6c4597b9a8d7cba2af29250b40b9ff9b157"/>
+      <w:bookmarkStart w:id="38" w:name="_107f6c4597b9a8d7cba2af29250b40b9ff9b157"/>
       <w:r>
         <w:rPr>
           <w:lang w:val="vi-VN"/>
         </w:rPr>
         <w:t xml:space="preserve">FR-17 — Cấu hình chính sách đổi trả</w:t>
       </w:r>
-      <w:bookmarkEnd w:id="35"/>
+      <w:bookmarkEnd w:id="38"/>
     </w:p>
     <w:p>
       <w:pPr>
@@ -11841,27 +11507,27 @@
       <w:pPr>
         <w:pStyle w:val="Heading2"/>
       </w:pPr>
-      <w:bookmarkStart w:id="36" w:name="_85da0fc9d7f2b4423f253a8809dc46d21b9b5b2"/>
+      <w:bookmarkStart w:id="39" w:name="_85da0fc9d7f2b4423f253a8809dc46d21b9b5b2"/>
       <w:r>
         <w:rPr>
           <w:lang w:val="vi-VN"/>
         </w:rPr>
         <w:t xml:space="preserve">4. Yêu cầu phi chức năng</w:t>
       </w:r>
-      <w:bookmarkEnd w:id="36"/>
+      <w:bookmarkEnd w:id="39"/>
     </w:p>
     <w:p>
       <w:pPr>
         <w:pStyle w:val="Heading3"/>
       </w:pPr>
-      <w:bookmarkStart w:id="37" w:name="_935b419877e9e6fc606e6a0a8f6d2c220299cc9"/>
+      <w:bookmarkStart w:id="40" w:name="_935b419877e9e6fc606e6a0a8f6d2c220299cc9"/>
       <w:r>
         <w:rPr>
           <w:lang w:val="vi-VN"/>
         </w:rPr>
         <w:t xml:space="preserve">NFR-01 — Hiệu năng</w:t>
       </w:r>
-      <w:bookmarkEnd w:id="37"/>
+      <w:bookmarkEnd w:id="40"/>
     </w:p>
     <w:p>
       <w:pPr>
@@ -11925,14 +11591,14 @@
       <w:pPr>
         <w:pStyle w:val="Heading3"/>
       </w:pPr>
-      <w:bookmarkStart w:id="38" w:name="_dcc3b522a7159bb46edc266e9e9d5abd8aefd9d"/>
+      <w:bookmarkStart w:id="41" w:name="_dcc3b522a7159bb46edc266e9e9d5abd8aefd9d"/>
       <w:r>
         <w:rPr>
           <w:lang w:val="vi-VN"/>
         </w:rPr>
         <w:t xml:space="preserve">NFR-02 — Độ tin cậy đồng bộ</w:t>
       </w:r>
-      <w:bookmarkEnd w:id="38"/>
+      <w:bookmarkEnd w:id="41"/>
     </w:p>
     <w:p>
       <w:pPr>
@@ -11996,14 +11662,14 @@
       <w:pPr>
         <w:pStyle w:val="Heading3"/>
       </w:pPr>
-      <w:bookmarkStart w:id="39" w:name="_f5b7e50938eb1037d2850677716fb0afc1fb759"/>
+      <w:bookmarkStart w:id="42" w:name="_f5b7e50938eb1037d2850677716fb0afc1fb759"/>
       <w:r>
         <w:rPr>
           <w:lang w:val="vi-VN"/>
         </w:rPr>
         <w:t xml:space="preserve">NFR-03 — Bảo mật &amp; phân quyền</w:t>
       </w:r>
-      <w:bookmarkEnd w:id="39"/>
+      <w:bookmarkEnd w:id="42"/>
     </w:p>
     <w:p>
       <w:pPr>
@@ -12067,14 +11733,14 @@
       <w:pPr>
         <w:pStyle w:val="Heading3"/>
       </w:pPr>
-      <w:bookmarkStart w:id="40" w:name="_8f07bc4f65d71506cc4bbd56d9de2ce43f0ba50"/>
+      <w:bookmarkStart w:id="43" w:name="_8f07bc4f65d71506cc4bbd56d9de2ce43f0ba50"/>
       <w:r>
         <w:rPr>
           <w:lang w:val="vi-VN"/>
         </w:rPr>
         <w:t xml:space="preserve">NFR-04 — Audit log</w:t>
       </w:r>
-      <w:bookmarkEnd w:id="40"/>
+      <w:bookmarkEnd w:id="43"/>
     </w:p>
     <w:p>
       <w:pPr>
@@ -12138,14 +11804,14 @@
       <w:pPr>
         <w:pStyle w:val="Heading3"/>
       </w:pPr>
-      <w:bookmarkStart w:id="41" w:name="_29ad6d8c849ebb77f47273b0a2c97cba0c281be"/>
+      <w:bookmarkStart w:id="44" w:name="_29ad6d8c849ebb77f47273b0a2c97cba0c281be"/>
       <w:r>
         <w:rPr>
           <w:lang w:val="vi-VN"/>
         </w:rPr>
         <w:t xml:space="preserve">NFR-05 — Dữ liệu cá nhân</w:t>
       </w:r>
-      <w:bookmarkEnd w:id="41"/>
+      <w:bookmarkEnd w:id="44"/>
     </w:p>
     <w:p>
       <w:pPr>
@@ -12234,14 +11900,14 @@
       <w:pPr>
         <w:pStyle w:val="Heading3"/>
       </w:pPr>
-      <w:bookmarkStart w:id="42" w:name="_167bb8c0122dbe84cbebcc7d8bee62132ae6376"/>
+      <w:bookmarkStart w:id="45" w:name="_167bb8c0122dbe84cbebcc7d8bee62132ae6376"/>
       <w:r>
         <w:rPr>
           <w:lang w:val="vi-VN"/>
         </w:rPr>
         <w:t xml:space="preserve">NFR-06 — Tương thích &amp; responsive</w:t>
       </w:r>
-      <w:bookmarkEnd w:id="42"/>
+      <w:bookmarkEnd w:id="45"/>
     </w:p>
     <w:p>
       <w:pPr>
@@ -12305,14 +11971,14 @@
       <w:pPr>
         <w:pStyle w:val="Heading3"/>
       </w:pPr>
-      <w:bookmarkStart w:id="43" w:name="_76aa0c11c052d72f1a103b6b323a48dfb2f10f5"/>
+      <w:bookmarkStart w:id="46" w:name="_76aa0c11c052d72f1a103b6b323a48dfb2f10f5"/>
       <w:r>
         <w:rPr>
           <w:lang w:val="vi-VN"/>
         </w:rPr>
         <w:t xml:space="preserve">NFR-07 — Định dạng &amp; ngôn ngữ</w:t>
       </w:r>
-      <w:bookmarkEnd w:id="43"/>
+      <w:bookmarkEnd w:id="46"/>
     </w:p>
     <w:p>
       <w:pPr>
@@ -12439,14 +12105,14 @@
       <w:pPr>
         <w:pStyle w:val="Heading3"/>
       </w:pPr>
-      <w:bookmarkStart w:id="44" w:name="_9224edf8b3cabc39fded521a1d544e4a4115e06"/>
+      <w:bookmarkStart w:id="47" w:name="_9224edf8b3cabc39fded521a1d544e4a4115e06"/>
       <w:r>
         <w:rPr>
           <w:lang w:val="vi-VN"/>
         </w:rPr>
         <w:t xml:space="preserve">NFR-08 — Lưu trữ ảnh</w:t>
       </w:r>
-      <w:bookmarkEnd w:id="44"/>
+      <w:bookmarkEnd w:id="47"/>
     </w:p>
     <w:p>
       <w:pPr>
@@ -12510,27 +12176,27 @@
       <w:pPr>
         <w:pStyle w:val="Heading2"/>
       </w:pPr>
-      <w:bookmarkStart w:id="45" w:name="_e46a00b9d6a4520fa07e54378f2065f19cda772"/>
+      <w:bookmarkStart w:id="48" w:name="_e46a00b9d6a4520fa07e54378f2065f19cda772"/>
       <w:r>
         <w:rPr>
           <w:lang w:val="vi-VN"/>
         </w:rPr>
         <w:t xml:space="preserve">5. Tích hợp &amp; dữ liệu</w:t>
       </w:r>
-      <w:bookmarkEnd w:id="45"/>
+      <w:bookmarkEnd w:id="48"/>
     </w:p>
     <w:p>
       <w:pPr>
         <w:pStyle w:val="Heading3"/>
       </w:pPr>
-      <w:bookmarkStart w:id="46" w:name="_56b4754226bff1b4d85e3f11c477055a4dfb8c4"/>
+      <w:bookmarkStart w:id="49" w:name="_56b4754226bff1b4d85e3f11c477055a4dfb8c4"/>
       <w:r>
         <w:rPr>
           <w:lang w:val="vi-VN"/>
         </w:rPr>
         <w:t xml:space="preserve">5.1 Hệ thống ngoài</w:t>
       </w:r>
-      <w:bookmarkEnd w:id="46"/>
+      <w:bookmarkEnd w:id="49"/>
     </w:p>
     <w:tbl>
       <w:tblPr>
@@ -12985,14 +12651,14 @@
       <w:pPr>
         <w:pStyle w:val="Heading3"/>
       </w:pPr>
-      <w:bookmarkStart w:id="47" w:name="_api"/>
+      <w:bookmarkStart w:id="50" w:name="_api"/>
       <w:r>
         <w:rPr>
           <w:lang w:val="vi-VN"/>
         </w:rPr>
         <w:t xml:space="preserve">5.2 API</w:t>
       </w:r>
-      <w:bookmarkEnd w:id="47"/>
+      <w:bookmarkEnd w:id="50"/>
     </w:p>
     <w:tbl>
       <w:tblPr>
@@ -13376,14 +13042,14 @@
       <w:pPr>
         <w:pStyle w:val="Heading3"/>
       </w:pPr>
-      <w:bookmarkStart w:id="48" w:name="_bf87ca9ce394ab6b8982674458d2519ba4057dc"/>
+      <w:bookmarkStart w:id="51" w:name="_bf87ca9ce394ab6b8982674458d2519ba4057dc"/>
       <w:r>
         <w:rPr>
           <w:lang w:val="vi-VN"/>
         </w:rPr>
         <w:t xml:space="preserve">5.3 Mapping trường dữ liệu</w:t>
       </w:r>
-      <w:bookmarkEnd w:id="48"/>
+      <w:bookmarkEnd w:id="51"/>
     </w:p>
     <w:tbl>
       <w:tblPr>
@@ -14213,27 +13879,27 @@
       <w:pPr>
         <w:pStyle w:val="Heading2"/>
       </w:pPr>
-      <w:bookmarkStart w:id="49" w:name="_8df536b600d38404bda1aef8e8341995517e7bf"/>
+      <w:bookmarkStart w:id="52" w:name="_8df536b600d38404bda1aef8e8341995517e7bf"/>
       <w:r>
         <w:rPr>
           <w:lang w:val="vi-VN"/>
         </w:rPr>
         <w:t xml:space="preserve">6. Screen Inventory</w:t>
       </w:r>
-      <w:bookmarkEnd w:id="49"/>
+      <w:bookmarkEnd w:id="52"/>
     </w:p>
     <w:p>
       <w:pPr>
         <w:pStyle w:val="Heading3"/>
       </w:pPr>
-      <w:bookmarkStart w:id="50" w:name="_40131a2b303927d0764378fabb372bd0d2a436e"/>
+      <w:bookmarkStart w:id="53" w:name="_40131a2b303927d0764378fabb372bd0d2a436e"/>
       <w:r>
         <w:rPr>
           <w:lang w:val="vi-VN"/>
         </w:rPr>
         <w:t xml:space="preserve">6.1 Danh sách màn hình</w:t>
       </w:r>
-      <w:bookmarkEnd w:id="50"/>
+      <w:bookmarkEnd w:id="53"/>
     </w:p>
     <w:tbl>
       <w:tblPr>
@@ -15286,27 +14952,27 @@
       <w:pPr>
         <w:pStyle w:val="Heading3"/>
       </w:pPr>
-      <w:bookmarkStart w:id="51" w:name="_wireframe"/>
+      <w:bookmarkStart w:id="54" w:name="_wireframe"/>
       <w:r>
         <w:rPr>
           <w:lang w:val="vi-VN"/>
         </w:rPr>
         <w:t xml:space="preserve">6.2 Wireframe</w:t>
       </w:r>
-      <w:bookmarkEnd w:id="51"/>
+      <w:bookmarkEnd w:id="54"/>
     </w:p>
     <w:p>
       <w:pPr>
         <w:pStyle w:val="Heading4"/>
       </w:pPr>
-      <w:bookmarkStart w:id="52" w:name="_85c4fdabe5ef0370a145e48a50003cf42a61b90"/>
+      <w:bookmarkStart w:id="55" w:name="_85c4fdabe5ef0370a145e48a50003cf42a61b90"/>
       <w:r>
         <w:rPr>
           <w:lang w:val="vi-VN"/>
         </w:rPr>
         <w:t xml:space="preserve">SCR-01 — Đơn hàng của tôi</w:t>
       </w:r>
-      <w:bookmarkEnd w:id="52"/>
+      <w:bookmarkEnd w:id="55"/>
     </w:p>
     <w:p>
       <w:pPr>
@@ -15352,18 +15018,18 @@
           <wp:inline>
             <wp:extent cx="5334000" cy="3041120"/>
             <wp:effectExtent b="0" l="0" r="0" t="0"/>
-            <wp:docPr descr="SCR-01 — Đơn hàng của tôi" title="" id="54" name="Picture"/>
+            <wp:docPr descr="SCR-01 — Đơn hàng của tôi" title="" id="57" name="Picture"/>
             <a:graphic>
               <a:graphicData uri="http://schemas.openxmlformats.org/drawingml/2006/picture">
                 <pic:pic>
                   <pic:nvPicPr>
-                    <pic:cNvPr descr="ui/png/SCR-01-don-hang-cua-toi.png" id="55" name="Picture"/>
+                    <pic:cNvPr descr="ui/png/SCR-01-don-hang-cua-toi.png" id="58" name="Picture"/>
                     <pic:cNvPicPr>
                       <a:picLocks noChangeArrowheads="1" noChangeAspect="1"/>
                     </pic:cNvPicPr>
                   </pic:nvPicPr>
                   <pic:blipFill>
-                    <a:blip r:embed="rId53"/>
+                    <a:blip r:embed="rId56"/>
                     <a:stretch>
                       <a:fillRect/>
                     </a:stretch>
@@ -15410,18 +15076,18 @@
           <wp:inline>
             <wp:extent cx="5334000" cy="2907770"/>
             <wp:effectExtent b="0" l="0" r="0" t="0"/>
-            <wp:docPr descr="SCR-01 — Trạng thái: Rỗng" title="" id="57" name="Picture"/>
+            <wp:docPr descr="SCR-01 — Trạng thái: Rỗng" title="" id="60" name="Picture"/>
             <a:graphic>
               <a:graphicData uri="http://schemas.openxmlformats.org/drawingml/2006/picture">
                 <pic:pic>
                   <pic:nvPicPr>
-                    <pic:cNvPr descr="ui/png/SCR-01-don-hang-cua-toi--empty.png" id="58" name="Picture"/>
+                    <pic:cNvPr descr="ui/png/SCR-01-don-hang-cua-toi--empty.png" id="61" name="Picture"/>
                     <pic:cNvPicPr>
                       <a:picLocks noChangeArrowheads="1" noChangeAspect="1"/>
                     </pic:cNvPicPr>
                   </pic:nvPicPr>
                   <pic:blipFill>
-                    <a:blip r:embed="rId56"/>
+                    <a:blip r:embed="rId59"/>
                     <a:stretch>
                       <a:fillRect/>
                     </a:stretch>
@@ -15468,18 +15134,18 @@
           <wp:inline>
             <wp:extent cx="1681437" cy="7919999"/>
             <wp:effectExtent b="0" l="0" r="0" t="0"/>
-            <wp:docPr descr="SCR-01 — Mobile 390px" title="" id="60" name="Picture"/>
+            <wp:docPr descr="SCR-01 — Mobile 390px" title="" id="63" name="Picture"/>
             <a:graphic>
               <a:graphicData uri="http://schemas.openxmlformats.org/drawingml/2006/picture">
                 <pic:pic>
                   <pic:nvPicPr>
-                    <pic:cNvPr descr="ui/png/SCR-01-don-hang-cua-toi-mobile.png" id="61" name="Picture"/>
+                    <pic:cNvPr descr="ui/png/SCR-01-don-hang-cua-toi-mobile.png" id="64" name="Picture"/>
                     <pic:cNvPicPr>
                       <a:picLocks noChangeArrowheads="1" noChangeAspect="1"/>
                     </pic:cNvPicPr>
                   </pic:nvPicPr>
                   <pic:blipFill>
-                    <a:blip r:embed="rId59"/>
+                    <a:blip r:embed="rId62"/>
                     <a:stretch>
                       <a:fillRect/>
                     </a:stretch>
@@ -15526,18 +15192,18 @@
           <wp:inline>
             <wp:extent cx="2519999" cy="6784615"/>
             <wp:effectExtent b="0" l="0" r="0" t="0"/>
-            <wp:docPr descr="SCR-01 — Mobile 390px — Rỗng" title="" id="63" name="Picture"/>
+            <wp:docPr descr="SCR-01 — Mobile 390px — Rỗng" title="" id="66" name="Picture"/>
             <a:graphic>
               <a:graphicData uri="http://schemas.openxmlformats.org/drawingml/2006/picture">
                 <pic:pic>
                   <pic:nvPicPr>
-                    <pic:cNvPr descr="ui/png/SCR-01-don-hang-cua-toi--empty-mobile.png" id="64" name="Picture"/>
+                    <pic:cNvPr descr="ui/png/SCR-01-don-hang-cua-toi--empty-mobile.png" id="67" name="Picture"/>
                     <pic:cNvPicPr>
                       <a:picLocks noChangeArrowheads="1" noChangeAspect="1"/>
                     </pic:cNvPicPr>
                   </pic:nvPicPr>
                   <pic:blipFill>
-                    <a:blip r:embed="rId62"/>
+                    <a:blip r:embed="rId65"/>
                     <a:stretch>
                       <a:fillRect/>
                     </a:stretch>
@@ -15579,14 +15245,14 @@
       <w:pPr>
         <w:pStyle w:val="Heading4"/>
       </w:pPr>
-      <w:bookmarkStart w:id="65" w:name="_5f31e83088a8db71a6dfaee03ed6cb75b46adf2"/>
+      <w:bookmarkStart w:id="68" w:name="_5f31e83088a8db71a6dfaee03ed6cb75b46adf2"/>
       <w:r>
         <w:rPr>
           <w:lang w:val="vi-VN"/>
         </w:rPr>
         <w:t xml:space="preserve">SCR-02 — Tạo yêu cầu đổi trả</w:t>
       </w:r>
-      <w:bookmarkEnd w:id="65"/>
+      <w:bookmarkEnd w:id="68"/>
     </w:p>
     <w:p>
       <w:pPr>
@@ -15608,18 +15274,18 @@
           <wp:inline>
             <wp:extent cx="5334000" cy="6515629"/>
             <wp:effectExtent b="0" l="0" r="0" t="0"/>
-            <wp:docPr descr="SCR-02 — Tạo yêu cầu đổi trả" title="" id="67" name="Picture"/>
+            <wp:docPr descr="SCR-02 — Tạo yêu cầu đổi trả" title="" id="70" name="Picture"/>
             <a:graphic>
               <a:graphicData uri="http://schemas.openxmlformats.org/drawingml/2006/picture">
                 <pic:pic>
                   <pic:nvPicPr>
-                    <pic:cNvPr descr="ui/png/SCR-02-tao-yeu-cau-doi-tra.png" id="68" name="Picture"/>
+                    <pic:cNvPr descr="ui/png/SCR-02-tao-yeu-cau-doi-tra.png" id="71" name="Picture"/>
                     <pic:cNvPicPr>
                       <a:picLocks noChangeArrowheads="1" noChangeAspect="1"/>
                     </pic:cNvPicPr>
                   </pic:nvPicPr>
                   <pic:blipFill>
-                    <a:blip r:embed="rId66"/>
+                    <a:blip r:embed="rId69"/>
                     <a:stretch>
                       <a:fillRect/>
                     </a:stretch>
@@ -15666,18 +15332,18 @@
           <wp:inline>
             <wp:extent cx="5334000" cy="4678362"/>
             <wp:effectExtent b="0" l="0" r="0" t="0"/>
-            <wp:docPr descr="SCR-02 — Trạng thái: Lỗi validate" title="" id="70" name="Picture"/>
+            <wp:docPr descr="SCR-02 — Trạng thái: Lỗi validate" title="" id="73" name="Picture"/>
             <a:graphic>
               <a:graphicData uri="http://schemas.openxmlformats.org/drawingml/2006/picture">
                 <pic:pic>
                   <pic:nvPicPr>
-                    <pic:cNvPr descr="ui/png/SCR-02-tao-yeu-cau-doi-tra--error.png" id="71" name="Picture"/>
+                    <pic:cNvPr descr="ui/png/SCR-02-tao-yeu-cau-doi-tra--error.png" id="74" name="Picture"/>
                     <pic:cNvPicPr>
                       <a:picLocks noChangeArrowheads="1" noChangeAspect="1"/>
                     </pic:cNvPicPr>
                   </pic:nvPicPr>
                   <pic:blipFill>
-                    <a:blip r:embed="rId69"/>
+                    <a:blip r:embed="rId72"/>
                     <a:stretch>
                       <a:fillRect/>
                     </a:stretch>
@@ -15724,18 +15390,18 @@
           <wp:inline>
             <wp:extent cx="5334000" cy="2548466"/>
             <wp:effectExtent b="0" l="0" r="0" t="0"/>
-            <wp:docPr descr="SCR-02 — Trạng thái: Thành công" title="" id="73" name="Picture"/>
+            <wp:docPr descr="SCR-02 — Trạng thái: Thành công" title="" id="76" name="Picture"/>
             <a:graphic>
               <a:graphicData uri="http://schemas.openxmlformats.org/drawingml/2006/picture">
                 <pic:pic>
                   <pic:nvPicPr>
-                    <pic:cNvPr descr="ui/png/SCR-02-tao-yeu-cau-doi-tra--success.png" id="74" name="Picture"/>
+                    <pic:cNvPr descr="ui/png/SCR-02-tao-yeu-cau-doi-tra--success.png" id="77" name="Picture"/>
                     <pic:cNvPicPr>
                       <a:picLocks noChangeArrowheads="1" noChangeAspect="1"/>
                     </pic:cNvPicPr>
                   </pic:nvPicPr>
                   <pic:blipFill>
-                    <a:blip r:embed="rId72"/>
+                    <a:blip r:embed="rId75"/>
                     <a:stretch>
                       <a:fillRect/>
                     </a:stretch>
@@ -15782,18 +15448,18 @@
           <wp:inline>
             <wp:extent cx="1119536" cy="7919999"/>
             <wp:effectExtent b="0" l="0" r="0" t="0"/>
-            <wp:docPr descr="SCR-02 — Mobile 390px" title="" id="76" name="Picture"/>
+            <wp:docPr descr="SCR-02 — Mobile 390px" title="" id="79" name="Picture"/>
             <a:graphic>
               <a:graphicData uri="http://schemas.openxmlformats.org/drawingml/2006/picture">
                 <pic:pic>
                   <pic:nvPicPr>
-                    <pic:cNvPr descr="ui/png/SCR-02-tao-yeu-cau-doi-tra-mobile.png" id="77" name="Picture"/>
+                    <pic:cNvPr descr="ui/png/SCR-02-tao-yeu-cau-doi-tra-mobile.png" id="80" name="Picture"/>
                     <pic:cNvPicPr>
                       <a:picLocks noChangeArrowheads="1" noChangeAspect="1"/>
                     </pic:cNvPicPr>
                   </pic:nvPicPr>
                   <pic:blipFill>
-                    <a:blip r:embed="rId75"/>
+                    <a:blip r:embed="rId78"/>
                     <a:stretch>
                       <a:fillRect/>
                     </a:stretch>
@@ -15840,18 +15506,18 @@
           <wp:inline>
             <wp:extent cx="1833115" cy="7919999"/>
             <wp:effectExtent b="0" l="0" r="0" t="0"/>
-            <wp:docPr descr="SCR-02 — Mobile 390px — Lỗi validate" title="" id="79" name="Picture"/>
+            <wp:docPr descr="SCR-02 — Mobile 390px — Lỗi validate" title="" id="82" name="Picture"/>
             <a:graphic>
               <a:graphicData uri="http://schemas.openxmlformats.org/drawingml/2006/picture">
                 <pic:pic>
                   <pic:nvPicPr>
-                    <pic:cNvPr descr="ui/png/SCR-02-tao-yeu-cau-doi-tra--error-mobile.png" id="80" name="Picture"/>
+                    <pic:cNvPr descr="ui/png/SCR-02-tao-yeu-cau-doi-tra--error-mobile.png" id="83" name="Picture"/>
                     <pic:cNvPicPr>
                       <a:picLocks noChangeArrowheads="1" noChangeAspect="1"/>
                     </pic:cNvPicPr>
                   </pic:nvPicPr>
                   <pic:blipFill>
-                    <a:blip r:embed="rId78"/>
+                    <a:blip r:embed="rId81"/>
                     <a:stretch>
                       <a:fillRect/>
                     </a:stretch>
@@ -15898,18 +15564,18 @@
           <wp:inline>
             <wp:extent cx="2519999" cy="4419692"/>
             <wp:effectExtent b="0" l="0" r="0" t="0"/>
-            <wp:docPr descr="SCR-02 — Mobile 390px — Thành công" title="" id="82" name="Picture"/>
+            <wp:docPr descr="SCR-02 — Mobile 390px — Thành công" title="" id="85" name="Picture"/>
             <a:graphic>
               <a:graphicData uri="http://schemas.openxmlformats.org/drawingml/2006/picture">
                 <pic:pic>
                   <pic:nvPicPr>
-                    <pic:cNvPr descr="ui/png/SCR-02-tao-yeu-cau-doi-tra--success-mobile.png" id="83" name="Picture"/>
+                    <pic:cNvPr descr="ui/png/SCR-02-tao-yeu-cau-doi-tra--success-mobile.png" id="86" name="Picture"/>
                     <pic:cNvPicPr>
                       <a:picLocks noChangeArrowheads="1" noChangeAspect="1"/>
                     </pic:cNvPicPr>
                   </pic:nvPicPr>
                   <pic:blipFill>
-                    <a:blip r:embed="rId81"/>
+                    <a:blip r:embed="rId84"/>
                     <a:stretch>
                       <a:fillRect/>
                     </a:stretch>
@@ -15951,14 +15617,14 @@
       <w:pPr>
         <w:pStyle w:val="Heading4"/>
       </w:pPr>
-      <w:bookmarkStart w:id="84" w:name="_507fac87bacebc25408f3ede81ebb7135ae6fea"/>
+      <w:bookmarkStart w:id="87" w:name="_507fac87bacebc25408f3ede81ebb7135ae6fea"/>
       <w:r>
         <w:rPr>
           <w:lang w:val="vi-VN"/>
         </w:rPr>
         <w:t xml:space="preserve">SCR-03 — Yêu cầu đổi trả của tôi</w:t>
       </w:r>
-      <w:bookmarkEnd w:id="84"/>
+      <w:bookmarkEnd w:id="87"/>
     </w:p>
     <w:p>
       <w:pPr>
@@ -15980,18 +15646,18 @@
           <wp:inline>
             <wp:extent cx="5334000" cy="2941108"/>
             <wp:effectExtent b="0" l="0" r="0" t="0"/>
-            <wp:docPr descr="SCR-03 — Yêu cầu đổi trả của tôi" title="" id="86" name="Picture"/>
+            <wp:docPr descr="SCR-03 — Yêu cầu đổi trả của tôi" title="" id="89" name="Picture"/>
             <a:graphic>
               <a:graphicData uri="http://schemas.openxmlformats.org/drawingml/2006/picture">
                 <pic:pic>
                   <pic:nvPicPr>
-                    <pic:cNvPr descr="ui/png/SCR-03-yeu-cau-doi-tra-cua-toi.png" id="87" name="Picture"/>
+                    <pic:cNvPr descr="ui/png/SCR-03-yeu-cau-doi-tra-cua-toi.png" id="90" name="Picture"/>
                     <pic:cNvPicPr>
                       <a:picLocks noChangeArrowheads="1" noChangeAspect="1"/>
                     </pic:cNvPicPr>
                   </pic:nvPicPr>
                   <pic:blipFill>
-                    <a:blip r:embed="rId85"/>
+                    <a:blip r:embed="rId88"/>
                     <a:stretch>
                       <a:fillRect/>
                     </a:stretch>
@@ -16038,18 +15704,18 @@
           <wp:inline>
             <wp:extent cx="5334000" cy="2907770"/>
             <wp:effectExtent b="0" l="0" r="0" t="0"/>
-            <wp:docPr descr="SCR-03 — Trạng thái: Rỗng" title="" id="89" name="Picture"/>
+            <wp:docPr descr="SCR-03 — Trạng thái: Rỗng" title="" id="92" name="Picture"/>
             <a:graphic>
               <a:graphicData uri="http://schemas.openxmlformats.org/drawingml/2006/picture">
                 <pic:pic>
                   <pic:nvPicPr>
-                    <pic:cNvPr descr="ui/png/SCR-03-yeu-cau-doi-tra-cua-toi--empty.png" id="90" name="Picture"/>
+                    <pic:cNvPr descr="ui/png/SCR-03-yeu-cau-doi-tra-cua-toi--empty.png" id="93" name="Picture"/>
                     <pic:cNvPicPr>
                       <a:picLocks noChangeArrowheads="1" noChangeAspect="1"/>
                     </pic:cNvPicPr>
                   </pic:nvPicPr>
                   <pic:blipFill>
-                    <a:blip r:embed="rId88"/>
+                    <a:blip r:embed="rId91"/>
                     <a:stretch>
                       <a:fillRect/>
                     </a:stretch>
@@ -16096,18 +15762,18 @@
           <wp:inline>
             <wp:extent cx="1842959" cy="7919999"/>
             <wp:effectExtent b="0" l="0" r="0" t="0"/>
-            <wp:docPr descr="SCR-03 — Mobile 390px" title="" id="92" name="Picture"/>
+            <wp:docPr descr="SCR-03 — Mobile 390px" title="" id="95" name="Picture"/>
             <a:graphic>
               <a:graphicData uri="http://schemas.openxmlformats.org/drawingml/2006/picture">
                 <pic:pic>
                   <pic:nvPicPr>
-                    <pic:cNvPr descr="ui/png/SCR-03-yeu-cau-doi-tra-cua-toi-mobile.png" id="93" name="Picture"/>
+                    <pic:cNvPr descr="ui/png/SCR-03-yeu-cau-doi-tra-cua-toi-mobile.png" id="96" name="Picture"/>
                     <pic:cNvPicPr>
                       <a:picLocks noChangeArrowheads="1" noChangeAspect="1"/>
                     </pic:cNvPicPr>
                   </pic:nvPicPr>
                   <pic:blipFill>
-                    <a:blip r:embed="rId91"/>
+                    <a:blip r:embed="rId94"/>
                     <a:stretch>
                       <a:fillRect/>
                     </a:stretch>
@@ -16154,18 +15820,18 @@
           <wp:inline>
             <wp:extent cx="2519999" cy="6913846"/>
             <wp:effectExtent b="0" l="0" r="0" t="0"/>
-            <wp:docPr descr="SCR-03 — Mobile 390px — Rỗng" title="" id="95" name="Picture"/>
+            <wp:docPr descr="SCR-03 — Mobile 390px — Rỗng" title="" id="98" name="Picture"/>
             <a:graphic>
               <a:graphicData uri="http://schemas.openxmlformats.org/drawingml/2006/picture">
                 <pic:pic>
                   <pic:nvPicPr>
-                    <pic:cNvPr descr="ui/png/SCR-03-yeu-cau-doi-tra-cua-toi--empty-mobile.png" id="96" name="Picture"/>
+                    <pic:cNvPr descr="ui/png/SCR-03-yeu-cau-doi-tra-cua-toi--empty-mobile.png" id="99" name="Picture"/>
                     <pic:cNvPicPr>
                       <a:picLocks noChangeArrowheads="1" noChangeAspect="1"/>
                     </pic:cNvPicPr>
                   </pic:nvPicPr>
                   <pic:blipFill>
-                    <a:blip r:embed="rId94"/>
+                    <a:blip r:embed="rId97"/>
                     <a:stretch>
                       <a:fillRect/>
                     </a:stretch>
@@ -16207,14 +15873,14 @@
       <w:pPr>
         <w:pStyle w:val="Heading4"/>
       </w:pPr>
-      <w:bookmarkStart w:id="97" w:name="_39bab11df01cf8c550b5991c1f94967c602a123"/>
+      <w:bookmarkStart w:id="100" w:name="_39bab11df01cf8c550b5991c1f94967c602a123"/>
       <w:r>
         <w:rPr>
           <w:lang w:val="vi-VN"/>
         </w:rPr>
         <w:t xml:space="preserve">SCR-04 — Chi tiết yêu cầu đổi trả (khách)</w:t>
       </w:r>
-      <w:bookmarkEnd w:id="97"/>
+      <w:bookmarkEnd w:id="100"/>
     </w:p>
     <w:p>
       <w:pPr>
@@ -16236,18 +15902,18 @@
           <wp:inline>
             <wp:extent cx="5334000" cy="3411537"/>
             <wp:effectExtent b="0" l="0" r="0" t="0"/>
-            <wp:docPr descr="SCR-04 — Chi tiết yêu cầu đổi trả" title="" id="99" name="Picture"/>
+            <wp:docPr descr="SCR-04 — Chi tiết yêu cầu đổi trả" title="" id="102" name="Picture"/>
             <a:graphic>
               <a:graphicData uri="http://schemas.openxmlformats.org/drawingml/2006/picture">
                 <pic:pic>
                   <pic:nvPicPr>
-                    <pic:cNvPr descr="ui/png/SCR-04-chi-tiet-yeu-cau-doi-tra.png" id="100" name="Picture"/>
+                    <pic:cNvPr descr="ui/png/SCR-04-chi-tiet-yeu-cau-doi-tra.png" id="103" name="Picture"/>
                     <pic:cNvPicPr>
                       <a:picLocks noChangeArrowheads="1" noChangeAspect="1"/>
                     </pic:cNvPicPr>
                   </pic:nvPicPr>
                   <pic:blipFill>
-                    <a:blip r:embed="rId98"/>
+                    <a:blip r:embed="rId101"/>
                     <a:stretch>
                       <a:fillRect/>
                     </a:stretch>
@@ -16294,18 +15960,18 @@
           <wp:inline>
             <wp:extent cx="5334000" cy="2759604"/>
             <wp:effectExtent b="0" l="0" r="0" t="0"/>
-            <wp:docPr descr="SCR-04 — Trạng thái: Chờ duyệt – xác nhận huỷ" title="" id="102" name="Picture"/>
+            <wp:docPr descr="SCR-04 — Trạng thái: Chờ duyệt – xác nhận huỷ" title="" id="105" name="Picture"/>
             <a:graphic>
               <a:graphicData uri="http://schemas.openxmlformats.org/drawingml/2006/picture">
                 <pic:pic>
                   <pic:nvPicPr>
-                    <pic:cNvPr descr="ui/png/SCR-04-chi-tiet-yeu-cau-doi-tra--cancel.png" id="103" name="Picture"/>
+                    <pic:cNvPr descr="ui/png/SCR-04-chi-tiet-yeu-cau-doi-tra--cancel.png" id="106" name="Picture"/>
                     <pic:cNvPicPr>
                       <a:picLocks noChangeArrowheads="1" noChangeAspect="1"/>
                     </pic:cNvPicPr>
                   </pic:nvPicPr>
                   <pic:blipFill>
-                    <a:blip r:embed="rId101"/>
+                    <a:blip r:embed="rId104"/>
                     <a:stretch>
                       <a:fillRect/>
                     </a:stretch>
@@ -16352,18 +16018,18 @@
           <wp:inline>
             <wp:extent cx="5334000" cy="2548466"/>
             <wp:effectExtent b="0" l="0" r="0" t="0"/>
-            <wp:docPr descr="SCR-04 — Trạng thái: Từ chối" title="" id="105" name="Picture"/>
+            <wp:docPr descr="SCR-04 — Trạng thái: Từ chối" title="" id="108" name="Picture"/>
             <a:graphic>
               <a:graphicData uri="http://schemas.openxmlformats.org/drawingml/2006/picture">
                 <pic:pic>
                   <pic:nvPicPr>
-                    <pic:cNvPr descr="ui/png/SCR-04-chi-tiet-yeu-cau-doi-tra--rejected.png" id="106" name="Picture"/>
+                    <pic:cNvPr descr="ui/png/SCR-04-chi-tiet-yeu-cau-doi-tra--rejected.png" id="109" name="Picture"/>
                     <pic:cNvPicPr>
                       <a:picLocks noChangeArrowheads="1" noChangeAspect="1"/>
                     </pic:cNvPicPr>
                   </pic:nvPicPr>
                   <pic:blipFill>
-                    <a:blip r:embed="rId104"/>
+                    <a:blip r:embed="rId107"/>
                     <a:stretch>
                       <a:fillRect/>
                     </a:stretch>
@@ -16410,18 +16076,18 @@
           <wp:inline>
             <wp:extent cx="2387017" cy="7919999"/>
             <wp:effectExtent b="0" l="0" r="0" t="0"/>
-            <wp:docPr descr="SCR-04 — Mobile 390px" title="" id="108" name="Picture"/>
+            <wp:docPr descr="SCR-04 — Mobile 390px" title="" id="111" name="Picture"/>
             <a:graphic>
               <a:graphicData uri="http://schemas.openxmlformats.org/drawingml/2006/picture">
                 <pic:pic>
                   <pic:nvPicPr>
-                    <pic:cNvPr descr="ui/png/SCR-04-chi-tiet-yeu-cau-doi-tra-mobile.png" id="109" name="Picture"/>
+                    <pic:cNvPr descr="ui/png/SCR-04-chi-tiet-yeu-cau-doi-tra-mobile.png" id="112" name="Picture"/>
                     <pic:cNvPicPr>
                       <a:picLocks noChangeArrowheads="1" noChangeAspect="1"/>
                     </pic:cNvPicPr>
                   </pic:nvPicPr>
                   <pic:blipFill>
-                    <a:blip r:embed="rId107"/>
+                    <a:blip r:embed="rId110"/>
                     <a:stretch>
                       <a:fillRect/>
                     </a:stretch>
@@ -16468,18 +16134,18 @@
           <wp:inline>
             <wp:extent cx="2519999" cy="5214461"/>
             <wp:effectExtent b="0" l="0" r="0" t="0"/>
-            <wp:docPr descr="SCR-04 — Mobile 390px — Chờ duyệt – xác nhận huỷ" title="" id="111" name="Picture"/>
+            <wp:docPr descr="SCR-04 — Mobile 390px — Chờ duyệt – xác nhận huỷ" title="" id="114" name="Picture"/>
             <a:graphic>
               <a:graphicData uri="http://schemas.openxmlformats.org/drawingml/2006/picture">
                 <pic:pic>
                   <pic:nvPicPr>
-                    <pic:cNvPr descr="ui/png/SCR-04-chi-tiet-yeu-cau-doi-tra--cancel-mobile.png" id="112" name="Picture"/>
+                    <pic:cNvPr descr="ui/png/SCR-04-chi-tiet-yeu-cau-doi-tra--cancel-mobile.png" id="115" name="Picture"/>
                     <pic:cNvPicPr>
                       <a:picLocks noChangeArrowheads="1" noChangeAspect="1"/>
                     </pic:cNvPicPr>
                   </pic:nvPicPr>
                   <pic:blipFill>
-                    <a:blip r:embed="rId110"/>
+                    <a:blip r:embed="rId113"/>
                     <a:stretch>
                       <a:fillRect/>
                     </a:stretch>
@@ -16526,18 +16192,18 @@
           <wp:inline>
             <wp:extent cx="2519999" cy="4419692"/>
             <wp:effectExtent b="0" l="0" r="0" t="0"/>
-            <wp:docPr descr="SCR-04 — Mobile 390px — Từ chối" title="" id="114" name="Picture"/>
+            <wp:docPr descr="SCR-04 — Mobile 390px — Từ chối" title="" id="117" name="Picture"/>
             <a:graphic>
               <a:graphicData uri="http://schemas.openxmlformats.org/drawingml/2006/picture">
                 <pic:pic>
                   <pic:nvPicPr>
-                    <pic:cNvPr descr="ui/png/SCR-04-chi-tiet-yeu-cau-doi-tra--rejected-mobile.png" id="115" name="Picture"/>
+                    <pic:cNvPr descr="ui/png/SCR-04-chi-tiet-yeu-cau-doi-tra--rejected-mobile.png" id="118" name="Picture"/>
                     <pic:cNvPicPr>
                       <a:picLocks noChangeArrowheads="1" noChangeAspect="1"/>
                     </pic:cNvPicPr>
                   </pic:nvPicPr>
                   <pic:blipFill>
-                    <a:blip r:embed="rId113"/>
+                    <a:blip r:embed="rId116"/>
                     <a:stretch>
                       <a:fillRect/>
                     </a:stretch>
@@ -16579,14 +16245,14 @@
       <w:pPr>
         <w:pStyle w:val="Heading4"/>
       </w:pPr>
-      <w:bookmarkStart w:id="116" w:name="_5fb77d7d28878a570b8f15c79adbcdbae7038b7"/>
+      <w:bookmarkStart w:id="119" w:name="_5fb77d7d28878a570b8f15c79adbcdbae7038b7"/>
       <w:r>
         <w:rPr>
           <w:lang w:val="vi-VN"/>
         </w:rPr>
         <w:t xml:space="preserve">SCR-05 — Danh sách yêu cầu đổi trả (Odoo)</w:t>
       </w:r>
-      <w:bookmarkEnd w:id="116"/>
+      <w:bookmarkEnd w:id="119"/>
     </w:p>
     <w:p>
       <w:pPr>
@@ -16650,18 +16316,18 @@
           <wp:inline>
             <wp:extent cx="5334000" cy="3355975"/>
             <wp:effectExtent b="0" l="0" r="0" t="0"/>
-            <wp:docPr descr="SCR-05 — Danh sách yêu cầu đổi trả" title="" id="118" name="Picture"/>
+            <wp:docPr descr="SCR-05 — Danh sách yêu cầu đổi trả" title="" id="121" name="Picture"/>
             <a:graphic>
               <a:graphicData uri="http://schemas.openxmlformats.org/drawingml/2006/picture">
                 <pic:pic>
                   <pic:nvPicPr>
-                    <pic:cNvPr descr="ui/png/SCR-05-danh-sach-yeu-cau-odoo.png" id="119" name="Picture"/>
+                    <pic:cNvPr descr="ui/png/SCR-05-danh-sach-yeu-cau-odoo.png" id="122" name="Picture"/>
                     <pic:cNvPicPr>
                       <a:picLocks noChangeArrowheads="1" noChangeAspect="1"/>
                     </pic:cNvPicPr>
                   </pic:nvPicPr>
                   <pic:blipFill>
-                    <a:blip r:embed="rId117"/>
+                    <a:blip r:embed="rId120"/>
                     <a:stretch>
                       <a:fillRect/>
                     </a:stretch>
@@ -16708,18 +16374,18 @@
           <wp:inline>
             <wp:extent cx="5334000" cy="3359679"/>
             <wp:effectExtent b="0" l="0" r="0" t="0"/>
-            <wp:docPr descr="SCR-05 — Trạng thái: Mở bộ lọc" title="" id="121" name="Picture"/>
+            <wp:docPr descr="SCR-05 — Trạng thái: Mở bộ lọc" title="" id="124" name="Picture"/>
             <a:graphic>
               <a:graphicData uri="http://schemas.openxmlformats.org/drawingml/2006/picture">
                 <pic:pic>
                   <pic:nvPicPr>
-                    <pic:cNvPr descr="ui/png/SCR-05-danh-sach-yeu-cau-odoo--filter.png" id="122" name="Picture"/>
+                    <pic:cNvPr descr="ui/png/SCR-05-danh-sach-yeu-cau-odoo--filter.png" id="125" name="Picture"/>
                     <pic:cNvPicPr>
                       <a:picLocks noChangeArrowheads="1" noChangeAspect="1"/>
                     </pic:cNvPicPr>
                   </pic:nvPicPr>
                   <pic:blipFill>
-                    <a:blip r:embed="rId120"/>
+                    <a:blip r:embed="rId123"/>
                     <a:stretch>
                       <a:fillRect/>
                     </a:stretch>
@@ -16766,18 +16432,18 @@
           <wp:inline>
             <wp:extent cx="5334000" cy="3148541"/>
             <wp:effectExtent b="0" l="0" r="0" t="0"/>
-            <wp:docPr descr="SCR-05 — Trạng thái: Rỗng" title="" id="124" name="Picture"/>
+            <wp:docPr descr="SCR-05 — Trạng thái: Rỗng" title="" id="127" name="Picture"/>
             <a:graphic>
               <a:graphicData uri="http://schemas.openxmlformats.org/drawingml/2006/picture">
                 <pic:pic>
                   <pic:nvPicPr>
-                    <pic:cNvPr descr="ui/png/SCR-05-danh-sach-yeu-cau-odoo--empty.png" id="125" name="Picture"/>
+                    <pic:cNvPr descr="ui/png/SCR-05-danh-sach-yeu-cau-odoo--empty.png" id="128" name="Picture"/>
                     <pic:cNvPicPr>
                       <a:picLocks noChangeArrowheads="1" noChangeAspect="1"/>
                     </pic:cNvPicPr>
                   </pic:nvPicPr>
                   <pic:blipFill>
-                    <a:blip r:embed="rId123"/>
+                    <a:blip r:embed="rId126"/>
                     <a:stretch>
                       <a:fillRect/>
                     </a:stretch>
@@ -16819,14 +16485,14 @@
       <w:pPr>
         <w:pStyle w:val="Heading4"/>
       </w:pPr>
-      <w:bookmarkStart w:id="126" w:name="_ca7c672b66226b75a20214cd308a45e49e41667"/>
+      <w:bookmarkStart w:id="129" w:name="_ca7c672b66226b75a20214cd308a45e49e41667"/>
       <w:r>
         <w:rPr>
           <w:lang w:val="vi-VN"/>
         </w:rPr>
         <w:t xml:space="preserve">SCR-06 — Form yêu cầu đổi trả (Odoo)</w:t>
       </w:r>
-      <w:bookmarkEnd w:id="126"/>
+      <w:bookmarkEnd w:id="129"/>
     </w:p>
     <w:p>
       <w:pPr>
@@ -16848,18 +16514,18 @@
           <wp:inline>
             <wp:extent cx="5334000" cy="3355975"/>
             <wp:effectExtent b="0" l="0" r="0" t="0"/>
-            <wp:docPr descr="SCR-06 — Form yêu cầu đổi trả" title="" id="128" name="Picture"/>
+            <wp:docPr descr="SCR-06 — Form yêu cầu đổi trả" title="" id="131" name="Picture"/>
             <a:graphic>
               <a:graphicData uri="http://schemas.openxmlformats.org/drawingml/2006/picture">
                 <pic:pic>
                   <pic:nvPicPr>
-                    <pic:cNvPr descr="ui/png/SCR-06-form-yeu-cau-odoo.png" id="129" name="Picture"/>
+                    <pic:cNvPr descr="ui/png/SCR-06-form-yeu-cau-odoo.png" id="132" name="Picture"/>
                     <pic:cNvPicPr>
                       <a:picLocks noChangeArrowheads="1" noChangeAspect="1"/>
                     </pic:cNvPicPr>
                   </pic:nvPicPr>
                   <pic:blipFill>
-                    <a:blip r:embed="rId127"/>
+                    <a:blip r:embed="rId130"/>
                     <a:stretch>
                       <a:fillRect/>
                     </a:stretch>
@@ -16906,18 +16572,18 @@
           <wp:inline>
             <wp:extent cx="5334000" cy="3359679"/>
             <wp:effectExtent b="0" l="0" r="0" t="0"/>
-            <wp:docPr descr="SCR-06 — Trạng thái: Từ chối – lỗi thiếu lý do" title="" id="131" name="Picture"/>
+            <wp:docPr descr="SCR-06 — Trạng thái: Từ chối – lỗi thiếu lý do" title="" id="134" name="Picture"/>
             <a:graphic>
               <a:graphicData uri="http://schemas.openxmlformats.org/drawingml/2006/picture">
                 <pic:pic>
                   <pic:nvPicPr>
-                    <pic:cNvPr descr="ui/png/SCR-06-form-yeu-cau-odoo--reject-error.png" id="132" name="Picture"/>
+                    <pic:cNvPr descr="ui/png/SCR-06-form-yeu-cau-odoo--reject-error.png" id="135" name="Picture"/>
                     <pic:cNvPicPr>
                       <a:picLocks noChangeArrowheads="1" noChangeAspect="1"/>
                     </pic:cNvPicPr>
                   </pic:nvPicPr>
                   <pic:blipFill>
-                    <a:blip r:embed="rId130"/>
+                    <a:blip r:embed="rId133"/>
                     <a:stretch>
                       <a:fillRect/>
                     </a:stretch>
@@ -16964,18 +16630,18 @@
           <wp:inline>
             <wp:extent cx="5334000" cy="3430058"/>
             <wp:effectExtent b="0" l="0" r="0" t="0"/>
-            <wp:docPr descr="SCR-06 — Trạng thái: Đã duyệt" title="" id="134" name="Picture"/>
+            <wp:docPr descr="SCR-06 — Trạng thái: Đã duyệt" title="" id="137" name="Picture"/>
             <a:graphic>
               <a:graphicData uri="http://schemas.openxmlformats.org/drawingml/2006/picture">
                 <pic:pic>
                   <pic:nvPicPr>
-                    <pic:cNvPr descr="ui/png/SCR-06-form-yeu-cau-odoo--approved.png" id="135" name="Picture"/>
+                    <pic:cNvPr descr="ui/png/SCR-06-form-yeu-cau-odoo--approved.png" id="138" name="Picture"/>
                     <pic:cNvPicPr>
                       <a:picLocks noChangeArrowheads="1" noChangeAspect="1"/>
                     </pic:cNvPicPr>
                   </pic:nvPicPr>
                   <pic:blipFill>
-                    <a:blip r:embed="rId133"/>
+                    <a:blip r:embed="rId136"/>
                     <a:stretch>
                       <a:fillRect/>
                     </a:stretch>
@@ -17017,14 +16683,14 @@
       <w:pPr>
         <w:pStyle w:val="Heading4"/>
       </w:pPr>
-      <w:bookmarkStart w:id="136" w:name="_89a4381ea50249810ac71bb105c7dd217a412e7"/>
+      <w:bookmarkStart w:id="139" w:name="_89a4381ea50249810ac71bb105c7dd217a412e7"/>
       <w:r>
         <w:rPr>
           <w:lang w:val="vi-VN"/>
         </w:rPr>
         <w:t xml:space="preserve">SCR-07 — Nhận hàng &amp; kiểm tra (Odoo)</w:t>
       </w:r>
-      <w:bookmarkEnd w:id="136"/>
+      <w:bookmarkEnd w:id="139"/>
     </w:p>
     <w:p>
       <w:pPr>
@@ -17046,18 +16712,18 @@
           <wp:inline>
             <wp:extent cx="5334000" cy="3496733"/>
             <wp:effectExtent b="0" l="0" r="0" t="0"/>
-            <wp:docPr descr="SCR-07 — Nhận hàng &amp; kiểm tra" title="" id="138" name="Picture"/>
+            <wp:docPr descr="SCR-07 — Nhận hàng &amp; kiểm tra" title="" id="141" name="Picture"/>
             <a:graphic>
               <a:graphicData uri="http://schemas.openxmlformats.org/drawingml/2006/picture">
                 <pic:pic>
                   <pic:nvPicPr>
-                    <pic:cNvPr descr="ui/png/SCR-07-nhan-hang-kiem-tra.png" id="139" name="Picture"/>
+                    <pic:cNvPr descr="ui/png/SCR-07-nhan-hang-kiem-tra.png" id="142" name="Picture"/>
                     <pic:cNvPicPr>
                       <a:picLocks noChangeArrowheads="1" noChangeAspect="1"/>
                     </pic:cNvPicPr>
                   </pic:nvPicPr>
                   <pic:blipFill>
-                    <a:blip r:embed="rId137"/>
+                    <a:blip r:embed="rId140"/>
                     <a:stretch>
                       <a:fillRect/>
                     </a:stretch>
@@ -17104,18 +16770,18 @@
           <wp:inline>
             <wp:extent cx="5334000" cy="3148541"/>
             <wp:effectExtent b="0" l="0" r="0" t="0"/>
-            <wp:docPr descr="SCR-07 — Trạng thái: Lỗi (mã không hợp lệ / thiếu tình trạng)" title="" id="141" name="Picture"/>
+            <wp:docPr descr="SCR-07 — Trạng thái: Lỗi (mã không hợp lệ / thiếu tình trạng)" title="" id="144" name="Picture"/>
             <a:graphic>
               <a:graphicData uri="http://schemas.openxmlformats.org/drawingml/2006/picture">
                 <pic:pic>
                   <pic:nvPicPr>
-                    <pic:cNvPr descr="ui/png/SCR-07-nhan-hang-kiem-tra--error.png" id="142" name="Picture"/>
+                    <pic:cNvPr descr="ui/png/SCR-07-nhan-hang-kiem-tra--error.png" id="145" name="Picture"/>
                     <pic:cNvPicPr>
                       <a:picLocks noChangeArrowheads="1" noChangeAspect="1"/>
                     </pic:cNvPicPr>
                   </pic:nvPicPr>
                   <pic:blipFill>
-                    <a:blip r:embed="rId140"/>
+                    <a:blip r:embed="rId143"/>
                     <a:stretch>
                       <a:fillRect/>
                     </a:stretch>
@@ -17157,14 +16823,14 @@
       <w:pPr>
         <w:pStyle w:val="Heading4"/>
       </w:pPr>
-      <w:bookmarkStart w:id="143" w:name="_faf1187956de3db4a680bc95acccc38ec48babe"/>
+      <w:bookmarkStart w:id="146" w:name="_faf1187956de3db4a680bc95acccc38ec48babe"/>
       <w:r>
         <w:rPr>
           <w:lang w:val="vi-VN"/>
         </w:rPr>
         <w:t xml:space="preserve">SCR-08 — Báo cáo đổi trả theo lý do (Odoo)</w:t>
       </w:r>
-      <w:bookmarkEnd w:id="143"/>
+      <w:bookmarkEnd w:id="146"/>
     </w:p>
     <w:p>
       <w:pPr>
@@ -17186,18 +16852,18 @@
           <wp:inline>
             <wp:extent cx="5334000" cy="3415241"/>
             <wp:effectExtent b="0" l="0" r="0" t="0"/>
-            <wp:docPr descr="SCR-08 — Báo cáo đổi trả theo lý do" title="" id="145" name="Picture"/>
+            <wp:docPr descr="SCR-08 — Báo cáo đổi trả theo lý do" title="" id="148" name="Picture"/>
             <a:graphic>
               <a:graphicData uri="http://schemas.openxmlformats.org/drawingml/2006/picture">
                 <pic:pic>
                   <pic:nvPicPr>
-                    <pic:cNvPr descr="ui/png/SCR-08-bao-cao-doi-tra.png" id="146" name="Picture"/>
+                    <pic:cNvPr descr="ui/png/SCR-08-bao-cao-doi-tra.png" id="149" name="Picture"/>
                     <pic:cNvPicPr>
                       <a:picLocks noChangeArrowheads="1" noChangeAspect="1"/>
                     </pic:cNvPicPr>
                   </pic:nvPicPr>
                   <pic:blipFill>
-                    <a:blip r:embed="rId144"/>
+                    <a:blip r:embed="rId147"/>
                     <a:stretch>
                       <a:fillRect/>
                     </a:stretch>
@@ -17239,14 +16905,14 @@
       <w:pPr>
         <w:pStyle w:val="Heading2"/>
       </w:pPr>
-      <w:bookmarkStart w:id="147" w:name="_0d0f0250303c791bed9833b1f82066d3a36bff0"/>
+      <w:bookmarkStart w:id="150" w:name="_0d0f0250303c791bed9833b1f82066d3a36bff0"/>
       <w:r>
         <w:rPr>
           <w:lang w:val="vi-VN"/>
         </w:rPr>
         <w:t xml:space="preserve">7. User flow</w:t>
       </w:r>
-      <w:bookmarkEnd w:id="147"/>
+      <w:bookmarkEnd w:id="150"/>
     </w:p>
     <w:p>
       <w:pPr>
@@ -17261,1171 +16927,60 @@
     </w:p>
     <w:p>
       <w:pPr>
-        <w:pStyle w:val="SourceCode"/>
-      </w:pPr>
-      <w:r>
-        <w:rPr>
-          <w:rStyle w:val="KeywordTok"/>
-        </w:rPr>
-        <w:t xml:space="preserve">flowchart</w:t>
-      </w:r>
-      <w:r>
-        <w:rPr>
-          <w:rStyle w:val="NormalTok"/>
-        </w:rPr>
-        <w:t xml:space="preserve"> </w:t>
-      </w:r>
-      <w:r>
-        <w:rPr>
-          <w:rStyle w:val="ConstantTok"/>
-        </w:rPr>
-        <w:t xml:space="preserve">TD</w:t>
-      </w:r>
-      <w:r>
-        <w:br/>
-      </w:r>
-      <w:r>
-        <w:rPr>
-          <w:rStyle w:val="NormalTok"/>
-        </w:rPr>
-        <w:t xml:space="preserve">  </w:t>
-      </w:r>
-      <w:r>
-        <w:rPr>
-          <w:rStyle w:val="DataTypeTok"/>
-        </w:rPr>
-        <w:t xml:space="preserve">A</w:t>
-      </w:r>
-      <w:r>
-        <w:rPr>
-          <w:rStyle w:val="NormalTok"/>
-        </w:rPr>
-        <w:t xml:space="preserve">[</w:t>
-      </w:r>
-      <w:r>
-        <w:rPr>
-          <w:rStyle w:val="VerbatimStringTok"/>
-        </w:rPr>
-        <w:t xml:space="preserve">SCR-01 Đơn hàng của tôi</w:t>
-      </w:r>
-      <w:r>
-        <w:rPr>
-          <w:rStyle w:val="NormalTok"/>
-        </w:rPr>
-        <w:t xml:space="preserve">] </w:t>
-      </w:r>
-      <w:r>
-        <w:rPr>
-          <w:rStyle w:val="PreprocessorTok"/>
-        </w:rPr>
-        <w:t xml:space="preserve">--&gt;</w:t>
-      </w:r>
-      <w:r>
-        <w:rPr>
-          <w:rStyle w:val="NormalTok"/>
-        </w:rPr>
-        <w:t xml:space="preserve"> </w:t>
-      </w:r>
-      <w:r>
-        <w:rPr>
-          <w:rStyle w:val="DataTypeTok"/>
-        </w:rPr>
-        <w:t xml:space="preserve">B</w:t>
-      </w:r>
-      <w:r>
-        <w:rPr>
-          <w:rStyle w:val="NormalTok"/>
-        </w:rPr>
-        <w:t xml:space="preserve">{</w:t>
-      </w:r>
-      <w:r>
-        <w:rPr>
-          <w:rStyle w:val="VerbatimStringTok"/>
-        </w:rPr>
-        <w:t xml:space="preserve">Đơn đủ điều kiện?</w:t>
-      </w:r>
-      <w:r>
-        <w:rPr>
-          <w:rStyle w:val="NormalTok"/>
-        </w:rPr>
-        <w:t xml:space="preserve">}</w:t>
-      </w:r>
-      <w:r>
-        <w:br/>
-      </w:r>
-      <w:r>
-        <w:rPr>
-          <w:rStyle w:val="NormalTok"/>
-        </w:rPr>
-        <w:t xml:space="preserve">  </w:t>
-      </w:r>
-      <w:r>
-        <w:rPr>
-          <w:rStyle w:val="DataTypeTok"/>
-        </w:rPr>
-        <w:t xml:space="preserve">B</w:t>
-      </w:r>
-      <w:r>
-        <w:rPr>
-          <w:rStyle w:val="NormalTok"/>
-        </w:rPr>
-        <w:t xml:space="preserve"> </w:t>
-      </w:r>
-      <w:r>
-        <w:rPr>
-          <w:rStyle w:val="PreprocessorTok"/>
-        </w:rPr>
-        <w:t xml:space="preserve">--</w:t>
-      </w:r>
-      <w:r>
-        <w:rPr>
-          <w:rStyle w:val="NormalTok"/>
-        </w:rPr>
-        <w:t xml:space="preserve"> </w:t>
-      </w:r>
-      <w:r>
-        <w:rPr>
-          <w:rStyle w:val="VerbatimStringTok"/>
-        </w:rPr>
-        <w:t xml:space="preserve">Không </w:t>
-      </w:r>
-      <w:r>
-        <w:rPr>
-          <w:rStyle w:val="PreprocessorTok"/>
-        </w:rPr>
-        <w:t xml:space="preserve">--&gt;</w:t>
-      </w:r>
-      <w:r>
-        <w:rPr>
-          <w:rStyle w:val="NormalTok"/>
-        </w:rPr>
-        <w:t xml:space="preserve"> </w:t>
-      </w:r>
-      <w:r>
-        <w:rPr>
-          <w:rStyle w:val="DataTypeTok"/>
-        </w:rPr>
-        <w:t xml:space="preserve">B1</w:t>
-      </w:r>
-      <w:r>
-        <w:rPr>
-          <w:rStyle w:val="NormalTok"/>
-        </w:rPr>
-        <w:t xml:space="preserve">[</w:t>
-      </w:r>
-      <w:r>
-        <w:rPr>
-          <w:rStyle w:val="VerbatimStringTok"/>
-        </w:rPr>
-        <w:t xml:space="preserve">Ẩn nút, hiện lý do</w:t>
-      </w:r>
-      <w:r>
-        <w:rPr>
-          <w:rStyle w:val="NormalTok"/>
-        </w:rPr>
-        <w:t xml:space="preserve">]</w:t>
-      </w:r>
-      <w:r>
-        <w:br/>
-      </w:r>
-      <w:r>
-        <w:rPr>
-          <w:rStyle w:val="NormalTok"/>
-        </w:rPr>
-        <w:t xml:space="preserve">  </w:t>
-      </w:r>
-      <w:r>
-        <w:rPr>
-          <w:rStyle w:val="DataTypeTok"/>
-        </w:rPr>
-        <w:t xml:space="preserve">B</w:t>
-      </w:r>
-      <w:r>
-        <w:rPr>
-          <w:rStyle w:val="NormalTok"/>
-        </w:rPr>
-        <w:t xml:space="preserve"> </w:t>
-      </w:r>
-      <w:r>
-        <w:rPr>
-          <w:rStyle w:val="PreprocessorTok"/>
-        </w:rPr>
-        <w:t xml:space="preserve">--</w:t>
-      </w:r>
-      <w:r>
-        <w:rPr>
-          <w:rStyle w:val="NormalTok"/>
-        </w:rPr>
-        <w:t xml:space="preserve"> </w:t>
-      </w:r>
-      <w:r>
-        <w:rPr>
-          <w:rStyle w:val="VerbatimStringTok"/>
-        </w:rPr>
-        <w:t xml:space="preserve">Có </w:t>
-      </w:r>
-      <w:r>
-        <w:rPr>
-          <w:rStyle w:val="PreprocessorTok"/>
-        </w:rPr>
-        <w:t xml:space="preserve">--&gt;</w:t>
-      </w:r>
-      <w:r>
-        <w:rPr>
-          <w:rStyle w:val="NormalTok"/>
-        </w:rPr>
-        <w:t xml:space="preserve"> </w:t>
-      </w:r>
-      <w:r>
-        <w:rPr>
-          <w:rStyle w:val="DataTypeTok"/>
-        </w:rPr>
-        <w:t xml:space="preserve">C</w:t>
-      </w:r>
-      <w:r>
-        <w:rPr>
-          <w:rStyle w:val="NormalTok"/>
-        </w:rPr>
-        <w:t xml:space="preserve">[</w:t>
-      </w:r>
-      <w:r>
-        <w:rPr>
-          <w:rStyle w:val="VerbatimStringTok"/>
-        </w:rPr>
-        <w:t xml:space="preserve">SCR-02 Tạo yêu cầu</w:t>
-      </w:r>
-      <w:r>
-        <w:rPr>
-          <w:rStyle w:val="NormalTok"/>
-        </w:rPr>
-        <w:t xml:space="preserve">]</w:t>
-      </w:r>
-      <w:r>
-        <w:br/>
-      </w:r>
-      <w:r>
-        <w:rPr>
-          <w:rStyle w:val="NormalTok"/>
-        </w:rPr>
-        <w:t xml:space="preserve">  </w:t>
-      </w:r>
-      <w:r>
-        <w:rPr>
-          <w:rStyle w:val="DataTypeTok"/>
-        </w:rPr>
-        <w:t xml:space="preserve">C</w:t>
-      </w:r>
-      <w:r>
-        <w:rPr>
-          <w:rStyle w:val="NormalTok"/>
-        </w:rPr>
-        <w:t xml:space="preserve"> </w:t>
-      </w:r>
-      <w:r>
-        <w:rPr>
-          <w:rStyle w:val="PreprocessorTok"/>
-        </w:rPr>
-        <w:t xml:space="preserve">--&gt;</w:t>
-      </w:r>
-      <w:r>
-        <w:rPr>
-          <w:rStyle w:val="NormalTok"/>
-        </w:rPr>
-        <w:t xml:space="preserve"> </w:t>
-      </w:r>
-      <w:r>
-        <w:rPr>
-          <w:rStyle w:val="DataTypeTok"/>
-        </w:rPr>
-        <w:t xml:space="preserve">D</w:t>
-      </w:r>
-      <w:r>
-        <w:rPr>
-          <w:rStyle w:val="NormalTok"/>
-        </w:rPr>
-        <w:t xml:space="preserve">{</w:t>
-      </w:r>
-      <w:r>
-        <w:rPr>
-          <w:rStyle w:val="VerbatimStringTok"/>
-        </w:rPr>
-        <w:t xml:space="preserve">Hợp lệ?</w:t>
-      </w:r>
-      <w:r>
-        <w:rPr>
-          <w:rStyle w:val="NormalTok"/>
-        </w:rPr>
-        <w:t xml:space="preserve">}</w:t>
-      </w:r>
-      <w:r>
-        <w:br/>
-      </w:r>
-      <w:r>
-        <w:rPr>
-          <w:rStyle w:val="NormalTok"/>
-        </w:rPr>
-        <w:t xml:space="preserve">  </w:t>
-      </w:r>
-      <w:r>
-        <w:rPr>
-          <w:rStyle w:val="DataTypeTok"/>
-        </w:rPr>
-        <w:t xml:space="preserve">D</w:t>
-      </w:r>
-      <w:r>
-        <w:rPr>
-          <w:rStyle w:val="NormalTok"/>
-        </w:rPr>
-        <w:t xml:space="preserve"> </w:t>
-      </w:r>
-      <w:r>
-        <w:rPr>
-          <w:rStyle w:val="PreprocessorTok"/>
-        </w:rPr>
-        <w:t xml:space="preserve">--</w:t>
-      </w:r>
-      <w:r>
-        <w:rPr>
-          <w:rStyle w:val="NormalTok"/>
-        </w:rPr>
-        <w:t xml:space="preserve"> </w:t>
-      </w:r>
-      <w:r>
-        <w:rPr>
-          <w:rStyle w:val="VerbatimStringTok"/>
-        </w:rPr>
-        <w:t xml:space="preserve">Không </w:t>
-      </w:r>
-      <w:r>
-        <w:rPr>
-          <w:rStyle w:val="PreprocessorTok"/>
-        </w:rPr>
-        <w:t xml:space="preserve">--&gt;</w:t>
-      </w:r>
-      <w:r>
-        <w:rPr>
-          <w:rStyle w:val="NormalTok"/>
-        </w:rPr>
-        <w:t xml:space="preserve"> </w:t>
-      </w:r>
-      <w:r>
-        <w:rPr>
-          <w:rStyle w:val="DataTypeTok"/>
-        </w:rPr>
-        <w:t xml:space="preserve">C</w:t>
-      </w:r>
-      <w:r>
-        <w:br/>
-      </w:r>
-      <w:r>
-        <w:rPr>
-          <w:rStyle w:val="NormalTok"/>
-        </w:rPr>
-        <w:t xml:space="preserve">  </w:t>
-      </w:r>
-      <w:r>
-        <w:rPr>
-          <w:rStyle w:val="DataTypeTok"/>
-        </w:rPr>
-        <w:t xml:space="preserve">D</w:t>
-      </w:r>
-      <w:r>
-        <w:rPr>
-          <w:rStyle w:val="NormalTok"/>
-        </w:rPr>
-        <w:t xml:space="preserve"> </w:t>
-      </w:r>
-      <w:r>
-        <w:rPr>
-          <w:rStyle w:val="PreprocessorTok"/>
-        </w:rPr>
-        <w:t xml:space="preserve">--</w:t>
-      </w:r>
-      <w:r>
-        <w:rPr>
-          <w:rStyle w:val="NormalTok"/>
-        </w:rPr>
-        <w:t xml:space="preserve"> </w:t>
-      </w:r>
-      <w:r>
-        <w:rPr>
-          <w:rStyle w:val="VerbatimStringTok"/>
-        </w:rPr>
-        <w:t xml:space="preserve">Có </w:t>
-      </w:r>
-      <w:r>
-        <w:rPr>
-          <w:rStyle w:val="PreprocessorTok"/>
-        </w:rPr>
-        <w:t xml:space="preserve">--&gt;</w:t>
-      </w:r>
-      <w:r>
-        <w:rPr>
-          <w:rStyle w:val="NormalTok"/>
-        </w:rPr>
-        <w:t xml:space="preserve"> </w:t>
-      </w:r>
-      <w:r>
-        <w:rPr>
-          <w:rStyle w:val="DataTypeTok"/>
-        </w:rPr>
-        <w:t xml:space="preserve">E</w:t>
-      </w:r>
-      <w:r>
-        <w:rPr>
-          <w:rStyle w:val="NormalTok"/>
-        </w:rPr>
-        <w:t xml:space="preserve">[</w:t>
-      </w:r>
-      <w:r>
-        <w:rPr>
-          <w:rStyle w:val="VerbatimStringTok"/>
-        </w:rPr>
-        <w:t xml:space="preserve">Yêu cầu Mới, đồng bộ Odoo</w:t>
-      </w:r>
-      <w:r>
-        <w:rPr>
-          <w:rStyle w:val="NormalTok"/>
-        </w:rPr>
-        <w:t xml:space="preserve">]</w:t>
-      </w:r>
-      <w:r>
-        <w:br/>
-      </w:r>
-      <w:r>
-        <w:rPr>
-          <w:rStyle w:val="NormalTok"/>
-        </w:rPr>
-        <w:t xml:space="preserve">  </w:t>
-      </w:r>
-      <w:r>
-        <w:rPr>
-          <w:rStyle w:val="DataTypeTok"/>
-        </w:rPr>
-        <w:t xml:space="preserve">E</w:t>
-      </w:r>
-      <w:r>
-        <w:rPr>
-          <w:rStyle w:val="NormalTok"/>
-        </w:rPr>
-        <w:t xml:space="preserve"> </w:t>
-      </w:r>
-      <w:r>
-        <w:rPr>
-          <w:rStyle w:val="PreprocessorTok"/>
-        </w:rPr>
-        <w:t xml:space="preserve">--&gt;</w:t>
-      </w:r>
-      <w:r>
-        <w:rPr>
-          <w:rStyle w:val="NormalTok"/>
-        </w:rPr>
-        <w:t xml:space="preserve"> </w:t>
-      </w:r>
-      <w:r>
-        <w:rPr>
-          <w:rStyle w:val="DataTypeTok"/>
-        </w:rPr>
-        <w:t xml:space="preserve">F</w:t>
-      </w:r>
-      <w:r>
-        <w:rPr>
-          <w:rStyle w:val="NormalTok"/>
-        </w:rPr>
-        <w:t xml:space="preserve">[</w:t>
-      </w:r>
-      <w:r>
-        <w:rPr>
-          <w:rStyle w:val="VerbatimStringTok"/>
-        </w:rPr>
-        <w:t xml:space="preserve">SCR-05 CSKH thấy Chờ duyệt</w:t>
-      </w:r>
-      <w:r>
-        <w:rPr>
-          <w:rStyle w:val="NormalTok"/>
-        </w:rPr>
-        <w:t xml:space="preserve">]</w:t>
-      </w:r>
-      <w:r>
-        <w:br/>
-      </w:r>
-      <w:r>
-        <w:rPr>
-          <w:rStyle w:val="NormalTok"/>
-        </w:rPr>
-        <w:t xml:space="preserve">  </w:t>
-      </w:r>
-      <w:r>
-        <w:rPr>
-          <w:rStyle w:val="DataTypeTok"/>
-        </w:rPr>
-        <w:t xml:space="preserve">F</w:t>
-      </w:r>
-      <w:r>
-        <w:rPr>
-          <w:rStyle w:val="NormalTok"/>
-        </w:rPr>
-        <w:t xml:space="preserve"> </w:t>
-      </w:r>
-      <w:r>
-        <w:rPr>
-          <w:rStyle w:val="PreprocessorTok"/>
-        </w:rPr>
-        <w:t xml:space="preserve">--&gt;</w:t>
-      </w:r>
-      <w:r>
-        <w:rPr>
-          <w:rStyle w:val="NormalTok"/>
-        </w:rPr>
-        <w:t xml:space="preserve"> </w:t>
-      </w:r>
-      <w:r>
-        <w:rPr>
-          <w:rStyle w:val="DataTypeTok"/>
-        </w:rPr>
-        <w:t xml:space="preserve">G</w:t>
-      </w:r>
-      <w:r>
-        <w:rPr>
-          <w:rStyle w:val="NormalTok"/>
-        </w:rPr>
-        <w:t xml:space="preserve">[</w:t>
-      </w:r>
-      <w:r>
-        <w:rPr>
-          <w:rStyle w:val="VerbatimStringTok"/>
-        </w:rPr>
-        <w:t xml:space="preserve">SCR-06 Form yêu cầu</w:t>
-      </w:r>
-      <w:r>
-        <w:rPr>
-          <w:rStyle w:val="NormalTok"/>
-        </w:rPr>
-        <w:t xml:space="preserve">]</w:t>
-      </w:r>
-      <w:r>
-        <w:br/>
-      </w:r>
-      <w:r>
-        <w:rPr>
-          <w:rStyle w:val="NormalTok"/>
-        </w:rPr>
-        <w:t xml:space="preserve">  </w:t>
-      </w:r>
-      <w:r>
-        <w:rPr>
-          <w:rStyle w:val="DataTypeTok"/>
-        </w:rPr>
-        <w:t xml:space="preserve">G</w:t>
-      </w:r>
-      <w:r>
-        <w:rPr>
-          <w:rStyle w:val="NormalTok"/>
-        </w:rPr>
-        <w:t xml:space="preserve"> </w:t>
-      </w:r>
-      <w:r>
-        <w:rPr>
-          <w:rStyle w:val="PreprocessorTok"/>
-        </w:rPr>
-        <w:t xml:space="preserve">--&gt;</w:t>
-      </w:r>
-      <w:r>
-        <w:rPr>
-          <w:rStyle w:val="NormalTok"/>
-        </w:rPr>
-        <w:t xml:space="preserve"> </w:t>
-      </w:r>
-      <w:r>
-        <w:rPr>
-          <w:rStyle w:val="DataTypeTok"/>
-        </w:rPr>
-        <w:t xml:space="preserve">H</w:t>
-      </w:r>
-      <w:r>
-        <w:rPr>
-          <w:rStyle w:val="NormalTok"/>
-        </w:rPr>
-        <w:t xml:space="preserve">{</w:t>
-      </w:r>
-      <w:r>
-        <w:rPr>
-          <w:rStyle w:val="VerbatimStringTok"/>
-        </w:rPr>
-        <w:t xml:space="preserve">CSKH quyết định</w:t>
-      </w:r>
-      <w:r>
-        <w:rPr>
-          <w:rStyle w:val="NormalTok"/>
-        </w:rPr>
-        <w:t xml:space="preserve">}</w:t>
-      </w:r>
-      <w:r>
-        <w:br/>
-      </w:r>
-      <w:r>
-        <w:rPr>
-          <w:rStyle w:val="NormalTok"/>
-        </w:rPr>
-        <w:t xml:space="preserve">  </w:t>
-      </w:r>
-      <w:r>
-        <w:rPr>
-          <w:rStyle w:val="DataTypeTok"/>
-        </w:rPr>
-        <w:t xml:space="preserve">H</w:t>
-      </w:r>
-      <w:r>
-        <w:rPr>
-          <w:rStyle w:val="NormalTok"/>
-        </w:rPr>
-        <w:t xml:space="preserve"> </w:t>
-      </w:r>
-      <w:r>
-        <w:rPr>
-          <w:rStyle w:val="PreprocessorTok"/>
-        </w:rPr>
-        <w:t xml:space="preserve">--</w:t>
-      </w:r>
-      <w:r>
-        <w:rPr>
-          <w:rStyle w:val="NormalTok"/>
-        </w:rPr>
-        <w:t xml:space="preserve"> </w:t>
-      </w:r>
-      <w:r>
-        <w:rPr>
-          <w:rStyle w:val="VerbatimStringTok"/>
-        </w:rPr>
-        <w:t xml:space="preserve">Duyệt </w:t>
-      </w:r>
-      <w:r>
-        <w:rPr>
-          <w:rStyle w:val="PreprocessorTok"/>
-        </w:rPr>
-        <w:t xml:space="preserve">--&gt;</w:t>
-      </w:r>
-      <w:r>
-        <w:rPr>
-          <w:rStyle w:val="NormalTok"/>
-        </w:rPr>
-        <w:t xml:space="preserve"> </w:t>
-      </w:r>
-      <w:r>
-        <w:rPr>
-          <w:rStyle w:val="DataTypeTok"/>
-        </w:rPr>
-        <w:t xml:space="preserve">I</w:t>
-      </w:r>
-      <w:r>
-        <w:rPr>
-          <w:rStyle w:val="NormalTok"/>
-        </w:rPr>
-        <w:t xml:space="preserve">[</w:t>
-      </w:r>
-      <w:r>
-        <w:rPr>
-          <w:rStyle w:val="VerbatimStringTok"/>
-        </w:rPr>
-        <w:t xml:space="preserve">Đã duyệt, email hướng dẫn</w:t>
-      </w:r>
-      <w:r>
-        <w:rPr>
-          <w:rStyle w:val="NormalTok"/>
-        </w:rPr>
-        <w:t xml:space="preserve">]</w:t>
-      </w:r>
-      <w:r>
-        <w:br/>
-      </w:r>
-      <w:r>
-        <w:rPr>
-          <w:rStyle w:val="NormalTok"/>
-        </w:rPr>
-        <w:t xml:space="preserve">  </w:t>
-      </w:r>
-      <w:r>
-        <w:rPr>
-          <w:rStyle w:val="DataTypeTok"/>
-        </w:rPr>
-        <w:t xml:space="preserve">H</w:t>
-      </w:r>
-      <w:r>
-        <w:rPr>
-          <w:rStyle w:val="NormalTok"/>
-        </w:rPr>
-        <w:t xml:space="preserve"> </w:t>
-      </w:r>
-      <w:r>
-        <w:rPr>
-          <w:rStyle w:val="PreprocessorTok"/>
-        </w:rPr>
-        <w:t xml:space="preserve">--</w:t>
-      </w:r>
-      <w:r>
-        <w:rPr>
-          <w:rStyle w:val="NormalTok"/>
-        </w:rPr>
-        <w:t xml:space="preserve"> </w:t>
-      </w:r>
-      <w:r>
-        <w:rPr>
-          <w:rStyle w:val="VerbatimStringTok"/>
-        </w:rPr>
-        <w:t xml:space="preserve">Từ chối </w:t>
-      </w:r>
-      <w:r>
-        <w:rPr>
-          <w:rStyle w:val="PreprocessorTok"/>
-        </w:rPr>
-        <w:t xml:space="preserve">--&gt;</w:t>
-      </w:r>
-      <w:r>
-        <w:rPr>
-          <w:rStyle w:val="NormalTok"/>
-        </w:rPr>
-        <w:t xml:space="preserve"> </w:t>
-      </w:r>
-      <w:r>
-        <w:rPr>
-          <w:rStyle w:val="DataTypeTok"/>
-        </w:rPr>
-        <w:t xml:space="preserve">R</w:t>
-      </w:r>
-      <w:r>
-        <w:rPr>
-          <w:rStyle w:val="NormalTok"/>
-        </w:rPr>
-        <w:t xml:space="preserve">[</w:t>
-      </w:r>
-      <w:r>
-        <w:rPr>
-          <w:rStyle w:val="VerbatimStringTok"/>
-        </w:rPr>
-        <w:t xml:space="preserve">Từ chối, email lý do</w:t>
-      </w:r>
-      <w:r>
-        <w:rPr>
-          <w:rStyle w:val="NormalTok"/>
-        </w:rPr>
-        <w:t xml:space="preserve">]</w:t>
-      </w:r>
-      <w:r>
-        <w:br/>
-      </w:r>
-      <w:r>
-        <w:rPr>
-          <w:rStyle w:val="NormalTok"/>
-        </w:rPr>
-        <w:t xml:space="preserve">  </w:t>
-      </w:r>
-      <w:r>
-        <w:rPr>
-          <w:rStyle w:val="DataTypeTok"/>
-        </w:rPr>
-        <w:t xml:space="preserve">I</w:t>
-      </w:r>
-      <w:r>
-        <w:rPr>
-          <w:rStyle w:val="NormalTok"/>
-        </w:rPr>
-        <w:t xml:space="preserve"> </w:t>
-      </w:r>
-      <w:r>
-        <w:rPr>
-          <w:rStyle w:val="PreprocessorTok"/>
-        </w:rPr>
-        <w:t xml:space="preserve">--&gt;</w:t>
-      </w:r>
-      <w:r>
-        <w:rPr>
-          <w:rStyle w:val="NormalTok"/>
-        </w:rPr>
-        <w:t xml:space="preserve"> </w:t>
-      </w:r>
-      <w:r>
-        <w:rPr>
-          <w:rStyle w:val="DataTypeTok"/>
-        </w:rPr>
-        <w:t xml:space="preserve">J</w:t>
-      </w:r>
-      <w:r>
-        <w:rPr>
-          <w:rStyle w:val="NormalTok"/>
-        </w:rPr>
-        <w:t xml:space="preserve">[</w:t>
-      </w:r>
-      <w:r>
-        <w:rPr>
-          <w:rStyle w:val="VerbatimStringTok"/>
-        </w:rPr>
-        <w:t xml:space="preserve">Khách gửi hàng</w:t>
-      </w:r>
-      <w:r>
-        <w:rPr>
-          <w:rStyle w:val="NormalTok"/>
-        </w:rPr>
-        <w:t xml:space="preserve">]</w:t>
-      </w:r>
-      <w:r>
-        <w:br/>
-      </w:r>
-      <w:r>
-        <w:rPr>
-          <w:rStyle w:val="NormalTok"/>
-        </w:rPr>
-        <w:t xml:space="preserve">  </w:t>
-      </w:r>
-      <w:r>
-        <w:rPr>
-          <w:rStyle w:val="DataTypeTok"/>
-        </w:rPr>
-        <w:t xml:space="preserve">J</w:t>
-      </w:r>
-      <w:r>
-        <w:rPr>
-          <w:rStyle w:val="NormalTok"/>
-        </w:rPr>
-        <w:t xml:space="preserve"> </w:t>
-      </w:r>
-      <w:r>
-        <w:rPr>
-          <w:rStyle w:val="PreprocessorTok"/>
-        </w:rPr>
-        <w:t xml:space="preserve">--&gt;</w:t>
-      </w:r>
-      <w:r>
-        <w:rPr>
-          <w:rStyle w:val="NormalTok"/>
-        </w:rPr>
-        <w:t xml:space="preserve"> </w:t>
-      </w:r>
-      <w:r>
-        <w:rPr>
-          <w:rStyle w:val="DataTypeTok"/>
-        </w:rPr>
-        <w:t xml:space="preserve">K</w:t>
-      </w:r>
-      <w:r>
-        <w:rPr>
-          <w:rStyle w:val="NormalTok"/>
-        </w:rPr>
-        <w:t xml:space="preserve">[</w:t>
-      </w:r>
-      <w:r>
-        <w:rPr>
-          <w:rStyle w:val="VerbatimStringTok"/>
-        </w:rPr>
-        <w:t xml:space="preserve">SCR-07 Kho quét mã, kiểm tra</w:t>
-      </w:r>
-      <w:r>
-        <w:rPr>
-          <w:rStyle w:val="NormalTok"/>
-        </w:rPr>
-        <w:t xml:space="preserve">]</w:t>
-      </w:r>
-      <w:r>
-        <w:br/>
-      </w:r>
-      <w:r>
-        <w:rPr>
-          <w:rStyle w:val="NormalTok"/>
-        </w:rPr>
-        <w:t xml:space="preserve">  </w:t>
-      </w:r>
-      <w:r>
-        <w:rPr>
-          <w:rStyle w:val="DataTypeTok"/>
-        </w:rPr>
-        <w:t xml:space="preserve">K</w:t>
-      </w:r>
-      <w:r>
-        <w:rPr>
-          <w:rStyle w:val="NormalTok"/>
-        </w:rPr>
-        <w:t xml:space="preserve"> </w:t>
-      </w:r>
-      <w:r>
-        <w:rPr>
-          <w:rStyle w:val="PreprocessorTok"/>
-        </w:rPr>
-        <w:t xml:space="preserve">--&gt;</w:t>
-      </w:r>
-      <w:r>
-        <w:rPr>
-          <w:rStyle w:val="NormalTok"/>
-        </w:rPr>
-        <w:t xml:space="preserve"> </w:t>
-      </w:r>
-      <w:r>
-        <w:rPr>
-          <w:rStyle w:val="DataTypeTok"/>
-        </w:rPr>
-        <w:t xml:space="preserve">L</w:t>
-      </w:r>
-      <w:r>
-        <w:rPr>
-          <w:rStyle w:val="NormalTok"/>
-        </w:rPr>
-        <w:t xml:space="preserve">{</w:t>
-      </w:r>
-      <w:r>
-        <w:rPr>
-          <w:rStyle w:val="VerbatimStringTok"/>
-        </w:rPr>
-        <w:t xml:space="preserve">Loại yêu cầu</w:t>
-      </w:r>
-      <w:r>
-        <w:rPr>
-          <w:rStyle w:val="NormalTok"/>
-        </w:rPr>
-        <w:t xml:space="preserve">}</w:t>
-      </w:r>
-      <w:r>
-        <w:br/>
-      </w:r>
-      <w:r>
-        <w:rPr>
-          <w:rStyle w:val="NormalTok"/>
-        </w:rPr>
-        <w:t xml:space="preserve">  </w:t>
-      </w:r>
-      <w:r>
-        <w:rPr>
-          <w:rStyle w:val="DataTypeTok"/>
-        </w:rPr>
-        <w:t xml:space="preserve">L</w:t>
-      </w:r>
-      <w:r>
-        <w:rPr>
-          <w:rStyle w:val="NormalTok"/>
-        </w:rPr>
-        <w:t xml:space="preserve"> </w:t>
-      </w:r>
-      <w:r>
-        <w:rPr>
-          <w:rStyle w:val="PreprocessorTok"/>
-        </w:rPr>
-        <w:t xml:space="preserve">--</w:t>
-      </w:r>
-      <w:r>
-        <w:rPr>
-          <w:rStyle w:val="NormalTok"/>
-        </w:rPr>
-        <w:t xml:space="preserve"> </w:t>
-      </w:r>
-      <w:r>
-        <w:rPr>
-          <w:rStyle w:val="VerbatimStringTok"/>
-        </w:rPr>
-        <w:t xml:space="preserve">Trả hàng </w:t>
-      </w:r>
-      <w:r>
-        <w:rPr>
-          <w:rStyle w:val="PreprocessorTok"/>
-        </w:rPr>
-        <w:t xml:space="preserve">--&gt;</w:t>
-      </w:r>
-      <w:r>
-        <w:rPr>
-          <w:rStyle w:val="NormalTok"/>
-        </w:rPr>
-        <w:t xml:space="preserve"> </w:t>
-      </w:r>
-      <w:r>
-        <w:rPr>
-          <w:rStyle w:val="DataTypeTok"/>
-        </w:rPr>
-        <w:t xml:space="preserve">M</w:t>
-      </w:r>
-      <w:r>
-        <w:rPr>
-          <w:rStyle w:val="NormalTok"/>
-        </w:rPr>
-        <w:t xml:space="preserve">[</w:t>
-      </w:r>
-      <w:r>
-        <w:rPr>
-          <w:rStyle w:val="VerbatimStringTok"/>
-        </w:rPr>
-        <w:t xml:space="preserve">Credit note, kế toán hoàn tiền</w:t>
-      </w:r>
-      <w:r>
-        <w:rPr>
-          <w:rStyle w:val="NormalTok"/>
-        </w:rPr>
-        <w:t xml:space="preserve">]</w:t>
-      </w:r>
-      <w:r>
-        <w:br/>
-      </w:r>
-      <w:r>
-        <w:rPr>
-          <w:rStyle w:val="NormalTok"/>
-        </w:rPr>
-        <w:t xml:space="preserve">  </w:t>
-      </w:r>
-      <w:r>
-        <w:rPr>
-          <w:rStyle w:val="DataTypeTok"/>
-        </w:rPr>
-        <w:t xml:space="preserve">L</w:t>
-      </w:r>
-      <w:r>
-        <w:rPr>
-          <w:rStyle w:val="NormalTok"/>
-        </w:rPr>
-        <w:t xml:space="preserve"> </w:t>
-      </w:r>
-      <w:r>
-        <w:rPr>
-          <w:rStyle w:val="PreprocessorTok"/>
-        </w:rPr>
-        <w:t xml:space="preserve">--</w:t>
-      </w:r>
-      <w:r>
-        <w:rPr>
-          <w:rStyle w:val="NormalTok"/>
-        </w:rPr>
-        <w:t xml:space="preserve"> </w:t>
-      </w:r>
-      <w:r>
-        <w:rPr>
-          <w:rStyle w:val="VerbatimStringTok"/>
-        </w:rPr>
-        <w:t xml:space="preserve">Đổi size </w:t>
-      </w:r>
-      <w:r>
-        <w:rPr>
-          <w:rStyle w:val="PreprocessorTok"/>
-        </w:rPr>
-        <w:t xml:space="preserve">--&gt;</w:t>
-      </w:r>
-      <w:r>
-        <w:rPr>
-          <w:rStyle w:val="NormalTok"/>
-        </w:rPr>
-        <w:t xml:space="preserve"> </w:t>
-      </w:r>
-      <w:r>
-        <w:rPr>
-          <w:rStyle w:val="DataTypeTok"/>
-        </w:rPr>
-        <w:t xml:space="preserve">N</w:t>
-      </w:r>
-      <w:r>
-        <w:rPr>
-          <w:rStyle w:val="NormalTok"/>
-        </w:rPr>
-        <w:t xml:space="preserve">[</w:t>
-      </w:r>
-      <w:r>
-        <w:rPr>
-          <w:rStyle w:val="VerbatimStringTok"/>
-        </w:rPr>
-        <w:t xml:space="preserve">Đơn đổi giá 0đ</w:t>
-      </w:r>
-      <w:r>
-        <w:rPr>
-          <w:rStyle w:val="NormalTok"/>
-        </w:rPr>
-        <w:t xml:space="preserve">]</w:t>
-      </w:r>
-      <w:r>
-        <w:br/>
-      </w:r>
-      <w:r>
-        <w:rPr>
-          <w:rStyle w:val="NormalTok"/>
-        </w:rPr>
-        <w:t xml:space="preserve">  </w:t>
-      </w:r>
-      <w:r>
-        <w:rPr>
-          <w:rStyle w:val="DataTypeTok"/>
-        </w:rPr>
-        <w:t xml:space="preserve">M</w:t>
-      </w:r>
-      <w:r>
-        <w:rPr>
-          <w:rStyle w:val="NormalTok"/>
-        </w:rPr>
-        <w:t xml:space="preserve"> </w:t>
-      </w:r>
-      <w:r>
-        <w:rPr>
-          <w:rStyle w:val="PreprocessorTok"/>
-        </w:rPr>
-        <w:t xml:space="preserve">--&gt;</w:t>
-      </w:r>
-      <w:r>
-        <w:rPr>
-          <w:rStyle w:val="NormalTok"/>
-        </w:rPr>
-        <w:t xml:space="preserve"> </w:t>
-      </w:r>
-      <w:r>
-        <w:rPr>
-          <w:rStyle w:val="DataTypeTok"/>
-        </w:rPr>
-        <w:t xml:space="preserve">O</w:t>
-      </w:r>
-      <w:r>
-        <w:rPr>
-          <w:rStyle w:val="NormalTok"/>
-        </w:rPr>
-        <w:t xml:space="preserve">[</w:t>
-      </w:r>
-      <w:r>
-        <w:rPr>
-          <w:rStyle w:val="VerbatimStringTok"/>
-        </w:rPr>
-        <w:t xml:space="preserve">Hoàn tất</w:t>
-      </w:r>
-      <w:r>
-        <w:rPr>
-          <w:rStyle w:val="NormalTok"/>
-        </w:rPr>
-        <w:t xml:space="preserve">]</w:t>
-      </w:r>
-      <w:r>
-        <w:br/>
-      </w:r>
-      <w:r>
-        <w:rPr>
-          <w:rStyle w:val="NormalTok"/>
-        </w:rPr>
-        <w:t xml:space="preserve">  </w:t>
-      </w:r>
-      <w:r>
-        <w:rPr>
-          <w:rStyle w:val="DataTypeTok"/>
-        </w:rPr>
-        <w:t xml:space="preserve">N</w:t>
-      </w:r>
-      <w:r>
-        <w:rPr>
-          <w:rStyle w:val="NormalTok"/>
-        </w:rPr>
-        <w:t xml:space="preserve"> </w:t>
-      </w:r>
-      <w:r>
-        <w:rPr>
-          <w:rStyle w:val="PreprocessorTok"/>
-        </w:rPr>
-        <w:t xml:space="preserve">--&gt;</w:t>
-      </w:r>
-      <w:r>
-        <w:rPr>
-          <w:rStyle w:val="NormalTok"/>
-        </w:rPr>
-        <w:t xml:space="preserve"> </w:t>
-      </w:r>
-      <w:r>
-        <w:rPr>
-          <w:rStyle w:val="DataTypeTok"/>
-        </w:rPr>
-        <w:t xml:space="preserve">O</w:t>
+        <w:pStyle w:val="CaptionedFigure"/>
+      </w:pPr>
+      <w:r>
+        <w:drawing>
+          <wp:inline>
+            <wp:extent cx="1668909" cy="7919999"/>
+            <wp:effectExtent b="0" l="0" r="0" t="0"/>
+            <wp:docPr descr="Sơ đồ 2 — 7. User flow" title="" id="152" name="Picture"/>
+            <a:graphic>
+              <a:graphicData uri="http://schemas.openxmlformats.org/drawingml/2006/picture">
+                <pic:pic>
+                  <pic:nvPicPr>
+                    <pic:cNvPr descr="ui/diagrams/srs-02.png" id="153" name="Picture"/>
+                    <pic:cNvPicPr>
+                      <a:picLocks noChangeArrowheads="1" noChangeAspect="1"/>
+                    </pic:cNvPicPr>
+                  </pic:nvPicPr>
+                  <pic:blipFill>
+                    <a:blip r:embed="rId151"/>
+                    <a:stretch>
+                      <a:fillRect/>
+                    </a:stretch>
+                  </pic:blipFill>
+                  <pic:spPr bwMode="auto">
+                    <a:xfrm>
+                      <a:off x="0" y="0"/>
+                      <a:ext cx="1668909" cy="7919999"/>
+                    </a:xfrm>
+                    <a:prstGeom prst="rect">
+                      <a:avLst/>
+                    </a:prstGeom>
+                    <a:noFill/>
+                    <a:ln w="9525">
+                      <a:noFill/>
+                      <a:headEnd/>
+                      <a:tailEnd/>
+                    </a:ln>
+                  </pic:spPr>
+                </pic:pic>
+              </a:graphicData>
+            </a:graphic>
+          </wp:inline>
+        </w:drawing>
+      </w:r>
+    </w:p>
+    <w:p>
+      <w:pPr>
+        <w:pStyle w:val="ImageCaption"/>
+      </w:pPr>
+      <w:r>
+        <w:rPr>
+          <w:lang w:val="vi-VN"/>
+        </w:rPr>
+        <w:t xml:space="preserve">Sơ đồ 2 — 7. User flow</w:t>
       </w:r>
     </w:p>
     <w:p>
@@ -18441,834 +16996,74 @@
     </w:p>
     <w:p>
       <w:pPr>
-        <w:pStyle w:val="SourceCode"/>
-      </w:pPr>
-      <w:r>
-        <w:rPr>
-          <w:rStyle w:val="KeywordTok"/>
-        </w:rPr>
-        <w:t xml:space="preserve">flowchart</w:t>
-      </w:r>
-      <w:r>
-        <w:rPr>
-          <w:rStyle w:val="NormalTok"/>
-        </w:rPr>
-        <w:t xml:space="preserve"> </w:t>
-      </w:r>
-      <w:r>
-        <w:rPr>
-          <w:rStyle w:val="ConstantTok"/>
-        </w:rPr>
-        <w:t xml:space="preserve">TD</w:t>
-      </w:r>
-      <w:r>
-        <w:br/>
-      </w:r>
-      <w:r>
-        <w:rPr>
-          <w:rStyle w:val="NormalTok"/>
-        </w:rPr>
-        <w:t xml:space="preserve">  </w:t>
-      </w:r>
-      <w:r>
-        <w:rPr>
-          <w:rStyle w:val="DataTypeTok"/>
-        </w:rPr>
-        <w:t xml:space="preserve">P</w:t>
-      </w:r>
-      <w:r>
-        <w:rPr>
-          <w:rStyle w:val="NormalTok"/>
-        </w:rPr>
-        <w:t xml:space="preserve">[</w:t>
-      </w:r>
-      <w:r>
-        <w:rPr>
-          <w:rStyle w:val="VerbatimStringTok"/>
-        </w:rPr>
-        <w:t xml:space="preserve">Yêu cầu Chờ duyệt</w:t>
-      </w:r>
-      <w:r>
-        <w:rPr>
-          <w:rStyle w:val="NormalTok"/>
-        </w:rPr>
-        <w:t xml:space="preserve">] </w:t>
-      </w:r>
-      <w:r>
-        <w:rPr>
-          <w:rStyle w:val="PreprocessorTok"/>
-        </w:rPr>
-        <w:t xml:space="preserve">--&gt;</w:t>
-      </w:r>
-      <w:r>
-        <w:rPr>
-          <w:rStyle w:val="NormalTok"/>
-        </w:rPr>
-        <w:t xml:space="preserve"> </w:t>
-      </w:r>
-      <w:r>
-        <w:rPr>
-          <w:rStyle w:val="DataTypeTok"/>
-        </w:rPr>
-        <w:t xml:space="preserve">Q</w:t>
-      </w:r>
-      <w:r>
-        <w:rPr>
-          <w:rStyle w:val="NormalTok"/>
-        </w:rPr>
-        <w:t xml:space="preserve">{</w:t>
-      </w:r>
-      <w:r>
-        <w:rPr>
-          <w:rStyle w:val="VerbatimStringTok"/>
-        </w:rPr>
-        <w:t xml:space="preserve">Khách huỷ ở SCR-04?</w:t>
-      </w:r>
-      <w:r>
-        <w:rPr>
-          <w:rStyle w:val="NormalTok"/>
-        </w:rPr>
-        <w:t xml:space="preserve">}</w:t>
-      </w:r>
-      <w:r>
-        <w:br/>
-      </w:r>
-      <w:r>
-        <w:rPr>
-          <w:rStyle w:val="NormalTok"/>
-        </w:rPr>
-        <w:t xml:space="preserve">  </w:t>
-      </w:r>
-      <w:r>
-        <w:rPr>
-          <w:rStyle w:val="DataTypeTok"/>
-        </w:rPr>
-        <w:t xml:space="preserve">Q</w:t>
-      </w:r>
-      <w:r>
-        <w:rPr>
-          <w:rStyle w:val="NormalTok"/>
-        </w:rPr>
-        <w:t xml:space="preserve"> </w:t>
-      </w:r>
-      <w:r>
-        <w:rPr>
-          <w:rStyle w:val="PreprocessorTok"/>
-        </w:rPr>
-        <w:t xml:space="preserve">--</w:t>
-      </w:r>
-      <w:r>
-        <w:rPr>
-          <w:rStyle w:val="NormalTok"/>
-        </w:rPr>
-        <w:t xml:space="preserve"> </w:t>
-      </w:r>
-      <w:r>
-        <w:rPr>
-          <w:rStyle w:val="VerbatimStringTok"/>
-        </w:rPr>
-        <w:t xml:space="preserve">Có </w:t>
-      </w:r>
-      <w:r>
-        <w:rPr>
-          <w:rStyle w:val="PreprocessorTok"/>
-        </w:rPr>
-        <w:t xml:space="preserve">--&gt;</w:t>
-      </w:r>
-      <w:r>
-        <w:rPr>
-          <w:rStyle w:val="NormalTok"/>
-        </w:rPr>
-        <w:t xml:space="preserve"> </w:t>
-      </w:r>
-      <w:r>
-        <w:rPr>
-          <w:rStyle w:val="DataTypeTok"/>
-        </w:rPr>
-        <w:t xml:space="preserve">Q1</w:t>
-      </w:r>
-      <w:r>
-        <w:rPr>
-          <w:rStyle w:val="NormalTok"/>
-        </w:rPr>
-        <w:t xml:space="preserve">{</w:t>
-      </w:r>
-      <w:r>
-        <w:rPr>
-          <w:rStyle w:val="VerbatimStringTok"/>
-        </w:rPr>
-        <w:t xml:space="preserve">Odoo đã duyệt chưa?</w:t>
-      </w:r>
-      <w:r>
-        <w:rPr>
-          <w:rStyle w:val="NormalTok"/>
-        </w:rPr>
-        <w:t xml:space="preserve">}</w:t>
-      </w:r>
-      <w:r>
-        <w:br/>
-      </w:r>
-      <w:r>
-        <w:rPr>
-          <w:rStyle w:val="NormalTok"/>
-        </w:rPr>
-        <w:t xml:space="preserve">  </w:t>
-      </w:r>
-      <w:r>
-        <w:rPr>
-          <w:rStyle w:val="DataTypeTok"/>
-        </w:rPr>
-        <w:t xml:space="preserve">Q1</w:t>
-      </w:r>
-      <w:r>
-        <w:rPr>
-          <w:rStyle w:val="NormalTok"/>
-        </w:rPr>
-        <w:t xml:space="preserve"> </w:t>
-      </w:r>
-      <w:r>
-        <w:rPr>
-          <w:rStyle w:val="PreprocessorTok"/>
-        </w:rPr>
-        <w:t xml:space="preserve">--</w:t>
-      </w:r>
-      <w:r>
-        <w:rPr>
-          <w:rStyle w:val="NormalTok"/>
-        </w:rPr>
-        <w:t xml:space="preserve"> </w:t>
-      </w:r>
-      <w:r>
-        <w:rPr>
-          <w:rStyle w:val="VerbatimStringTok"/>
-        </w:rPr>
-        <w:t xml:space="preserve">Chưa </w:t>
-      </w:r>
-      <w:r>
-        <w:rPr>
-          <w:rStyle w:val="PreprocessorTok"/>
-        </w:rPr>
-        <w:t xml:space="preserve">--&gt;</w:t>
-      </w:r>
-      <w:r>
-        <w:rPr>
-          <w:rStyle w:val="NormalTok"/>
-        </w:rPr>
-        <w:t xml:space="preserve"> </w:t>
-      </w:r>
-      <w:r>
-        <w:rPr>
-          <w:rStyle w:val="DataTypeTok"/>
-        </w:rPr>
-        <w:t xml:space="preserve">Q2</w:t>
-      </w:r>
-      <w:r>
-        <w:rPr>
-          <w:rStyle w:val="NormalTok"/>
-        </w:rPr>
-        <w:t xml:space="preserve">[</w:t>
-      </w:r>
-      <w:r>
-        <w:rPr>
-          <w:rStyle w:val="VerbatimStringTok"/>
-        </w:rPr>
-        <w:t xml:space="preserve">Đã huỷ, giải phóng số lượng</w:t>
-      </w:r>
-      <w:r>
-        <w:rPr>
-          <w:rStyle w:val="NormalTok"/>
-        </w:rPr>
-        <w:t xml:space="preserve">]</w:t>
-      </w:r>
-      <w:r>
-        <w:br/>
-      </w:r>
-      <w:r>
-        <w:rPr>
-          <w:rStyle w:val="NormalTok"/>
-        </w:rPr>
-        <w:t xml:space="preserve">  </w:t>
-      </w:r>
-      <w:r>
-        <w:rPr>
-          <w:rStyle w:val="DataTypeTok"/>
-        </w:rPr>
-        <w:t xml:space="preserve">Q1</w:t>
-      </w:r>
-      <w:r>
-        <w:rPr>
-          <w:rStyle w:val="NormalTok"/>
-        </w:rPr>
-        <w:t xml:space="preserve"> </w:t>
-      </w:r>
-      <w:r>
-        <w:rPr>
-          <w:rStyle w:val="PreprocessorTok"/>
-        </w:rPr>
-        <w:t xml:space="preserve">--</w:t>
-      </w:r>
-      <w:r>
-        <w:rPr>
-          <w:rStyle w:val="NormalTok"/>
-        </w:rPr>
-        <w:t xml:space="preserve"> </w:t>
-      </w:r>
-      <w:r>
-        <w:rPr>
-          <w:rStyle w:val="VerbatimStringTok"/>
-        </w:rPr>
-        <w:t xml:space="preserve">Rồi </w:t>
-      </w:r>
-      <w:r>
-        <w:rPr>
-          <w:rStyle w:val="PreprocessorTok"/>
-        </w:rPr>
-        <w:t xml:space="preserve">--&gt;</w:t>
-      </w:r>
-      <w:r>
-        <w:rPr>
-          <w:rStyle w:val="NormalTok"/>
-        </w:rPr>
-        <w:t xml:space="preserve"> </w:t>
-      </w:r>
-      <w:r>
-        <w:rPr>
-          <w:rStyle w:val="DataTypeTok"/>
-        </w:rPr>
-        <w:t xml:space="preserve">Q3</w:t>
-      </w:r>
-      <w:r>
-        <w:rPr>
-          <w:rStyle w:val="NormalTok"/>
-        </w:rPr>
-        <w:t xml:space="preserve">[</w:t>
-      </w:r>
-      <w:r>
-        <w:rPr>
-          <w:rStyle w:val="VerbatimStringTok"/>
-        </w:rPr>
-        <w:t xml:space="preserve">Báo không thể huỷ</w:t>
-      </w:r>
-      <w:r>
-        <w:rPr>
-          <w:rStyle w:val="NormalTok"/>
-        </w:rPr>
-        <w:t xml:space="preserve">]</w:t>
-      </w:r>
-      <w:r>
-        <w:br/>
-      </w:r>
-      <w:r>
-        <w:rPr>
-          <w:rStyle w:val="NormalTok"/>
-        </w:rPr>
-        <w:t xml:space="preserve">  </w:t>
-      </w:r>
-      <w:r>
-        <w:rPr>
-          <w:rStyle w:val="DataTypeTok"/>
-        </w:rPr>
-        <w:t xml:space="preserve">Q</w:t>
-      </w:r>
-      <w:r>
-        <w:rPr>
-          <w:rStyle w:val="NormalTok"/>
-        </w:rPr>
-        <w:t xml:space="preserve"> </w:t>
-      </w:r>
-      <w:r>
-        <w:rPr>
-          <w:rStyle w:val="PreprocessorTok"/>
-        </w:rPr>
-        <w:t xml:space="preserve">--</w:t>
-      </w:r>
-      <w:r>
-        <w:rPr>
-          <w:rStyle w:val="NormalTok"/>
-        </w:rPr>
-        <w:t xml:space="preserve"> </w:t>
-      </w:r>
-      <w:r>
-        <w:rPr>
-          <w:rStyle w:val="VerbatimStringTok"/>
-        </w:rPr>
-        <w:t xml:space="preserve">Không </w:t>
-      </w:r>
-      <w:r>
-        <w:rPr>
-          <w:rStyle w:val="PreprocessorTok"/>
-        </w:rPr>
-        <w:t xml:space="preserve">--&gt;</w:t>
-      </w:r>
-      <w:r>
-        <w:rPr>
-          <w:rStyle w:val="NormalTok"/>
-        </w:rPr>
-        <w:t xml:space="preserve"> </w:t>
-      </w:r>
-      <w:r>
-        <w:rPr>
-          <w:rStyle w:val="DataTypeTok"/>
-        </w:rPr>
-        <w:t xml:space="preserve">S</w:t>
-      </w:r>
-      <w:r>
-        <w:rPr>
-          <w:rStyle w:val="NormalTok"/>
-        </w:rPr>
-        <w:t xml:space="preserve">{</w:t>
-      </w:r>
-      <w:r>
-        <w:rPr>
-          <w:rStyle w:val="VerbatimStringTok"/>
-        </w:rPr>
-        <w:t xml:space="preserve">Quá 48 giờ?</w:t>
-      </w:r>
-      <w:r>
-        <w:rPr>
-          <w:rStyle w:val="NormalTok"/>
-        </w:rPr>
-        <w:t xml:space="preserve">}</w:t>
-      </w:r>
-      <w:r>
-        <w:br/>
-      </w:r>
-      <w:r>
-        <w:rPr>
-          <w:rStyle w:val="NormalTok"/>
-        </w:rPr>
-        <w:t xml:space="preserve">  </w:t>
-      </w:r>
-      <w:r>
-        <w:rPr>
-          <w:rStyle w:val="DataTypeTok"/>
-        </w:rPr>
-        <w:t xml:space="preserve">S</w:t>
-      </w:r>
-      <w:r>
-        <w:rPr>
-          <w:rStyle w:val="NormalTok"/>
-        </w:rPr>
-        <w:t xml:space="preserve"> </w:t>
-      </w:r>
-      <w:r>
-        <w:rPr>
-          <w:rStyle w:val="PreprocessorTok"/>
-        </w:rPr>
-        <w:t xml:space="preserve">--</w:t>
-      </w:r>
-      <w:r>
-        <w:rPr>
-          <w:rStyle w:val="NormalTok"/>
-        </w:rPr>
-        <w:t xml:space="preserve"> </w:t>
-      </w:r>
-      <w:r>
-        <w:rPr>
-          <w:rStyle w:val="VerbatimStringTok"/>
-        </w:rPr>
-        <w:t xml:space="preserve">Có </w:t>
-      </w:r>
-      <w:r>
-        <w:rPr>
-          <w:rStyle w:val="PreprocessorTok"/>
-        </w:rPr>
-        <w:t xml:space="preserve">--&gt;</w:t>
-      </w:r>
-      <w:r>
-        <w:rPr>
-          <w:rStyle w:val="NormalTok"/>
-        </w:rPr>
-        <w:t xml:space="preserve"> </w:t>
-      </w:r>
-      <w:r>
-        <w:rPr>
-          <w:rStyle w:val="DataTypeTok"/>
-        </w:rPr>
-        <w:t xml:space="preserve">S1</w:t>
-      </w:r>
-      <w:r>
-        <w:rPr>
-          <w:rStyle w:val="NormalTok"/>
-        </w:rPr>
-        <w:t xml:space="preserve">[</w:t>
-      </w:r>
-      <w:r>
-        <w:rPr>
-          <w:rStyle w:val="VerbatimStringTok"/>
-        </w:rPr>
-        <w:t xml:space="preserve">Activity và email Trưởng CSKH</w:t>
-      </w:r>
-      <w:r>
-        <w:rPr>
-          <w:rStyle w:val="NormalTok"/>
-        </w:rPr>
-        <w:t xml:space="preserve">]</w:t>
-      </w:r>
-      <w:r>
-        <w:br/>
-      </w:r>
-      <w:r>
-        <w:rPr>
-          <w:rStyle w:val="NormalTok"/>
-        </w:rPr>
-        <w:t xml:space="preserve">  </w:t>
-      </w:r>
-      <w:r>
-        <w:rPr>
-          <w:rStyle w:val="DataTypeTok"/>
-        </w:rPr>
-        <w:t xml:space="preserve">S</w:t>
-      </w:r>
-      <w:r>
-        <w:rPr>
-          <w:rStyle w:val="NormalTok"/>
-        </w:rPr>
-        <w:t xml:space="preserve"> </w:t>
-      </w:r>
-      <w:r>
-        <w:rPr>
-          <w:rStyle w:val="PreprocessorTok"/>
-        </w:rPr>
-        <w:t xml:space="preserve">--</w:t>
-      </w:r>
-      <w:r>
-        <w:rPr>
-          <w:rStyle w:val="NormalTok"/>
-        </w:rPr>
-        <w:t xml:space="preserve"> </w:t>
-      </w:r>
-      <w:r>
-        <w:rPr>
-          <w:rStyle w:val="VerbatimStringTok"/>
-        </w:rPr>
-        <w:t xml:space="preserve">Không </w:t>
-      </w:r>
-      <w:r>
-        <w:rPr>
-          <w:rStyle w:val="PreprocessorTok"/>
-        </w:rPr>
-        <w:t xml:space="preserve">--&gt;</w:t>
-      </w:r>
-      <w:r>
-        <w:rPr>
-          <w:rStyle w:val="NormalTok"/>
-        </w:rPr>
-        <w:t xml:space="preserve"> </w:t>
-      </w:r>
-      <w:r>
-        <w:rPr>
-          <w:rStyle w:val="DataTypeTok"/>
-        </w:rPr>
-        <w:t xml:space="preserve">S2</w:t>
-      </w:r>
-      <w:r>
-        <w:rPr>
-          <w:rStyle w:val="NormalTok"/>
-        </w:rPr>
-        <w:t xml:space="preserve">[</w:t>
-      </w:r>
-      <w:r>
-        <w:rPr>
-          <w:rStyle w:val="VerbatimStringTok"/>
-        </w:rPr>
-        <w:t xml:space="preserve">Chờ CSKH xử lý</w:t>
-      </w:r>
-      <w:r>
-        <w:rPr>
-          <w:rStyle w:val="NormalTok"/>
-        </w:rPr>
-        <w:t xml:space="preserve">]</w:t>
-      </w:r>
-      <w:r>
-        <w:br/>
-      </w:r>
-      <w:r>
-        <w:rPr>
-          <w:rStyle w:val="NormalTok"/>
-        </w:rPr>
-        <w:t xml:space="preserve">  </w:t>
-      </w:r>
-      <w:r>
-        <w:rPr>
-          <w:rStyle w:val="DataTypeTok"/>
-        </w:rPr>
-        <w:t xml:space="preserve">T</w:t>
-      </w:r>
-      <w:r>
-        <w:rPr>
-          <w:rStyle w:val="NormalTok"/>
-        </w:rPr>
-        <w:t xml:space="preserve">[</w:t>
-      </w:r>
-      <w:r>
-        <w:rPr>
-          <w:rStyle w:val="VerbatimStringTok"/>
-        </w:rPr>
-        <w:t xml:space="preserve">Message đồng bộ</w:t>
-      </w:r>
-      <w:r>
-        <w:rPr>
-          <w:rStyle w:val="NormalTok"/>
-        </w:rPr>
-        <w:t xml:space="preserve">] </w:t>
-      </w:r>
-      <w:r>
-        <w:rPr>
-          <w:rStyle w:val="PreprocessorTok"/>
-        </w:rPr>
-        <w:t xml:space="preserve">--&gt;</w:t>
-      </w:r>
-      <w:r>
-        <w:rPr>
-          <w:rStyle w:val="NormalTok"/>
-        </w:rPr>
-        <w:t xml:space="preserve"> </w:t>
-      </w:r>
-      <w:r>
-        <w:rPr>
-          <w:rStyle w:val="DataTypeTok"/>
-        </w:rPr>
-        <w:t xml:space="preserve">U</w:t>
-      </w:r>
-      <w:r>
-        <w:rPr>
-          <w:rStyle w:val="NormalTok"/>
-        </w:rPr>
-        <w:t xml:space="preserve">{</w:t>
-      </w:r>
-      <w:r>
-        <w:rPr>
-          <w:rStyle w:val="VerbatimStringTok"/>
-        </w:rPr>
-        <w:t xml:space="preserve">Thành công?</w:t>
-      </w:r>
-      <w:r>
-        <w:rPr>
-          <w:rStyle w:val="NormalTok"/>
-        </w:rPr>
-        <w:t xml:space="preserve">}</w:t>
-      </w:r>
-      <w:r>
-        <w:br/>
-      </w:r>
-      <w:r>
-        <w:rPr>
-          <w:rStyle w:val="NormalTok"/>
-        </w:rPr>
-        <w:t xml:space="preserve">  </w:t>
-      </w:r>
-      <w:r>
-        <w:rPr>
-          <w:rStyle w:val="DataTypeTok"/>
-        </w:rPr>
-        <w:t xml:space="preserve">U</w:t>
-      </w:r>
-      <w:r>
-        <w:rPr>
-          <w:rStyle w:val="NormalTok"/>
-        </w:rPr>
-        <w:t xml:space="preserve"> </w:t>
-      </w:r>
-      <w:r>
-        <w:rPr>
-          <w:rStyle w:val="PreprocessorTok"/>
-        </w:rPr>
-        <w:t xml:space="preserve">--</w:t>
-      </w:r>
-      <w:r>
-        <w:rPr>
-          <w:rStyle w:val="NormalTok"/>
-        </w:rPr>
-        <w:t xml:space="preserve"> </w:t>
-      </w:r>
-      <w:r>
-        <w:rPr>
-          <w:rStyle w:val="VerbatimStringTok"/>
-        </w:rPr>
-        <w:t xml:space="preserve">Không </w:t>
-      </w:r>
-      <w:r>
-        <w:rPr>
-          <w:rStyle w:val="PreprocessorTok"/>
-        </w:rPr>
-        <w:t xml:space="preserve">--&gt;</w:t>
-      </w:r>
-      <w:r>
-        <w:rPr>
-          <w:rStyle w:val="NormalTok"/>
-        </w:rPr>
-        <w:t xml:space="preserve"> </w:t>
-      </w:r>
-      <w:r>
-        <w:rPr>
-          <w:rStyle w:val="DataTypeTok"/>
-        </w:rPr>
-        <w:t xml:space="preserve">U1</w:t>
-      </w:r>
-      <w:r>
-        <w:rPr>
-          <w:rStyle w:val="NormalTok"/>
-        </w:rPr>
-        <w:t xml:space="preserve">[</w:t>
-      </w:r>
-      <w:r>
-        <w:rPr>
-          <w:rStyle w:val="VerbatimStringTok"/>
-        </w:rPr>
-        <w:t xml:space="preserve">Retry 1, 5, 15 phút</w:t>
-      </w:r>
-      <w:r>
-        <w:rPr>
-          <w:rStyle w:val="NormalTok"/>
-        </w:rPr>
-        <w:t xml:space="preserve">]</w:t>
-      </w:r>
-      <w:r>
-        <w:br/>
-      </w:r>
-      <w:r>
-        <w:rPr>
-          <w:rStyle w:val="NormalTok"/>
-        </w:rPr>
-        <w:t xml:space="preserve">  </w:t>
-      </w:r>
-      <w:r>
-        <w:rPr>
-          <w:rStyle w:val="DataTypeTok"/>
-        </w:rPr>
-        <w:t xml:space="preserve">U1</w:t>
-      </w:r>
-      <w:r>
-        <w:rPr>
-          <w:rStyle w:val="NormalTok"/>
-        </w:rPr>
-        <w:t xml:space="preserve"> </w:t>
-      </w:r>
-      <w:r>
-        <w:rPr>
-          <w:rStyle w:val="PreprocessorTok"/>
-        </w:rPr>
-        <w:t xml:space="preserve">--&gt;</w:t>
-      </w:r>
-      <w:r>
-        <w:rPr>
-          <w:rStyle w:val="NormalTok"/>
-        </w:rPr>
-        <w:t xml:space="preserve"> </w:t>
-      </w:r>
-      <w:r>
-        <w:rPr>
-          <w:rStyle w:val="DataTypeTok"/>
-        </w:rPr>
-        <w:t xml:space="preserve">U2</w:t>
-      </w:r>
-      <w:r>
-        <w:rPr>
-          <w:rStyle w:val="NormalTok"/>
-        </w:rPr>
-        <w:t xml:space="preserve">{</w:t>
-      </w:r>
-      <w:r>
-        <w:rPr>
-          <w:rStyle w:val="VerbatimStringTok"/>
-        </w:rPr>
-        <w:t xml:space="preserve">Vẫn lỗi?</w:t>
-      </w:r>
-      <w:r>
-        <w:rPr>
-          <w:rStyle w:val="NormalTok"/>
-        </w:rPr>
-        <w:t xml:space="preserve">}</w:t>
-      </w:r>
-      <w:r>
-        <w:br/>
-      </w:r>
-      <w:r>
-        <w:rPr>
-          <w:rStyle w:val="NormalTok"/>
-        </w:rPr>
-        <w:t xml:space="preserve">  </w:t>
-      </w:r>
-      <w:r>
-        <w:rPr>
-          <w:rStyle w:val="DataTypeTok"/>
-        </w:rPr>
-        <w:t xml:space="preserve">U2</w:t>
-      </w:r>
-      <w:r>
-        <w:rPr>
-          <w:rStyle w:val="NormalTok"/>
-        </w:rPr>
-        <w:t xml:space="preserve"> </w:t>
-      </w:r>
-      <w:r>
-        <w:rPr>
-          <w:rStyle w:val="PreprocessorTok"/>
-        </w:rPr>
-        <w:t xml:space="preserve">--</w:t>
-      </w:r>
-      <w:r>
-        <w:rPr>
-          <w:rStyle w:val="NormalTok"/>
-        </w:rPr>
-        <w:t xml:space="preserve"> </w:t>
-      </w:r>
-      <w:r>
-        <w:rPr>
-          <w:rStyle w:val="VerbatimStringTok"/>
-        </w:rPr>
-        <w:t xml:space="preserve">Có </w:t>
-      </w:r>
-      <w:r>
-        <w:rPr>
-          <w:rStyle w:val="PreprocessorTok"/>
-        </w:rPr>
-        <w:t xml:space="preserve">--&gt;</w:t>
-      </w:r>
-      <w:r>
-        <w:rPr>
-          <w:rStyle w:val="NormalTok"/>
-        </w:rPr>
-        <w:t xml:space="preserve"> </w:t>
-      </w:r>
-      <w:r>
-        <w:rPr>
-          <w:rStyle w:val="DataTypeTok"/>
-        </w:rPr>
-        <w:t xml:space="preserve">U3</w:t>
-      </w:r>
-      <w:r>
-        <w:rPr>
-          <w:rStyle w:val="NormalTok"/>
-        </w:rPr>
-        <w:t xml:space="preserve">[</w:t>
-      </w:r>
-      <w:r>
-        <w:rPr>
-          <w:rStyle w:val="VerbatimStringTok"/>
-        </w:rPr>
-        <w:t xml:space="preserve">Activity Trưởng CSKH</w:t>
-      </w:r>
-      <w:r>
-        <w:rPr>
-          <w:rStyle w:val="NormalTok"/>
-        </w:rPr>
-        <w:t xml:space="preserve">]</w:t>
+        <w:pStyle w:val="CaptionedFigure"/>
+      </w:pPr>
+      <w:r>
+        <w:drawing>
+          <wp:inline>
+            <wp:extent cx="5334000" cy="6130017"/>
+            <wp:effectExtent b="0" l="0" r="0" t="0"/>
+            <wp:docPr descr="Sơ đồ 3 — 7. User flow" title="" id="155" name="Picture"/>
+            <a:graphic>
+              <a:graphicData uri="http://schemas.openxmlformats.org/drawingml/2006/picture">
+                <pic:pic>
+                  <pic:nvPicPr>
+                    <pic:cNvPr descr="ui/diagrams/srs-03.png" id="156" name="Picture"/>
+                    <pic:cNvPicPr>
+                      <a:picLocks noChangeArrowheads="1" noChangeAspect="1"/>
+                    </pic:cNvPicPr>
+                  </pic:nvPicPr>
+                  <pic:blipFill>
+                    <a:blip r:embed="rId154"/>
+                    <a:stretch>
+                      <a:fillRect/>
+                    </a:stretch>
+                  </pic:blipFill>
+                  <pic:spPr bwMode="auto">
+                    <a:xfrm>
+                      <a:off x="0" y="0"/>
+                      <a:ext cx="5334000" cy="6130017"/>
+                    </a:xfrm>
+                    <a:prstGeom prst="rect">
+                      <a:avLst/>
+                    </a:prstGeom>
+                    <a:noFill/>
+                    <a:ln w="9525">
+                      <a:noFill/>
+                      <a:headEnd/>
+                      <a:tailEnd/>
+                    </a:ln>
+                  </pic:spPr>
+                </pic:pic>
+              </a:graphicData>
+            </a:graphic>
+          </wp:inline>
+        </w:drawing>
+      </w:r>
+    </w:p>
+    <w:p>
+      <w:pPr>
+        <w:pStyle w:val="ImageCaption"/>
+      </w:pPr>
+      <w:r>
+        <w:rPr>
+          <w:lang w:val="vi-VN"/>
+        </w:rPr>
+        <w:t xml:space="preserve">Sơ đồ 3 — 7. User flow</w:t>
       </w:r>
     </w:p>
     <w:p>
       <w:pPr>
         <w:pStyle w:val="Heading2"/>
       </w:pPr>
-      <w:bookmarkStart w:id="148" w:name="_b6b8f0941d578ee32bac1772c0b8f30aeda5af8"/>
+      <w:bookmarkStart w:id="157" w:name="_b6b8f0941d578ee32bac1772c0b8f30aeda5af8"/>
       <w:r>
         <w:rPr>
           <w:lang w:val="vi-VN"/>
         </w:rPr>
         <w:t xml:space="preserve">8. Ma trận truy vết</w:t>
       </w:r>
-      <w:bookmarkEnd w:id="148"/>
+      <w:bookmarkEnd w:id="157"/>
     </w:p>
     <w:tbl>
       <w:tblPr>
@@ -20334,27 +18129,27 @@
       <w:pPr>
         <w:pStyle w:val="Heading2"/>
       </w:pPr>
-      <w:bookmarkStart w:id="149" w:name="_8b820d749dd5b5283f30562165d177bf7595cdf"/>
+      <w:bookmarkStart w:id="158" w:name="_8b820d749dd5b5283f30562165d177bf7595cdf"/>
       <w:r>
         <w:rPr>
           <w:lang w:val="vi-VN"/>
         </w:rPr>
         <w:t xml:space="preserve">9. Assumptions &amp; Open Questions</w:t>
       </w:r>
-      <w:bookmarkEnd w:id="149"/>
+      <w:bookmarkEnd w:id="158"/>
     </w:p>
     <w:p>
       <w:pPr>
         <w:pStyle w:val="Heading3"/>
       </w:pPr>
-      <w:bookmarkStart w:id="150" w:name="_28335573547226c51b092f1746270201c753504"/>
+      <w:bookmarkStart w:id="159" w:name="_28335573547226c51b092f1746270201c753504"/>
       <w:r>
         <w:rPr>
           <w:lang w:val="vi-VN"/>
         </w:rPr>
         <w:t xml:space="preserve">9.1 Giả định</w:t>
       </w:r>
-      <w:bookmarkEnd w:id="150"/>
+      <w:bookmarkEnd w:id="159"/>
     </w:p>
     <w:tbl>
       <w:tblPr>
@@ -21116,14 +18911,14 @@
       <w:pPr>
         <w:pStyle w:val="Heading3"/>
       </w:pPr>
-      <w:bookmarkStart w:id="151" w:name="_e46325fea40e777b29798bd031232fd5930c204"/>
+      <w:bookmarkStart w:id="160" w:name="_e46325fea40e777b29798bd031232fd5930c204"/>
       <w:r>
         <w:rPr>
           <w:lang w:val="vi-VN"/>
         </w:rPr>
         <w:t xml:space="preserve">9.2 Câu hỏi mở</w:t>
       </w:r>
-      <w:bookmarkEnd w:id="151"/>
+      <w:bookmarkEnd w:id="160"/>
     </w:p>
     <w:tbl>
       <w:tblPr>
@@ -21750,27 +19545,27 @@
       <w:pPr>
         <w:pStyle w:val="Heading2"/>
       </w:pPr>
-      <w:bookmarkStart w:id="152" w:name="_ecc6b064826413be31bd75a3ed5ff5f10e57e88"/>
+      <w:bookmarkStart w:id="161" w:name="_ecc6b064826413be31bd75a3ed5ff5f10e57e88"/>
       <w:r>
         <w:rPr>
           <w:lang w:val="vi-VN"/>
         </w:rPr>
         <w:t xml:space="preserve">Phụ lục A. UI flows</w:t>
       </w:r>
-      <w:bookmarkEnd w:id="152"/>
+      <w:bookmarkEnd w:id="161"/>
     </w:p>
     <w:p>
       <w:pPr>
         <w:pStyle w:val="Heading3"/>
       </w:pPr>
-      <w:bookmarkStart w:id="153" w:name="_storefront"/>
+      <w:bookmarkStart w:id="162" w:name="_storefront"/>
       <w:r>
         <w:rPr>
           <w:lang w:val="vi-VN"/>
         </w:rPr>
         <w:t xml:space="preserve">1.1 Storefront</w:t>
       </w:r>
-      <w:bookmarkEnd w:id="153"/>
+      <w:bookmarkEnd w:id="162"/>
     </w:p>
     <w:p>
       <w:pPr>
@@ -21781,18 +19576,18 @@
           <wp:inline>
             <wp:extent cx="5334000" cy="1299482"/>
             <wp:effectExtent b="0" l="0" r="0" t="0"/>
-            <wp:docPr descr="1.1 Storefront" title="" id="155" name="Picture"/>
+            <wp:docPr descr="1.1 Storefront" title="" id="164" name="Picture"/>
             <a:graphic>
               <a:graphicData uri="http://schemas.openxmlformats.org/drawingml/2006/picture">
                 <pic:pic>
                   <pic:nvPicPr>
-                    <pic:cNvPr descr="ui/diagrams/flows-01.png" id="156" name="Picture"/>
+                    <pic:cNvPr descr="ui/diagrams/flows-01.png" id="165" name="Picture"/>
                     <pic:cNvPicPr>
                       <a:picLocks noChangeArrowheads="1" noChangeAspect="1"/>
                     </pic:cNvPicPr>
                   </pic:nvPicPr>
                   <pic:blipFill>
-                    <a:blip r:embed="rId154"/>
+                    <a:blip r:embed="rId163"/>
                     <a:stretch>
                       <a:fillRect/>
                     </a:stretch>
@@ -21834,14 +19629,14 @@
       <w:pPr>
         <w:pStyle w:val="Heading3"/>
       </w:pPr>
-      <w:bookmarkStart w:id="157" w:name="_backend"/>
+      <w:bookmarkStart w:id="166" w:name="_backend"/>
       <w:r>
         <w:rPr>
           <w:lang w:val="vi-VN"/>
         </w:rPr>
         <w:t xml:space="preserve">1.2 Backend</w:t>
       </w:r>
-      <w:bookmarkEnd w:id="157"/>
+      <w:bookmarkEnd w:id="166"/>
     </w:p>
     <w:p>
       <w:pPr>
@@ -21852,18 +19647,18 @@
           <wp:inline>
             <wp:extent cx="5334000" cy="1823357"/>
             <wp:effectExtent b="0" l="0" r="0" t="0"/>
-            <wp:docPr descr="1.2 Backend" title="" id="159" name="Picture"/>
+            <wp:docPr descr="1.2 Backend" title="" id="168" name="Picture"/>
             <a:graphic>
               <a:graphicData uri="http://schemas.openxmlformats.org/drawingml/2006/picture">
                 <pic:pic>
                   <pic:nvPicPr>
-                    <pic:cNvPr descr="ui/diagrams/flows-02.png" id="160" name="Picture"/>
+                    <pic:cNvPr descr="ui/diagrams/flows-02.png" id="169" name="Picture"/>
                     <pic:cNvPicPr>
                       <a:picLocks noChangeArrowheads="1" noChangeAspect="1"/>
                     </pic:cNvPicPr>
                   </pic:nvPicPr>
                   <pic:blipFill>
-                    <a:blip r:embed="rId158"/>
+                    <a:blip r:embed="rId167"/>
                     <a:stretch>
                       <a:fillRect/>
                     </a:stretch>
@@ -21905,14 +19700,14 @@
       <w:pPr>
         <w:pStyle w:val="Heading3"/>
       </w:pPr>
-      <w:bookmarkStart w:id="161" w:name="_c216533680e07db0df7d9810ae423f737fc66e1"/>
+      <w:bookmarkStart w:id="170" w:name="_c216533680e07db0df7d9810ae423f737fc66e1"/>
       <w:r>
         <w:rPr>
           <w:lang w:val="vi-VN"/>
         </w:rPr>
         <w:t xml:space="preserve">2.1 Khách tạo yêu cầu (FR-01, FR-02, FR-03, FR-04)</w:t>
       </w:r>
-      <w:bookmarkEnd w:id="161"/>
+      <w:bookmarkEnd w:id="170"/>
     </w:p>
     <w:p>
       <w:pPr>
@@ -21923,18 +19718,18 @@
           <wp:inline>
             <wp:extent cx="1652869" cy="7919999"/>
             <wp:effectExtent b="0" l="0" r="0" t="0"/>
-            <wp:docPr descr="2.1 Khách tạo yêu cầu (FR-01, FR-02, FR-03, FR-04)" title="" id="163" name="Picture"/>
+            <wp:docPr descr="2.1 Khách tạo yêu cầu (FR-01, FR-02, FR-03, FR-04)" title="" id="172" name="Picture"/>
             <a:graphic>
               <a:graphicData uri="http://schemas.openxmlformats.org/drawingml/2006/picture">
                 <pic:pic>
                   <pic:nvPicPr>
-                    <pic:cNvPr descr="ui/diagrams/flows-03.png" id="164" name="Picture"/>
+                    <pic:cNvPr descr="ui/diagrams/flows-03.png" id="173" name="Picture"/>
                     <pic:cNvPicPr>
                       <a:picLocks noChangeArrowheads="1" noChangeAspect="1"/>
                     </pic:cNvPicPr>
                   </pic:nvPicPr>
                   <pic:blipFill>
-                    <a:blip r:embed="rId162"/>
+                    <a:blip r:embed="rId171"/>
                     <a:stretch>
                       <a:fillRect/>
                     </a:stretch>
@@ -21976,14 +19771,14 @@
       <w:pPr>
         <w:pStyle w:val="Heading3"/>
       </w:pPr>
-      <w:bookmarkStart w:id="165" w:name="_c218856f5745cf0ece2eaef07e266b0e8f4493b"/>
+      <w:bookmarkStart w:id="174" w:name="_c218856f5745cf0ece2eaef07e266b0e8f4493b"/>
       <w:r>
         <w:rPr>
           <w:lang w:val="vi-VN"/>
         </w:rPr>
         <w:t xml:space="preserve">2.2 CSKH xử lý (FR-08, FR-09, FR-10, FR-12)</w:t>
       </w:r>
-      <w:bookmarkEnd w:id="165"/>
+      <w:bookmarkEnd w:id="174"/>
     </w:p>
     <w:p>
       <w:pPr>
@@ -21994,18 +19789,18 @@
           <wp:inline>
             <wp:extent cx="3081185" cy="7919999"/>
             <wp:effectExtent b="0" l="0" r="0" t="0"/>
-            <wp:docPr descr="2.2 CSKH xử lý (FR-08, FR-09, FR-10, FR-12)" title="" id="167" name="Picture"/>
+            <wp:docPr descr="2.2 CSKH xử lý (FR-08, FR-09, FR-10, FR-12)" title="" id="176" name="Picture"/>
             <a:graphic>
               <a:graphicData uri="http://schemas.openxmlformats.org/drawingml/2006/picture">
                 <pic:pic>
                   <pic:nvPicPr>
-                    <pic:cNvPr descr="ui/diagrams/flows-04.png" id="168" name="Picture"/>
+                    <pic:cNvPr descr="ui/diagrams/flows-04.png" id="177" name="Picture"/>
                     <pic:cNvPicPr>
                       <a:picLocks noChangeArrowheads="1" noChangeAspect="1"/>
                     </pic:cNvPicPr>
                   </pic:nvPicPr>
                   <pic:blipFill>
-                    <a:blip r:embed="rId166"/>
+                    <a:blip r:embed="rId175"/>
                     <a:stretch>
                       <a:fillRect/>
                     </a:stretch>
@@ -22047,14 +19842,14 @@
       <w:pPr>
         <w:pStyle w:val="Heading3"/>
       </w:pPr>
-      <w:bookmarkStart w:id="169" w:name="_4d5f44c58ebe4400064e2e04e2ec502d4baf361"/>
+      <w:bookmarkStart w:id="178" w:name="_4d5f44c58ebe4400064e2e04e2ec502d4baf361"/>
       <w:r>
         <w:rPr>
           <w:lang w:val="vi-VN"/>
         </w:rPr>
         <w:t xml:space="preserve">2.3 Kho nhận hàng (FR-13, FR-14, FR-15)</w:t>
       </w:r>
-      <w:bookmarkEnd w:id="169"/>
+      <w:bookmarkEnd w:id="178"/>
     </w:p>
     <w:p>
       <w:pPr>
@@ -22065,18 +19860,18 @@
           <wp:inline>
             <wp:extent cx="3825762" cy="7919999"/>
             <wp:effectExtent b="0" l="0" r="0" t="0"/>
-            <wp:docPr descr="2.3 Kho nhận hàng (FR-13, FR-14, FR-15)" title="" id="171" name="Picture"/>
+            <wp:docPr descr="2.3 Kho nhận hàng (FR-13, FR-14, FR-15)" title="" id="180" name="Picture"/>
             <a:graphic>
               <a:graphicData uri="http://schemas.openxmlformats.org/drawingml/2006/picture">
                 <pic:pic>
                   <pic:nvPicPr>
-                    <pic:cNvPr descr="ui/diagrams/flows-05.png" id="172" name="Picture"/>
+                    <pic:cNvPr descr="ui/diagrams/flows-05.png" id="181" name="Picture"/>
                     <pic:cNvPicPr>
                       <a:picLocks noChangeArrowheads="1" noChangeAspect="1"/>
                     </pic:cNvPicPr>
                   </pic:nvPicPr>
                   <pic:blipFill>
-                    <a:blip r:embed="rId170"/>
+                    <a:blip r:embed="rId179"/>
                     <a:stretch>
                       <a:fillRect/>
                     </a:stretch>

</xml_diff>